<commit_message>
Abstract: drop B2 timings and row counts; state scale via a random sample (~30,000 copies -> ~600 rows) and the test families. Input size: SubFam does not sample itself; sample drawn before the run; rare groups need ~N copies in the sample
Co-Authored-By: Claude Opus 5.5 <noreply@anthropic.com>
</commit_message>
<xml_diff>
--- a/docs/submission/SubFam_BMC_Bioinformatics_manuscript.docx
+++ b/docs/submission/SubFam_BMC_Bioinformatics_manuscript.docx
@@ -122,7 +122,7 @@
           <w:b w:val="0"/>
           <w:i w:val="0"/>
         </w:rPr>
-        <w:t xml:space="preserve"> SubFam orders the copies along a k-mer guide tree, cuts the order into chunks of N neighbouring copies, aligns each chunk, calls a plurality consensus for each aligned chunk and aligns the consensuses. The output is a compact alignment, ordered by similarity, with a table of the copies behind every row; it needs neither a reference nor an identity cutoff, and N, the number of copies per row, is its one substantive parameter. On 3,000 copies of the mouse B2 short interspersed element SubFam produced 60 rows in 19 s in which the lineages of the family appear as blocks, and on 30,000 copies, in 6 minutes, 600 rows with the same structure; 2,222 5′-truncated copies of human LINE-1 subfamilies L1PA2–L1PA8 gave 111 rows that follow the age classes at the resolution whole copies allow. An ablation shows that the result rests on the combination of the steps: chunks of unordered copies are as impure as a single family-wide consensus. Identity clustering of the same copies with VSEARCH or MeShClust2 either fragments the old families into singletons or merges across their groups; on the young family it reaches the same purity as SubFam while leaving a tenth of the copies unplaced.</w:t>
+        <w:t xml:space="preserve"> SubFam orders the copies along a k-mer guide tree, cuts the order into chunks of N neighbouring copies, aligns each chunk, calls a plurality consensus for each aligned chunk and aligns the consensuses. The output is a compact alignment, ordered by similarity, with a table of the copies behind every row; it needs neither a reference nor an identity cutoff, and N, the number of copies per row, is its one substantive parameter. A family of any size, up to millions of copies, is handled through a random sample: at the default N, about 30,000 copies give some 600 rows, about as many as a reader and an alignment viewer can take in at once, and independent samples give the same picture. In tests on mouse B2 and human Alu SINEs and on 5′-truncated human LINE-1 copies, the known lineages of each family appear as blocks of rows. An ablation shows that the result rests on the combination of the steps: chunks of unordered copies are as impure as a single family-wide consensus. Identity clustering of the same copies with VSEARCH or MeShClust2 either fragments the old families into singletons or merges across their groups; on the young family it reaches the same purity as SubFam while leaving a tenth of the copies unplaced.</w:t>
       </w:r>
     </w:p>
     <w:p>
@@ -377,7 +377,22 @@
           <w:b w:val="0"/>
           <w:i w:val="0"/>
         </w:rPr>
-        <w:t xml:space="preserve"> The examples use 3,000 and 30,000 copies for a reason: at N = 50 they give 60 and 600 rows, and 600 rows is about the most an alignment viewer and a reader can take in at once. A larger input brings no further view: copies from many diverged groups distort one alignment, and copies that form close groups compress to the same few hundred consensuses, so a bigger sample is better handled as a larger N, a random subsample, or the cascade of the Discussion.</w:t>
+        <w:t xml:space="preserve"> The examples use 3,000 and 30,000 copies for a reason: at N = 50 they give 60 and 600 rows, and 600 rows is about the most an alignment viewer and a reader can take in at once. A larger input brings no further view: copies from many diverged groups distort one alignment, and copies that form close groups compress to the same few hundred consensuses, so a bigger sample is better handled as a larger N, a random subsample, or the cascade of the Discussion. SubFam does not sample by itself: the sample is drawn before the run with any sampling tool (for example </w:t>
+      </w:r>
+      <w:r>
+        <w:rPr>
+          <w:rFonts w:ascii="Courier New" w:hAnsi="Courier New"/>
+          <w:b w:val="0"/>
+          <w:i w:val="0"/>
+        </w:rPr>
+        <w:t>seqkit sample</w:t>
+      </w:r>
+      <w:r>
+        <w:rPr>
+          <w:b w:val="0"/>
+          <w:i w:val="0"/>
+        </w:rPr>
+        <w:t>; the 30,000-copy samples of Example 4 were drawn at random with seed 1), and its size, not that of the whole family, sets time and memory. A group needs about N copies in the sample to obtain a row of its own, so rare groups are recovered less often (Example 4).</w:t>
       </w:r>
     </w:p>
     <w:p>

</xml_diff>

<commit_message>
Manuscript v9: SubFam presented as the utility it is
Evaluated only on what it claims: what it does, correctness (EMBOSS equivalence,
determinism, input checks), cost (time, memory, sampling, -P), and what its output
looks like on real data (published consensuses among the rows, lineages as blocks).
Removed: Table 2 and the identity-clustering comparison, purity as a score, the
simulation section, the classification comparison (old Additional files 2 and 8).
Table 1 keeps only the label-free statistic. -P cost stated label-free.
References renumbered (MeShClust2 dropped, MAGUS 23); Additional files 1-7.

Co-Authored-By: Claude Opus 5.5 <noreply@anthropic.com>
</commit_message>
<xml_diff>
--- a/docs/submission/SubFam_BMC_Bioinformatics_manuscript.docx
+++ b/docs/submission/SubFam_BMC_Bioinformatics_manuscript.docx
@@ -106,7 +106,7 @@
           <w:b w:val="0"/>
           <w:i w:val="0"/>
         </w:rPr>
-        <w:t xml:space="preserve"> A transposable-element family, a satellite array or a multigene family can hold thousands to millions of related copies at every degree of divergence. Such a collection is too large to read and to give to the tools that follow (aligners, tree builders, library curation). Clustering at a fixed identity suits one age of family at a time: a cutoff that separates the groups of a young family fragments an old family into singletons, and a cutoff that holds an old family together merges the groups of a young one.</w:t>
+        <w:t xml:space="preserve"> A transposable-element family, a satellite array or a multigene family can hold thousands to millions of related copies at every degree of divergence. Such a collection is too large to read in an alignment viewer and too large for many of the tools that follow, such as aligners, tree builders and library curation. Researchers who study repeat families need a compact view of the copies that keeps their variation and leads back to every copy.</w:t>
       </w:r>
     </w:p>
     <w:p>
@@ -122,7 +122,7 @@
           <w:b w:val="0"/>
           <w:i w:val="0"/>
         </w:rPr>
-        <w:t xml:space="preserve"> SubFam orders the copies along a k-mer guide tree, cuts the order into chunks of N neighbouring copies, aligns each chunk, calls a plurality consensus for each aligned chunk and aligns the consensuses. The output is a compact alignment, ordered by similarity, with a table of the copies behind every row; it needs neither a reference nor an identity cutoff, and N, the number of copies per row, is its one substantive parameter. A family of any size, up to millions of copies, is handled through a random sample: at the default N, about 30,000 copies give some 600 rows, about as many as a reader and an alignment viewer can take in at once, and independent samples give the same picture. In tests on mouse B2 and human Alu SINEs and on 5′-truncated human LINE-1 copies, the known lineages of each family appear as blocks of rows. An ablation shows that the result rests on the combination of the steps: chunks of unordered copies are as impure as a single family-wide consensus. Identity clustering of the same copies with VSEARCH or MeShClust2 either fragments the old families into singletons or merges across their groups; on the young family it reaches the same purity as SubFam while leaving a tenth of the copies unplaced.</w:t>
+        <w:t xml:space="preserve"> SubFam is a command-line utility that produces this view. It orders the copies along a k-mer guide tree, cuts the order into chunks of N neighbouring copies, aligns each chunk, calls a plurality consensus for each chunk and aligns the consensuses. The output is an alignment of chunk consensuses ordered by similarity, with a table of the copies behind every row. It needs neither a reference nor an identity cutoff, and its main parameter is N, the number of copies per row. A family of up to millions of copies can be run on a random sample: at the default N, about 30,000 copies give some 600 rows, which a reader can still take in at once. On mouse B2 and human Alu SINEs the published consensuses of the family appear among the rows and on B2 the lineages of the family form blocks of rows; on 5′-truncated human LINE-1 copies the rows extend as far as their copies do. Without the ordering, chunks mix dissimilar copies. Every row traces back to its member copies, which SubFam can write out for further work. The consensus writer reproduces EMBOSS cons byte for byte, and the output does not depend on the number of threads.</w:t>
       </w:r>
     </w:p>
     <w:p>
@@ -138,7 +138,7 @@
           <w:b w:val="0"/>
           <w:i w:val="0"/>
         </w:rPr>
-        <w:t xml:space="preserve"> SubFam turns a pile of raw copies into an ordered, inspectable alignment that a person can read and a downstream tool can take. Defining subfamilies and placing orphan and truncated copies are left to the steps that follow.</w:t>
+        <w:t xml:space="preserve"> SubFam turns a pile of raw copies into an ordered alignment that a person can read and a downstream tool can take. It prepares the input for subfamily analysis and leaves the definition of subfamilies to the researcher.</w:t>
       </w:r>
     </w:p>
     <w:p>
@@ -176,7 +176,7 @@
           <w:b w:val="0"/>
           <w:i w:val="0"/>
         </w:rPr>
-        <w:t>Interspersed repeats (short and long interspersed elements, SINEs and LINEs), satellite arrays and multigene families contain thousands to millions of related copies, and the copies of one family span every degree of divergence, from near-identical recent insertions to relics at 30 % distance from their consensus. Such a collection is too large to inspect and too heterogeneous to group with one identity cutoff. Identity-based clustering (CD-HIT [1], VSEARCH [2], MMseqs2 [3, 4], MeShClust [5]) returns either a real copy, which carries its own private mutations, or a cluster consensus whose content depends on where the cutoff fell, and leaves every copy below the cutoff on its own. Methods that define subfamilies statistically, from the genome-wide Alu analysis of Price et al. [6] to COSEG [7], require every copy aligned to one reference over a shared window and set truncated copies aside. Library-curation tools such as TEtrimmer [8] start from a genome and refine one family consensus at a time. Annotation assigns each copy its best-scoring library consensus, a label without a stated uncertainty.</w:t>
+        <w:t>Interspersed repeats (short and long interspersed elements, SINEs and LINEs), satellite arrays and multigene families contain thousands to millions of related copies, and the copies of one family span every degree of divergence, from near-identical recent insertions to relics at 30 % distance from their consensus. An alignment of all copies cannot be read, and many tools cannot take it. Existing tools answer neighbouring questions: identity clustering (CD-HIT [1], VSEARCH [2], MMseqs2 [3, 4], MeShClust [5]) groups copies above an identity cutoff, which is tuned to one level of divergence; statistical subfamily methods, from the genome-wide Alu analysis of Price et al. [6] to COSEG [7], define subfamilies on copies aligned to one reference over a shared window; library-curation tools such as TEtrimmer [8] refine one family consensus at a time from a genome.</w:t>
       </w:r>
     </w:p>
     <w:p>
@@ -185,7 +185,7 @@
           <w:b w:val="0"/>
           <w:i w:val="0"/>
         </w:rPr>
-        <w:t>Between the gold standard of manual curation and a researcher's computational analysis lies a practical gap: the heap of raw copies that neither a person nor a pipeline can take as it is. SubFam fills that gap, and only that gap. Its two objectives are (1) a visually observable presentation of a variety of similar sequences, at various degrees of intra- and inter-group variability, as similarity subgroups, and (2) an alignment proxy: a compact, ordered alignment of chunk consensuses that stands for thousands of repetitive sequences in the tools that cannot take them all. SubFam works without an identity cutoff and without a reference. A row is the consensus of a chunk of neighbouring copies; whether a row, or a block of rows, is a subfamily is a judgement for the researcher or for a dedicated method, and orphan and truncated copies are placed by the steps that follow.</w:t>
+        <w:t>Between the raw copies and these analyses lies a practical step: making the heap of copies visible and small enough to work with. SubFam does that step and nothing else. Its two objectives are (1) a visual presentation of many similar sequences, at various degrees of variation within and between groups, as an ordered series of consensuses, and (2) an alignment proxy: a compact, ordered alignment of chunk consensuses that stands for thousands of copies in tools that cannot take them all. A row is the consensus of a chunk of neighbouring copies; whether a row, or a block of rows, is a subfamily is a judgement for the researcher or for a dedicated method.</w:t>
       </w:r>
     </w:p>
     <w:p>
@@ -243,7 +243,7 @@
           <w:b w:val="0"/>
           <w:i w:val="0"/>
         </w:rPr>
-        <w:t xml:space="preserve">, compiled on each run; an embedded Python version with byte-identical output is the fallback where no compiler exists). At each merge the two subtrees are flipped so that their closest ends meet; the leaf order of this tree is a sequence in which neighbours are similar across subtree boundaries, which is what makes fixed windows along it meaningful. This step aligns nothing. The distance matrix agrees with a brute-force computation and the output is byte-identical across thread counts. (2) </w:t>
+        <w:t xml:space="preserve">, compiled on each run; an embedded Python version with byte-identical output is the fallback where no compiler exists). At each merge the two subtrees are turned so that their closest ends meet (of the four pairs of end sequences, the pair at the smallest distance is placed side by side); the leaf order of this tree is a sequence in which neighbours are similar across subtree boundaries, which is what makes fixed windows along it meaningful. This step aligns nothing. (2) </w:t>
       </w:r>
       <w:r>
         <w:rPr>
@@ -257,7 +257,7 @@
           <w:b w:val="0"/>
           <w:i w:val="0"/>
         </w:rPr>
-        <w:t xml:space="preserve"> The order is cut into round(n / N) consecutive blocks of near-equal size (default N = 50); every sequence belongs to exactly one chunk. (3) </w:t>
+        <w:t xml:space="preserve"> The order is cut into round(n / N) consecutive blocks (at least one) of near-equal size (default N = 50); every sequence belongs to exactly one chunk. (3) </w:t>
       </w:r>
       <w:r>
         <w:rPr>
@@ -271,7 +271,7 @@
           <w:b w:val="0"/>
           <w:i w:val="0"/>
         </w:rPr>
-        <w:t xml:space="preserve"> Each chunk is aligned with MAFFT [9], chunks in parallel, and a plurality consensus is called for each aligned chunk with the scoring of EMBOSS cons [10] (EDNAFULL): the top-scoring residue of a column is written when its positive-scoring matches reach p × n (default p = 0.36); a base supported by half of the sequences or fewer is written in lower case, and the case is kept through the final alignment. With </w:t>
+        <w:t xml:space="preserve"> Each chunk is aligned with MAFFT [9], chunks in parallel, and a plurality consensus is called for each aligned chunk with the scoring of EMBOSS cons [10] (EDNAFULL): the top-scoring residue of a column is written when the sequences whose residue scores positively against it (ambiguity codes included, gaps never) number at least p × n (default p = 0.36); a base supported by half of the sequences or fewer is written in lower case, and the case is kept through the final alignment. With </w:t>
       </w:r>
       <w:r>
         <w:rPr>
@@ -286,7 +286,7 @@
           <w:b w:val="0"/>
           <w:i w:val="0"/>
         </w:rPr>
-        <w:t xml:space="preserve"> the threshold is p × the number of sequences that span the column (at least 3), so that the consensus of a chunk of truncated copies extends as far as its copies do. (4) </w:t>
+        <w:t xml:space="preserve"> the threshold is p × the number of sequences that span the column (at least 3), so that the consensus of a chunk of truncated copies extends as far as its copies do; the lower-case rule still counts all sequences of the chunk, so the parts that only a few copies reach are written in lower case. (4) </w:t>
       </w:r>
       <w:r>
         <w:rPr>
@@ -300,7 +300,38 @@
           <w:b w:val="0"/>
           <w:i w:val="0"/>
         </w:rPr>
-        <w:t xml:space="preserve"> The chunk consensuses are aligned with MAFFT L-INS-i: with full iterative refinement up to 300 consensuses, with two refinement rounds up to 1,000 (most of the gain at a tenth of the time), and in MAFFT's automatic mode beyond. Outputs: the consensuses, their alignment (FASTA and multiple sequence format, MSF), a table of copy, chunk and strand, and a label-free table of chunk statistics (size, consensus length, share of weakly supported bases, agreement of the members with the consensus, lowest member identity, gap share). Two options lead back to the original loci: </w:t>
+        <w:t xml:space="preserve"> The chunk consensuses are aligned with MAFFT: L-INS-i with full iterative refinement up to 300 consensuses, L-INS-i with two refinement rounds up to 1,000, and MAFFT's automatic mode beyond. The rows of the alignment are in MAFFT's guide-tree order (</w:t>
+      </w:r>
+      <w:r>
+        <w:rPr>
+          <w:rFonts w:ascii="Courier New" w:hAnsi="Courier New"/>
+          <w:b w:val="0"/>
+          <w:i w:val="0"/>
+        </w:rPr>
+        <w:t>--reorder</w:t>
+      </w:r>
+      <w:r>
+        <w:rPr>
+          <w:b w:val="0"/>
+          <w:i w:val="0"/>
+        </w:rPr>
+        <w:t>); the consensus file and the chunk table keep the k-mer order.</w:t>
+      </w:r>
+    </w:p>
+    <w:p>
+      <w:r>
+        <w:rPr>
+          <w:b/>
+          <w:i w:val="0"/>
+        </w:rPr>
+        <w:t>Outputs.</w:t>
+      </w:r>
+      <w:r>
+        <w:rPr>
+          <w:b w:val="0"/>
+          <w:i w:val="0"/>
+        </w:rPr>
+        <w:t xml:space="preserve"> The consensuses, their alignment (FASTA and multiple sequence format, MSF), a table of copy, chunk and strand, and a table of chunk statistics that uses no labels: size, consensus length, share of lower-case bases and, over the core columns where at least half of the chunk has a base, the agreement of the members with each column's most frequent base, their median and lowest identity to those bases, and the share of gappy columns. Two options lead back to the copies: </w:t>
       </w:r>
       <w:r>
         <w:rPr>
@@ -345,7 +376,22 @@
           <w:b w:val="0"/>
           <w:i w:val="0"/>
         </w:rPr>
-        <w:t xml:space="preserve"> (strand-independent k-mers; each copy is oriented like its neighbour in the order). Grouping of the rows (by diagnostic columns, by a tree cut, by annotation) is the next step and is left to it.</w:t>
+        <w:t xml:space="preserve"> (strand-independent k-mers; each copy is oriented like its neighbour in the order). </w:t>
+      </w:r>
+      <w:r>
+        <w:rPr>
+          <w:rFonts w:ascii="Courier New" w:hAnsi="Courier New"/>
+          <w:b w:val="0"/>
+          <w:i w:val="0"/>
+        </w:rPr>
+        <w:t>-m</w:t>
+      </w:r>
+      <w:r>
+        <w:rPr>
+          <w:b w:val="0"/>
+          <w:i w:val="0"/>
+        </w:rPr>
+        <w:t xml:space="preserve"> uses MAFFT's guide-tree order instead of the k-mer order.</w:t>
       </w:r>
     </w:p>
     <w:p>
@@ -354,14 +400,14 @@
           <w:b/>
           <w:i w:val="0"/>
         </w:rPr>
-        <w:t>Parameter.</w:t>
+        <w:t>Parameters.</w:t>
       </w:r>
       <w:r>
         <w:rPr>
           <w:b w:val="0"/>
           <w:i w:val="0"/>
         </w:rPr>
-        <w:t xml:space="preserve"> N is the resolution in copies: a group needs roughly N copies to obtain a row of its own. The default of 50 is the smallest chunk that still keeps the properties of a sequence group and gives a plurality consensus with statistical weight: at p = 0.36 a base needs 18 agreeing copies, enough for the private mutations of single copies to cancel out, whereas chunks of 20 call a consensus on 8 copies and follow the noise of diverged or damaged copies. In the simulations the rows of N = 50 represent their copies more closely than those of N = 20 (a copy's own row is its best-matching row for 98.1 against 95.0 % of copies in the young family and 57.5 against 48.9 % in the old one), while N = 20 recovers rare subfamilies of 40–60 copies that N = 50 merges, and N = 100 dilutes the rare groups further. N = 20 is the setting for small or rare groups, N = 50 the default for a family. On the B2 example the purity of the chunks against annotation labels moves by 0.05 over N = 20–100, by at most 0.04 over k = 4–10, by 0.02 between random samples of the copies, and stays the same for p = 0.25–0.5, since p shapes the consensus and leaves the chunk membership unchanged.</w:t>
+        <w:t xml:space="preserve"> N is the resolution in copies: a group needs roughly N copies to obtain a row of its own, and an abundant group fills several rows. At the default N = 50 and p = 0.36 a consensus base needs at least 18 agreeing copies; N = 20 (8 copies) is the setting for small or rare groups. p shapes the consensus and does not change which copies share a chunk; k sets the word length of the ordering.</w:t>
       </w:r>
     </w:p>
     <w:p>
@@ -377,7 +423,7 @@
           <w:b w:val="0"/>
           <w:i w:val="0"/>
         </w:rPr>
-        <w:t xml:space="preserve"> The examples use 3,000 and 30,000 copies for a reason: at N = 50 they give 60 and 600 rows, and 600 rows is about the most an alignment viewer and a reader can take in at once. A larger input brings no further view: copies from many diverged groups distort one alignment, and copies that form close groups compress to the same few hundred consensuses, so a bigger sample is better handled as a larger N, a random subsample, or the cascade of the Discussion. SubFam does not sample by itself: the sample is drawn before the run with any sampling tool (for example </w:t>
+        <w:t xml:space="preserve"> At N = 50, 3,000 copies give 60 rows and 30,000 copies give 600; in the author's experience about 600 rows is the practical limit for reading an alignment in a viewer. A larger family is run on a random sample, with a larger N, or in rounds (Discussion). SubFam does not sample by itself: the sample is drawn before the run with any sampling tool (for example </w:t>
       </w:r>
       <w:r>
         <w:rPr>
@@ -392,7 +438,7 @@
           <w:b w:val="0"/>
           <w:i w:val="0"/>
         </w:rPr>
-        <w:t>; the 30,000-copy samples of Example 4 were drawn at random with seed 1), and its size, not that of the whole family, sets time and memory. A group needs about N copies in the sample to obtain a row of its own, so rare groups are recovered less often (Example 4).</w:t>
+        <w:t>), and its size, not that of the whole family, sets time and memory. A group needs about N copies in the sample to obtain a row of its own.</w:t>
       </w:r>
     </w:p>
     <w:p>
@@ -408,7 +454,7 @@
           <w:b w:val="0"/>
           <w:i w:val="0"/>
         </w:rPr>
-        <w:t xml:space="preserve"> The k-mer ordering holds a dense n × n float32 matrix, about 4·n² bytes (0.8 GB at 10,000 copies, 2.2 GB at 20,000, 3.6 GB at 30,000); SubFam compares this with the free memory of the machine and stops with a message when it does not fit. PartTree ordering [11] (</w:t>
+        <w:t xml:space="preserve"> The k-mer ordering holds a dense n × n float32 matrix of 4·n² bytes (0.4, 1.6 and 3.6 GB at 10,000, 20,000 and 30,000 copies; the measured peak memory of whole runs was 0.8, 2.2 and 4.1–4.3 GB). On Linux SubFam compares the matrix size with the free memory and stops with a message when it does not fit; where free memory cannot be read it warns above 20,000 sequences. PartTree ordering [11] (</w:t>
       </w:r>
       <w:r>
         <w:rPr>
@@ -423,7 +469,7 @@
           <w:b w:val="0"/>
           <w:i w:val="0"/>
         </w:rPr>
-        <w:t xml:space="preserve">) replaces the matrix and needs far less memory, at a cost in chunk purity: 10,000 and 20,000 simulated copies took 65 and 173 s at 104 and 194 MB, against 75 and 247 s at 839 and 2,216 MB for the k-mer path, with all eight simulated sources recovered either way and chunk purity 0.89–0.90 against 0.92–0.95; on 30,000 real Alu copies the purity fell from 0.472 to 0.400 (Example 4). </w:t>
+        <w:t xml:space="preserve">) replaces the matrix: 10,000 and 20,000 simulated copies took 65 and 173 s at 104 and 194 MB, against 75 and 247 s at 839 and 2,216 MB with the k-mer order. Its chunks hold less similar copies (mean lowest member identity 0.68 against 0.71 on 30,000 B2 copies, 0.81 against 0.84 on 30,000 Alu copies), so </w:t>
       </w:r>
       <w:r>
         <w:rPr>
@@ -438,7 +484,7 @@
           <w:b w:val="0"/>
           <w:i w:val="0"/>
         </w:rPr>
-        <w:t xml:space="preserve"> is therefore meant only for inputs whose matrix does not fit in memory.</w:t>
+        <w:t xml:space="preserve"> is meant for inputs whose matrix does not fit in memory.</w:t>
       </w:r>
     </w:p>
     <w:p>
@@ -447,14 +493,44 @@
           <w:b/>
           <w:i w:val="0"/>
         </w:rPr>
-        <w:t>Equivalence and tests.</w:t>
+        <w:t>Correctness and tests.</w:t>
       </w:r>
       <w:r>
         <w:rPr>
           <w:b w:val="0"/>
           <w:i w:val="0"/>
         </w:rPr>
-        <w:t xml:space="preserve"> The consensus and MSF writers reproduce EMBOSS cons and seqret byte for byte. The consensus and chunk-statistics code agrees with independent reimplementations on 8,000 random alignments under two awk implementations, and the chunk splitter places every sequence in exactly one chunk for every input size from 1 to 30 and N from 2 to 10 (code review of 2026-10-11). The C and Python orderings give byte-identical orders on 292 synthetic cases; 26 robustness cases (awkward but legal inputs, determinism across runs and thread counts) either keep every input record or stop with a message; malformed input (duplicate or reserved ids, empty records, protein) is refused.</w:t>
+        <w:t xml:space="preserve"> The consensus and MSF writers reproduce EMBOSS cons and seqret byte for byte (</w:t>
+      </w:r>
+      <w:r>
+        <w:rPr>
+          <w:rFonts w:ascii="Courier New" w:hAnsi="Courier New"/>
+          <w:b w:val="0"/>
+          <w:i w:val="0"/>
+        </w:rPr>
+        <w:t>tests/check_equivalence.sh</w:t>
+      </w:r>
+      <w:r>
+        <w:rPr>
+          <w:b w:val="0"/>
+          <w:i w:val="0"/>
+        </w:rPr>
+        <w:t xml:space="preserve">: 3,600 consensus runs and 80 MSF files, no difference). The distance matrix agrees with a brute-force computation, and the C and Python orderings give byte-identical orders on 292 synthetic cases. Output is byte-identical across runs and thread counts; 26 robustness cases (awkward or malformed inputs, determinism) either keep every input record or stop with a message, and </w:t>
+      </w:r>
+      <w:r>
+        <w:rPr>
+          <w:rFonts w:ascii="Courier New" w:hAnsi="Courier New"/>
+          <w:b w:val="0"/>
+          <w:i w:val="0"/>
+        </w:rPr>
+        <w:t>tests/check_inputs.sh</w:t>
+      </w:r>
+      <w:r>
+        <w:rPr>
+          <w:b w:val="0"/>
+          <w:i w:val="0"/>
+        </w:rPr>
+        <w:t xml:space="preserve"> confirms that malformed input (duplicate or reserved ids, empty records, protein) is refused.</w:t>
       </w:r>
     </w:p>
     <w:p>
@@ -470,21 +546,22 @@
           <w:b w:val="0"/>
           <w:i w:val="0"/>
         </w:rPr>
-        <w:t xml:space="preserve"> Every example alignment (Additional file 1) is one MAFFT alignment of three kinds of row: </w:t>
+        <w:t xml:space="preserve"> SubFam uses no labels. To make the example alignments (Additional file 1) readable, the SubFam rows are named </w:t>
       </w:r>
       <w:r>
         <w:rPr>
+          <w:rFonts w:ascii="Courier New" w:hAnsi="Courier New"/>
           <w:b w:val="0"/>
-          <w:i/>
+          <w:i w:val="0"/>
         </w:rPr>
-        <w:t>class consensuses</w:t>
+        <w:t>&lt;chunk&gt;|&lt;class&gt;|p&lt;share&gt;</w:t>
       </w:r>
       <w:r>
         <w:rPr>
           <w:b w:val="0"/>
           <w:i w:val="0"/>
         </w:rPr>
-        <w:t xml:space="preserve"> (</w:t>
+        <w:t xml:space="preserve"> after the most common annotation class of the chunk's copies and its share among them, and are grouped by that class. Each group is headed by the consensus of all copies of the class (</w:t>
       </w:r>
       <w:r>
         <w:rPr>
@@ -499,36 +576,7 @@
           <w:b w:val="0"/>
           <w:i w:val="0"/>
         </w:rPr>
-        <w:t xml:space="preserve">: the plurality consensus of the real member copies of a labelled class, the best any method could reach given the labels, and distinct from the truth), </w:t>
-      </w:r>
-      <w:r>
-        <w:rPr>
-          <w:b w:val="0"/>
-          <w:i/>
-        </w:rPr>
-        <w:t>published consensuses</w:t>
-      </w:r>
-      <w:r>
-        <w:rPr>
-          <w:b w:val="0"/>
-          <w:i w:val="0"/>
-        </w:rPr>
-        <w:t xml:space="preserve"> (Dfam [12], Price et al. [6]), and the SubFam rows, each named </w:t>
-      </w:r>
-      <w:r>
-        <w:rPr>
-          <w:rFonts w:ascii="Courier New" w:hAnsi="Courier New"/>
-          <w:b w:val="0"/>
-          <w:i w:val="0"/>
-        </w:rPr>
-        <w:t>&lt;chunk&gt;|&lt;class&gt;|p&lt;purity&gt;</w:t>
-      </w:r>
-      <w:r>
-        <w:rPr>
-          <w:b w:val="0"/>
-          <w:i w:val="0"/>
-        </w:rPr>
-        <w:t xml:space="preserve">, purity being the fraction of the chunk's copies in its majority class. Labels (RepeatMasker [13] classes, published subfamilies) serve to colour and to score; the method itself uses none of them. The identity of every SubFam row to the head of its group is in </w:t>
+        <w:t xml:space="preserve">) and by the published consensus (Dfam [12], Price et al. [6]) where one exists. The identity of every row to the head of its group is in </w:t>
       </w:r>
       <w:r>
         <w:rPr>
@@ -543,7 +591,7 @@
           <w:b w:val="0"/>
           <w:i w:val="0"/>
         </w:rPr>
-        <w:t>.</w:t>
+        <w:t>. The 30,000-copy B2 alignment holds the SubFam rows only, and the L1 class consensuses are built from at most 60 random members of each class.</w:t>
       </w:r>
     </w:p>
     <w:p>
@@ -601,7 +649,7 @@
           <w:b w:val="0"/>
           <w:i w:val="0"/>
         </w:rPr>
-        <w:t xml:space="preserve">Every RepeatMasker B2_Mm1a, B2_Mm1t, B2_Mm2, B3 and B3A copy on chr19 of mm39 [14] (≥ 170 bp, free of N, on the element strand) was taken: 5,972 copies; a random 3,000 (seed 1) were run with </w:t>
+        <w:t xml:space="preserve">Every RepeatMasker [13] B2_Mm1a, B2_Mm1t, B2_Mm2, B3 and B3A copy on chr19 of mm39 [14] (≥ 170 bp, free of N, on the element strand) was taken: 5,972 copies. A random 3,000 (seed 1) were run with </w:t>
       </w:r>
       <w:r>
         <w:rPr>
@@ -616,21 +664,7 @@
           <w:b w:val="0"/>
           <w:i w:val="0"/>
         </w:rPr>
-        <w:t xml:space="preserve">, giving 60 rows in 19 s. Grouped by RepeatMasker class, with each class's member consensus and the Dfam consensus as heads (Figure 1), the 60 rows have a median identity of 0.959 to the head of their own class (minimum 0.836), and 5 rows lie closer to another head. The k-mer order separates the B3 and B2 lineages into blocks of chunks (B3/B3A: chunks 1–21 and 46–60; B2: chunks 22–45). Inside the B2 block the three Repbase [15] names interleave, and B2_Mm1t, whose consensus differs from B2_Mm1a at 2 of 193 positions, has no rows of its own; the old B3A class (542 copies) shares its rows with B3. The alignment shows this structure; the question of whether the Repbase names or an indel-based classification of the family (Vassetzky et al. [16]) fit the copies better belongs to another paper; the two classifications are compared in Additional file 2 </w:t>
-      </w:r>
-      <w:r>
-        <w:rPr>
-          <w:b w:val="0"/>
-          <w:highlight w:val="yellow"/>
-        </w:rPr>
-        <w:t>[AUTHOR: state that you co-authored that classification]</w:t>
-      </w:r>
-      <w:r>
-        <w:rPr>
-          <w:b w:val="0"/>
-          <w:i w:val="0"/>
-        </w:rPr>
-        <w:t>.</w:t>
+        <w:t>, giving 60 rows in 19 s; the alignment of all 3,000 copies has 2,781 columns, the alignment of the 60 rows 223. Grouped by RepeatMasker class, with the class consensus and the Dfam consensus as heads (Figure 1), the rows have a median identity of 0.959 to the head of their own class (minimum 0.836). The order separates the two lineages of the family into blocks of rows: B3 and B3A in chunks 1–21 and 46–60, B2 in chunks 22–45. Inside the B2 block the three Repbase [15] names B2_Mm1a, B2_Mm1t and B2_Mm2 interleave; the alignment shows the copies as they are and leaves the naming of their groups to the researcher.</w:t>
       </w:r>
     </w:p>
     <w:p>
@@ -646,7 +680,7 @@
           <w:b w:val="0"/>
           <w:i w:val="0"/>
         </w:rPr>
-        <w:t xml:space="preserve"> To make the method visible, 390 of the copies (a stratified random sample over four groups of the family, seed 1, shuffled) were aligned together with the 20 chunk consensuses SubFam built from them (</w:t>
+        <w:t xml:space="preserve"> To make the method visible, 390 of the copies (a stratified random sample over four groups of the family as classified by Vassetzky et al. [16], seed 1, shuffled) were aligned together with the 20 chunk consensuses SubFam built from them (</w:t>
       </w:r>
       <w:r>
         <w:rPr>
@@ -670,14 +704,14 @@
           <w:b w:val="0"/>
           <w:i/>
         </w:rPr>
-        <w:t>Limit.</w:t>
+        <w:t>Old copies.</w:t>
       </w:r>
       <w:r>
         <w:rPr>
           <w:b w:val="0"/>
           <w:i w:val="0"/>
         </w:rPr>
-        <w:t xml:space="preserve"> The oldest copies of the family, about 70 % identical to their own consensus, mix across chunks at N = 50, and the alignment shows that mixing as it is. At 25–30 % divergence between copies this is the limit of every copy-level method.</w:t>
+        <w:t xml:space="preserve"> The oldest copies of the family, about 30 % diverged from their own consensus, mix across chunks at N = 50, and the alignment shows that mixing as it is.</w:t>
       </w:r>
     </w:p>
     <w:p>
@@ -690,7 +724,7 @@
           <w:i/>
           <w:sz w:val="24"/>
         </w:rPr>
-        <w:t>Example 2: 5′-truncated LINE-1 (L1) copies (Additional file 3)</w:t>
+        <w:t>Example 2: 5′-truncated LINE-1 (L1) copies (Additional file 2)</w:t>
       </w:r>
     </w:p>
     <w:p>
@@ -729,21 +763,21 @@
           <w:b w:val="0"/>
           <w:i w:val="0"/>
         </w:rPr>
-        <w:t xml:space="preserve">); against the head of their RepeatMasker class they have a median identity of 0.993 (minimum 0.955), and 17 of 111 rows lie closer to a neighbouring class's head. The L1PA classes are consecutive age classes of one lineage [17, 18] whose consensuses differ at 8–31 of about 900 positions; the chunks follow them at the resolution of neighbouring classes (PA2 + PA3, PA4–PA6, PA7 + PA8). </w:t>
+        <w:t xml:space="preserve">); they have a median identity of 0.993 to the head of their RepeatMasker class (minimum 0.955). The L1PA classes are consecutive age classes of one lineage [17, 18] whose consensuses differ at 8–31 of about 900 positions, and the chunks hold copies of neighbouring classes together. </w:t>
       </w:r>
       <w:r>
         <w:rPr>
           <w:b w:val="0"/>
           <w:i/>
         </w:rPr>
-        <w:t>Limit.</w:t>
+        <w:t>Copy length.</w:t>
       </w:r>
       <w:r>
         <w:rPr>
           <w:b w:val="0"/>
           <w:i w:val="0"/>
         </w:rPr>
-        <w:t xml:space="preserve"> The whole-copy k-mer distance responds to copy length as well as to sequence: chunks are nearly length-homogeneous (within-chunk length coefficient of variation, CV, 0.05, against 0.59 for random chunks), so one class spreads over several rows by length, and the tree built from the 3′ region that every copy shares differs from the whole-copy tree (Additional file 4). For 5′-truncated families the recommended use is to run SubFam on the region the copies share, or on the long copies, and to place the fragments afterwards.</w:t>
+        <w:t xml:space="preserve"> The whole-copy k-mer distance responds to copy length as well as to sequence: chunks are nearly length-homogeneous (within-chunk length coefficient of variation, CV, 0.05, against 0.59 for random chunks), so one class spreads over several rows by length, and the tree built from the 3′ region that every copy shares differs from the whole-copy tree (Additional file 3). For 5′-truncated families the recommended use is to run SubFam on the region the copies share, or on the long copies, and to place the fragments afterwards.</w:t>
       </w:r>
     </w:p>
     <w:p>
@@ -756,7 +790,7 @@
           <w:i/>
           <w:sz w:val="24"/>
         </w:rPr>
-        <w:t>Example 3: young Alu loci (Additional file 5)</w:t>
+        <w:t>Example 3: young Alu loci (Additional file 4)</w:t>
       </w:r>
     </w:p>
     <w:p>
@@ -780,7 +814,7 @@
           <w:b w:val="0"/>
           <w:i w:val="0"/>
         </w:rPr>
-        <w:t>, give 16 rows; the Price et al. [6] consensuses for AluY, AluYa5 and AluYb8 head their groups, with a median identity of rows to head of 1.000 (minimum 0.996). Seven of the 16 rows are distinct sequences: in a young family several chunks of one group yield the same consensus, which is the price of fixed chunks (Discussion). The references are the consensuses that labelled these copies, so this example illustrates the output rather than validating it. A genome-wide Alu run, on 30,000 copies of hg38 chr1, is part of Example 4.</w:t>
+        <w:t>, give 16 rows. The Price et al. [6] consensuses for AluY, AluYa5 and AluYb8 head their groups, with a median identity of rows to head of 1.000 (minimum 0.996). Seven of the 16 rows are distinct sequences: in a young family several chunks of one group yield the same consensus, which is the price of fixed chunks (Limitations).</w:t>
       </w:r>
     </w:p>
     <w:p>
@@ -793,7 +827,7 @@
           <w:i/>
           <w:sz w:val="24"/>
         </w:rPr>
-        <w:t>Example 4: the same family at 30,000 copies (stress case)</w:t>
+        <w:t>Example 4: 30,000 copies</w:t>
       </w:r>
     </w:p>
     <w:p>
@@ -802,7 +836,7 @@
           <w:b w:val="0"/>
           <w:i w:val="0"/>
         </w:rPr>
-        <w:t xml:space="preserve">Full-length B2 copies of mm39 chromosomes 1–3 (41,989; the rule of Example 1), a random 30,000 (seed 1), </w:t>
+        <w:t xml:space="preserve">B2-family copies of at least 170 bp on mm39 chromosomes 1–3 (41,989; the rule of Example 1), a random 30,000 (seed 1), </w:t>
       </w:r>
       <w:r>
         <w:rPr>
@@ -817,7 +851,7 @@
           <w:b w:val="0"/>
           <w:i w:val="0"/>
         </w:rPr>
-        <w:t xml:space="preserve">: 600 rows, 588 of them distinct, in 6.3 min at 4.1 GB with the k-mer order (13 min with the processor shared) and in 7 min at 0.7 GB with </w:t>
+        <w:t xml:space="preserve">: 600 rows, 588 of them distinct, in 13 min at 4.1 GB with the k-mer order on a shared processor (6.3 min on an idle one for two further random samples of the same copies) and in 7 min at 0.7 GB with </w:t>
       </w:r>
       <w:r>
         <w:rPr>
@@ -832,7 +866,7 @@
           <w:b w:val="0"/>
           <w:i w:val="0"/>
         </w:rPr>
-        <w:t xml:space="preserve"> (Additional file 6). Chunk purity against the RepeatMasker class is 0.805 (0.756 with </w:t>
+        <w:t xml:space="preserve"> on the shared processor (Additional file 5). The five Dfam consensuses are among the rows at identity 1.000 (B2_Mm1a), 0.995 (B2_Mm2), 0.984 (B2_Mm1t), 0.943 (B3; 0.952 and 0.954 in the two further samples) and 0.889 (B3A), the last two being the old classes. In chunk order the 600 rows form one block of B2 chunks (the 11-bp deletion of the B2 lineage visible as a shared gap) flanked by B3/B3A chunks on both sides, the structure of the 60-row run in ten times as many rows (Additional file 6). 30,000 full-length Alu copies of hg38 chr1 (of 76,301) give 600 rows in 12 min at 4.3 GB on the shared processor (6.7 min at 0.8 GB with </w:t>
       </w:r>
       <w:r>
         <w:rPr>
@@ -847,37 +881,7 @@
           <w:b w:val="0"/>
           <w:i w:val="0"/>
         </w:rPr>
-        <w:t xml:space="preserve">; 0.804 and 0.809 for two further random samples of the same copies), against 0.793 at 3,000 copies, so the picture of Example 1 holds at ten times the size. The Dfam consensuses are in the rows at identity 1.000 (B2_Mm1a), 0.995 (B2_Mm2), 0.984 (B2_Mm1t), 0.943 (B3) and 0.889 (B3A), the last two being the old classes whose copies are 25–30 % diverged; 35 of the 60 rows of the chr19 run have a row at ≥ 0.95 among the 600, the rest being B3/B3A rows. For comparison, 30,000 full-length Alu copies of hg38 chr1 (of 76,301) give 600 rows in 12 min at 4.3 GB (chunk purity against the RepeatMasker name 0.472; with </w:t>
-      </w:r>
-      <w:r>
-        <w:rPr>
-          <w:rFonts w:ascii="Courier New" w:hAnsi="Courier New"/>
-          <w:b w:val="0"/>
-          <w:i w:val="0"/>
-        </w:rPr>
-        <w:t>-P</w:t>
-      </w:r>
-      <w:r>
-        <w:rPr>
-          <w:b w:val="0"/>
-          <w:i w:val="0"/>
-        </w:rPr>
-        <w:t xml:space="preserve"> 6.7 min at 0.8 GB and purity 0.400) in which 25 of the 26 Dfam human Alu families with 50 or more expected copies in the sample are present at ≥ 0.95 identity (21 at 0.98; median best identity 0.994), and 9 of the 10 families with fewer than 10 expected copies. In SubFam's row order the 600 rows form one block of B2 chunks (Mm2, Mm1t and Mm1a interleaved, the 11-bp deletion of the B2 lineage visible as a shared gap) flanked by B3/B3A chunks on both sides, the structure of the 60-row run at ten times the resolution (Additional file 7). At </w:t>
-      </w:r>
-      <w:r>
-        <w:rPr>
-          <w:rFonts w:ascii="Courier New" w:hAnsi="Courier New"/>
-          <w:b w:val="0"/>
-          <w:i w:val="0"/>
-        </w:rPr>
-        <w:t>-n 20</w:t>
-      </w:r>
-      <w:r>
-        <w:rPr>
-          <w:b w:val="0"/>
-          <w:i w:val="0"/>
-        </w:rPr>
-        <w:t xml:space="preserve"> the same 30,000 B2 copies give 1,500 rows (1,486 distinct) at purity 0.826 in 15 min. On the Alu sample all 74 Price et al. [6] subfamilies expected to have 50 or more copies in the sample are present at ≥ 0.95 identity (61 at 0.98), 88 of 90 with 10–50 expected copies and 45 of 49 with fewer; recovery falls with the expected copy number, as a chunk needs about N copies of a group.</w:t>
+        <w:t>). Among them, 25 of the 26 Dfam human Alu families with 50 or more expected copies in the sample are present at ≥ 0.95 identity (median best identity 0.994), and all 74 Price et al. [6] subfamilies with 50 or more expected copies; of the rarer Price subfamilies, 88 of 90 with 10–50 expected copies and 45 of 49 with fewer are present. Presence falls with the expected copy number, as a group needs about N copies in the sample.</w:t>
       </w:r>
     </w:p>
     <w:p>
@@ -890,7 +894,7 @@
           <w:i/>
           <w:sz w:val="24"/>
         </w:rPr>
-        <w:t>What each step contributes (Table 1)</w:t>
+        <w:t>The ordering is what makes the chunks (Table 1)</w:t>
       </w:r>
     </w:p>
     <w:p>
@@ -929,7 +933,22 @@
           <w:b w:val="0"/>
           <w:i w:val="0"/>
         </w:rPr>
-        <w:t>). The compact, ordered alignment with a provenance table comes from their combination, and the ablation measures the share of each. On the 3,000 B2 copies with N = 50 the label-free chunk statistics rank the variants in the same order as purity against the RepeatMasker label (Table 1).</w:t>
+        <w:t>); the compact, ordered alignment with a table of its copies comes from their combination. Table 1 shows on the 3,000 B2 copies, with a statistic that uses no labels, what the ordering contributes: in ordered chunks the least similar member is still close to the chunk's most frequent bases (0.71–0.72), in chunks cut from a shuffled or genomic order it is not (0.59–0.60), and a single consensus of all copies falls to 0.50. Any similarity order serves: MAFFT's guide-tree order (</w:t>
+      </w:r>
+      <w:r>
+        <w:rPr>
+          <w:rFonts w:ascii="Courier New" w:hAnsi="Courier New"/>
+          <w:b w:val="0"/>
+          <w:i w:val="0"/>
+        </w:rPr>
+        <w:t>-m</w:t>
+      </w:r>
+      <w:r>
+        <w:rPr>
+          <w:b w:val="0"/>
+          <w:i w:val="0"/>
+        </w:rPr>
+        <w:t>) gives chunks as close as the k-mer order. Without the consensus step the researcher is left with the 3,000-row alignment.</w:t>
       </w:r>
     </w:p>
     <w:p>
@@ -945,7 +964,7 @@
           <w:b w:val="0"/>
           <w:i w:val="0"/>
         </w:rPr>
-        <w:t xml:space="preserve"> Contribution of each step of SubFam: ablation on 3000 mouse B2 copies, N = 50</w:t>
+        <w:t xml:space="preserve"> What each step contributes: 3,000 mouse B2 copies, N = 50</w:t>
       </w:r>
     </w:p>
     <w:tbl>
@@ -1025,7 +1044,7 @@
                 <w:b/>
                 <w:i w:val="0"/>
               </w:rPr>
-              <w:t>purity</w:t>
+              <w:t>lowest member identity</w:t>
             </w:r>
           </w:p>
         </w:tc>
@@ -1095,7 +1114,7 @@
                 <w:b w:val="0"/>
                 <w:i w:val="0"/>
               </w:rPr>
-              <w:t>0.79</w:t>
+              <w:t>0.72</w:t>
             </w:r>
           </w:p>
         </w:tc>
@@ -1114,7 +1133,7 @@
                 <w:b w:val="0"/>
                 <w:i w:val="0"/>
               </w:rPr>
-              <w:t>ordering removed: shuffled input, same chunks</w:t>
+              <w:t>ordering removed: shuffled input, same chunk size</w:t>
             </w:r>
           </w:p>
         </w:tc>
@@ -1165,7 +1184,7 @@
                 <w:b w:val="0"/>
                 <w:i w:val="0"/>
               </w:rPr>
-              <w:t>0.43</w:t>
+              <w:t>0.60</w:t>
             </w:r>
           </w:p>
         </w:tc>
@@ -1235,7 +1254,7 @@
                 <w:b w:val="0"/>
                 <w:i w:val="0"/>
               </w:rPr>
-              <w:t>0.43</w:t>
+              <w:t>0.59</w:t>
             </w:r>
           </w:p>
         </w:tc>
@@ -1305,7 +1324,7 @@
                 <w:b w:val="0"/>
                 <w:i w:val="0"/>
               </w:rPr>
-              <w:t>0.73</w:t>
+              <w:t>0.71</w:t>
             </w:r>
           </w:p>
         </w:tc>
@@ -1375,7 +1394,7 @@
                 <w:b w:val="0"/>
                 <w:i w:val="0"/>
               </w:rPr>
-              <w:t>0.77</w:t>
+              <w:t>0.72</w:t>
             </w:r>
           </w:p>
         </w:tc>
@@ -1445,7 +1464,7 @@
                 <w:b w:val="0"/>
                 <w:i w:val="0"/>
               </w:rPr>
-              <w:t>0.42</w:t>
+              <w:t>0.50</w:t>
             </w:r>
           </w:p>
         </w:tc>
@@ -1464,7 +1483,7 @@
                 <w:b w:val="0"/>
                 <w:i w:val="0"/>
               </w:rPr>
-              <w:t>consensus removed: MAFFT alignment of all 3000 copies</w:t>
+              <w:t>consensus removed: MAFFT alignment of all 3,000 copies</w:t>
             </w:r>
           </w:p>
         </w:tc>
@@ -1481,7 +1500,7 @@
                 <w:b w:val="0"/>
                 <w:i w:val="0"/>
               </w:rPr>
-              <w:t>3000</w:t>
+              <w:t>3,000</w:t>
             </w:r>
           </w:p>
         </w:tc>
@@ -1498,7 +1517,7 @@
                 <w:b w:val="0"/>
                 <w:i w:val="0"/>
               </w:rPr>
-              <w:t>2781</w:t>
+              <w:t>2,781</w:t>
             </w:r>
           </w:p>
         </w:tc>
@@ -1534,1412 +1553,7 @@
           <w:b w:val="0"/>
           <w:i w:val="0"/>
         </w:rPr>
-        <w:t xml:space="preserve"> Rows, number of rows in the output; columns, alignment columns; purity, fraction of the copies that carry the majority RepeatMasker label of their chunk; –, not applicable.</w:t>
-      </w:r>
-    </w:p>
-    <w:p>
-      <w:r>
-        <w:rPr>
-          <w:b w:val="0"/>
-          <w:i w:val="0"/>
-        </w:rPr>
-        <w:t>Chunks of unordered copies are as impure as a single family consensus; the generic guide-tree order supplies most of the gain, the k-mer order with the flip the rest; with the consensus step removed, the researcher is left with the 3,000-row alignment.</w:t>
-      </w:r>
-    </w:p>
-    <w:p>
-      <w:pPr>
-        <w:keepNext/>
-      </w:pPr>
-      <w:r>
-        <w:rPr>
-          <w:b/>
-          <w:i/>
-          <w:sz w:val="24"/>
-        </w:rPr>
-        <w:t>Against identity clustering (Table 2)</w:t>
-      </w:r>
-    </w:p>
-    <w:p>
-      <w:r>
-        <w:rPr>
-          <w:rFonts w:ascii="Courier New" w:hAnsi="Courier New"/>
-          <w:b w:val="0"/>
-          <w:i w:val="0"/>
-        </w:rPr>
-        <w:t>vsearch --cluster_fast</w:t>
-      </w:r>
-      <w:r>
-        <w:rPr>
-          <w:b w:val="0"/>
-          <w:i w:val="0"/>
-        </w:rPr>
-        <w:t xml:space="preserve"> and MeShClust2 [23] (mean-shift assignment on alignment-free identity) at several identities, beside the SubFam chunks and a single family-wide consensus. Purity is the fraction of copies carrying the majority label of their group; a "real" group has at least 10 copies; distinct rows are counted after collapsing identical consensus sequences (Table 2).</w:t>
-      </w:r>
-    </w:p>
-    <w:p>
-      <w:r>
-        <w:rPr>
-          <w:b/>
-          <w:i w:val="0"/>
-        </w:rPr>
-        <w:t>Table 2.</w:t>
-      </w:r>
-      <w:r>
-        <w:rPr>
-          <w:b w:val="0"/>
-          <w:i w:val="0"/>
-        </w:rPr>
-        <w:t xml:space="preserve"> SubFam chunks against identity clustering with VSEARCH and MeShClust2</w:t>
-      </w:r>
-    </w:p>
-    <w:tbl>
-      <w:tblPr>
-        <w:tblStyle w:val="TableGrid"/>
-        <w:tblW w:type="auto" w:w="0"/>
-        <w:tblLook w:firstColumn="1" w:firstRow="1" w:lastColumn="0" w:lastRow="0" w:noHBand="0" w:noVBand="1" w:val="04A0"/>
-      </w:tblPr>
-      <w:tblGrid>
-        <w:gridCol w:w="1440"/>
-        <w:gridCol w:w="1440"/>
-        <w:gridCol w:w="1440"/>
-        <w:gridCol w:w="1440"/>
-        <w:gridCol w:w="1440"/>
-        <w:gridCol w:w="1440"/>
-      </w:tblGrid>
-      <w:tr>
-        <w:tc>
-          <w:tcPr>
-            <w:tcW w:type="dxa" w:w="1440"/>
-          </w:tcPr>
-          <w:p>
-            <w:pPr>
-              <w:spacing w:line="240" w:lineRule="auto"/>
-            </w:pPr>
-            <w:r>
-              <w:rPr>
-                <w:b/>
-                <w:i w:val="0"/>
-              </w:rPr>
-              <w:t>example</w:t>
-            </w:r>
-          </w:p>
-        </w:tc>
-        <w:tc>
-          <w:tcPr>
-            <w:tcW w:type="dxa" w:w="1440"/>
-          </w:tcPr>
-          <w:p>
-            <w:pPr>
-              <w:spacing w:line="240" w:lineRule="auto"/>
-            </w:pPr>
-            <w:r>
-              <w:rPr>
-                <w:b/>
-                <w:i w:val="0"/>
-              </w:rPr>
-              <w:t>method</w:t>
-            </w:r>
-          </w:p>
-        </w:tc>
-        <w:tc>
-          <w:tcPr>
-            <w:tcW w:type="dxa" w:w="1440"/>
-          </w:tcPr>
-          <w:p>
-            <w:pPr>
-              <w:spacing w:line="240" w:lineRule="auto"/>
-            </w:pPr>
-            <w:r>
-              <w:rPr>
-                <w:b/>
-                <w:i w:val="0"/>
-              </w:rPr>
-              <w:t>groups</w:t>
-            </w:r>
-          </w:p>
-        </w:tc>
-        <w:tc>
-          <w:tcPr>
-            <w:tcW w:type="dxa" w:w="1440"/>
-          </w:tcPr>
-          <w:p>
-            <w:pPr>
-              <w:spacing w:line="240" w:lineRule="auto"/>
-            </w:pPr>
-            <w:r>
-              <w:rPr>
-                <w:b/>
-                <w:i w:val="0"/>
-              </w:rPr>
-              <w:t>singletons</w:t>
-            </w:r>
-          </w:p>
-        </w:tc>
-        <w:tc>
-          <w:tcPr>
-            <w:tcW w:type="dxa" w:w="1440"/>
-          </w:tcPr>
-          <w:p>
-            <w:pPr>
-              <w:spacing w:line="240" w:lineRule="auto"/>
-            </w:pPr>
-            <w:r>
-              <w:rPr>
-                <w:b/>
-                <w:i w:val="0"/>
-              </w:rPr>
-              <w:t>copies in groups ≥ 10</w:t>
-            </w:r>
-          </w:p>
-        </w:tc>
-        <w:tc>
-          <w:tcPr>
-            <w:tcW w:type="dxa" w:w="1440"/>
-          </w:tcPr>
-          <w:p>
-            <w:pPr>
-              <w:spacing w:line="240" w:lineRule="auto"/>
-            </w:pPr>
-            <w:r>
-              <w:rPr>
-                <w:b/>
-                <w:i w:val="0"/>
-              </w:rPr>
-              <w:t>purity of those</w:t>
-            </w:r>
-          </w:p>
-        </w:tc>
-      </w:tr>
-      <w:tr>
-        <w:tc>
-          <w:tcPr>
-            <w:tcW w:type="dxa" w:w="1440"/>
-          </w:tcPr>
-          <w:p>
-            <w:pPr>
-              <w:spacing w:line="240" w:lineRule="auto"/>
-            </w:pPr>
-            <w:r>
-              <w:rPr>
-                <w:b w:val="0"/>
-                <w:i w:val="0"/>
-              </w:rPr>
-              <w:t>B2, 3000 copies</w:t>
-            </w:r>
-          </w:p>
-        </w:tc>
-        <w:tc>
-          <w:tcPr>
-            <w:tcW w:type="dxa" w:w="1440"/>
-          </w:tcPr>
-          <w:p>
-            <w:pPr>
-              <w:spacing w:line="240" w:lineRule="auto"/>
-            </w:pPr>
-            <w:r>
-              <w:rPr>
-                <w:b w:val="0"/>
-                <w:i w:val="0"/>
-              </w:rPr>
-              <w:t>one consensus</w:t>
-            </w:r>
-          </w:p>
-        </w:tc>
-        <w:tc>
-          <w:tcPr>
-            <w:tcW w:type="dxa" w:w="1440"/>
-          </w:tcPr>
-          <w:p>
-            <w:pPr>
-              <w:spacing w:line="240" w:lineRule="auto"/>
-            </w:pPr>
-            <w:r>
-              <w:rPr>
-                <w:b w:val="0"/>
-                <w:i w:val="0"/>
-              </w:rPr>
-              <w:t>1</w:t>
-            </w:r>
-          </w:p>
-        </w:tc>
-        <w:tc>
-          <w:tcPr>
-            <w:tcW w:type="dxa" w:w="1440"/>
-          </w:tcPr>
-          <w:p>
-            <w:pPr>
-              <w:spacing w:line="240" w:lineRule="auto"/>
-            </w:pPr>
-            <w:r>
-              <w:rPr>
-                <w:b w:val="0"/>
-                <w:i w:val="0"/>
-              </w:rPr>
-              <w:t>0</w:t>
-            </w:r>
-          </w:p>
-        </w:tc>
-        <w:tc>
-          <w:tcPr>
-            <w:tcW w:type="dxa" w:w="1440"/>
-          </w:tcPr>
-          <w:p>
-            <w:pPr>
-              <w:spacing w:line="240" w:lineRule="auto"/>
-            </w:pPr>
-            <w:r>
-              <w:rPr>
-                <w:b w:val="0"/>
-                <w:i w:val="0"/>
-              </w:rPr>
-              <w:t>100 %</w:t>
-            </w:r>
-          </w:p>
-        </w:tc>
-        <w:tc>
-          <w:tcPr>
-            <w:tcW w:type="dxa" w:w="1440"/>
-          </w:tcPr>
-          <w:p>
-            <w:pPr>
-              <w:spacing w:line="240" w:lineRule="auto"/>
-            </w:pPr>
-            <w:r>
-              <w:rPr>
-                <w:b w:val="0"/>
-                <w:i w:val="0"/>
-              </w:rPr>
-              <w:t>0.42</w:t>
-            </w:r>
-          </w:p>
-        </w:tc>
-      </w:tr>
-      <w:tr>
-        <w:tc>
-          <w:tcPr>
-            <w:tcW w:type="dxa" w:w="1440"/>
-          </w:tcPr>
-          <w:p>
-            <w:pPr>
-              <w:spacing w:line="240" w:lineRule="auto"/>
-            </w:pPr>
-          </w:p>
-        </w:tc>
-        <w:tc>
-          <w:tcPr>
-            <w:tcW w:type="dxa" w:w="1440"/>
-          </w:tcPr>
-          <w:p>
-            <w:pPr>
-              <w:spacing w:line="240" w:lineRule="auto"/>
-            </w:pPr>
-            <w:r>
-              <w:rPr>
-                <w:b/>
-                <w:i w:val="0"/>
-              </w:rPr>
-              <w:t>SubFam N = 50</w:t>
-            </w:r>
-            <w:r>
-              <w:rPr>
-                <w:b w:val="0"/>
-                <w:i w:val="0"/>
-              </w:rPr>
-              <w:t xml:space="preserve"> (60 distinct rows)</w:t>
-            </w:r>
-          </w:p>
-        </w:tc>
-        <w:tc>
-          <w:tcPr>
-            <w:tcW w:type="dxa" w:w="1440"/>
-          </w:tcPr>
-          <w:p>
-            <w:pPr>
-              <w:spacing w:line="240" w:lineRule="auto"/>
-            </w:pPr>
-            <w:r>
-              <w:rPr>
-                <w:b/>
-                <w:i w:val="0"/>
-              </w:rPr>
-              <w:t>60</w:t>
-            </w:r>
-          </w:p>
-        </w:tc>
-        <w:tc>
-          <w:tcPr>
-            <w:tcW w:type="dxa" w:w="1440"/>
-          </w:tcPr>
-          <w:p>
-            <w:pPr>
-              <w:spacing w:line="240" w:lineRule="auto"/>
-            </w:pPr>
-            <w:r>
-              <w:rPr>
-                <w:b/>
-                <w:i w:val="0"/>
-              </w:rPr>
-              <w:t>0</w:t>
-            </w:r>
-          </w:p>
-        </w:tc>
-        <w:tc>
-          <w:tcPr>
-            <w:tcW w:type="dxa" w:w="1440"/>
-          </w:tcPr>
-          <w:p>
-            <w:pPr>
-              <w:spacing w:line="240" w:lineRule="auto"/>
-            </w:pPr>
-            <w:r>
-              <w:rPr>
-                <w:b/>
-                <w:i w:val="0"/>
-              </w:rPr>
-              <w:t>100 %</w:t>
-            </w:r>
-          </w:p>
-        </w:tc>
-        <w:tc>
-          <w:tcPr>
-            <w:tcW w:type="dxa" w:w="1440"/>
-          </w:tcPr>
-          <w:p>
-            <w:pPr>
-              <w:spacing w:line="240" w:lineRule="auto"/>
-            </w:pPr>
-            <w:r>
-              <w:rPr>
-                <w:b/>
-                <w:i w:val="0"/>
-              </w:rPr>
-              <w:t>0.79</w:t>
-            </w:r>
-          </w:p>
-        </w:tc>
-      </w:tr>
-      <w:tr>
-        <w:tc>
-          <w:tcPr>
-            <w:tcW w:type="dxa" w:w="1440"/>
-          </w:tcPr>
-          <w:p>
-            <w:pPr>
-              <w:spacing w:line="240" w:lineRule="auto"/>
-            </w:pPr>
-          </w:p>
-        </w:tc>
-        <w:tc>
-          <w:tcPr>
-            <w:tcW w:type="dxa" w:w="1440"/>
-          </w:tcPr>
-          <w:p>
-            <w:pPr>
-              <w:spacing w:line="240" w:lineRule="auto"/>
-            </w:pPr>
-            <w:r>
-              <w:rPr>
-                <w:b w:val="0"/>
-                <w:i w:val="0"/>
-              </w:rPr>
-              <w:t>vsearch 0.60 / 0.80 / 0.95</w:t>
-            </w:r>
-          </w:p>
-        </w:tc>
-        <w:tc>
-          <w:tcPr>
-            <w:tcW w:type="dxa" w:w="1440"/>
-          </w:tcPr>
-          <w:p>
-            <w:pPr>
-              <w:spacing w:line="240" w:lineRule="auto"/>
-            </w:pPr>
-            <w:r>
-              <w:rPr>
-                <w:b w:val="0"/>
-                <w:i w:val="0"/>
-              </w:rPr>
-              <w:t>632 / 1992 / 2868</w:t>
-            </w:r>
-          </w:p>
-        </w:tc>
-        <w:tc>
-          <w:tcPr>
-            <w:tcW w:type="dxa" w:w="1440"/>
-          </w:tcPr>
-          <w:p>
-            <w:pPr>
-              <w:spacing w:line="240" w:lineRule="auto"/>
-            </w:pPr>
-            <w:r>
-              <w:rPr>
-                <w:b w:val="0"/>
-                <w:i w:val="0"/>
-              </w:rPr>
-              <w:t>389 / 1906 / 2812</w:t>
-            </w:r>
-          </w:p>
-        </w:tc>
-        <w:tc>
-          <w:tcPr>
-            <w:tcW w:type="dxa" w:w="1440"/>
-          </w:tcPr>
-          <w:p>
-            <w:pPr>
-              <w:spacing w:line="240" w:lineRule="auto"/>
-            </w:pPr>
-            <w:r>
-              <w:rPr>
-                <w:b w:val="0"/>
-                <w:i w:val="0"/>
-              </w:rPr>
-              <w:t>63 / 29 / 1 %</w:t>
-            </w:r>
-          </w:p>
-        </w:tc>
-        <w:tc>
-          <w:tcPr>
-            <w:tcW w:type="dxa" w:w="1440"/>
-          </w:tcPr>
-          <w:p>
-            <w:pPr>
-              <w:spacing w:line="240" w:lineRule="auto"/>
-            </w:pPr>
-            <w:r>
-              <w:rPr>
-                <w:b w:val="0"/>
-                <w:i w:val="0"/>
-              </w:rPr>
-              <w:t>0.67 / 0.80 / 0.82</w:t>
-            </w:r>
-          </w:p>
-        </w:tc>
-      </w:tr>
-      <w:tr>
-        <w:tc>
-          <w:tcPr>
-            <w:tcW w:type="dxa" w:w="1440"/>
-          </w:tcPr>
-          <w:p>
-            <w:pPr>
-              <w:spacing w:line="240" w:lineRule="auto"/>
-            </w:pPr>
-          </w:p>
-        </w:tc>
-        <w:tc>
-          <w:tcPr>
-            <w:tcW w:type="dxa" w:w="1440"/>
-          </w:tcPr>
-          <w:p>
-            <w:pPr>
-              <w:spacing w:line="240" w:lineRule="auto"/>
-            </w:pPr>
-            <w:r>
-              <w:rPr>
-                <w:b w:val="0"/>
-                <w:i w:val="0"/>
-              </w:rPr>
-              <w:t>MeShClust2 0.60 / 0.80 / 0.95</w:t>
-            </w:r>
-          </w:p>
-        </w:tc>
-        <w:tc>
-          <w:tcPr>
-            <w:tcW w:type="dxa" w:w="1440"/>
-          </w:tcPr>
-          <w:p>
-            <w:pPr>
-              <w:spacing w:line="240" w:lineRule="auto"/>
-            </w:pPr>
-            <w:r>
-              <w:rPr>
-                <w:b w:val="0"/>
-                <w:i w:val="0"/>
-              </w:rPr>
-              <w:t>636 / 2328 / 2882</w:t>
-            </w:r>
-          </w:p>
-        </w:tc>
-        <w:tc>
-          <w:tcPr>
-            <w:tcW w:type="dxa" w:w="1440"/>
-          </w:tcPr>
-          <w:p>
-            <w:pPr>
-              <w:spacing w:line="240" w:lineRule="auto"/>
-            </w:pPr>
-            <w:r>
-              <w:rPr>
-                <w:b w:val="0"/>
-                <w:i w:val="0"/>
-              </w:rPr>
-              <w:t>533 / 2233 / 2865</w:t>
-            </w:r>
-          </w:p>
-        </w:tc>
-        <w:tc>
-          <w:tcPr>
-            <w:tcW w:type="dxa" w:w="1440"/>
-          </w:tcPr>
-          <w:p>
-            <w:pPr>
-              <w:spacing w:line="240" w:lineRule="auto"/>
-            </w:pPr>
-            <w:r>
-              <w:rPr>
-                <w:b w:val="0"/>
-                <w:i w:val="0"/>
-              </w:rPr>
-              <w:t>73 / 16 / 3 %</w:t>
-            </w:r>
-          </w:p>
-        </w:tc>
-        <w:tc>
-          <w:tcPr>
-            <w:tcW w:type="dxa" w:w="1440"/>
-          </w:tcPr>
-          <w:p>
-            <w:pPr>
-              <w:spacing w:line="240" w:lineRule="auto"/>
-            </w:pPr>
-            <w:r>
-              <w:rPr>
-                <w:b w:val="0"/>
-                <w:i w:val="0"/>
-              </w:rPr>
-              <w:t>0.46 / 0.56 / 0.95</w:t>
-            </w:r>
-          </w:p>
-        </w:tc>
-      </w:tr>
-      <w:tr>
-        <w:tc>
-          <w:tcPr>
-            <w:tcW w:type="dxa" w:w="1440"/>
-          </w:tcPr>
-          <w:p>
-            <w:pPr>
-              <w:spacing w:line="240" w:lineRule="auto"/>
-            </w:pPr>
-            <w:r>
-              <w:rPr>
-                <w:b w:val="0"/>
-                <w:i w:val="0"/>
-              </w:rPr>
-              <w:t>L1PA2–8, 2222 copies</w:t>
-            </w:r>
-          </w:p>
-        </w:tc>
-        <w:tc>
-          <w:tcPr>
-            <w:tcW w:type="dxa" w:w="1440"/>
-          </w:tcPr>
-          <w:p>
-            <w:pPr>
-              <w:spacing w:line="240" w:lineRule="auto"/>
-            </w:pPr>
-            <w:r>
-              <w:rPr>
-                <w:b w:val="0"/>
-                <w:i w:val="0"/>
-              </w:rPr>
-              <w:t>one consensus</w:t>
-            </w:r>
-          </w:p>
-        </w:tc>
-        <w:tc>
-          <w:tcPr>
-            <w:tcW w:type="dxa" w:w="1440"/>
-          </w:tcPr>
-          <w:p>
-            <w:pPr>
-              <w:spacing w:line="240" w:lineRule="auto"/>
-            </w:pPr>
-            <w:r>
-              <w:rPr>
-                <w:b w:val="0"/>
-                <w:i w:val="0"/>
-              </w:rPr>
-              <w:t>1</w:t>
-            </w:r>
-          </w:p>
-        </w:tc>
-        <w:tc>
-          <w:tcPr>
-            <w:tcW w:type="dxa" w:w="1440"/>
-          </w:tcPr>
-          <w:p>
-            <w:pPr>
-              <w:spacing w:line="240" w:lineRule="auto"/>
-            </w:pPr>
-            <w:r>
-              <w:rPr>
-                <w:b w:val="0"/>
-                <w:i w:val="0"/>
-              </w:rPr>
-              <w:t>0</w:t>
-            </w:r>
-          </w:p>
-        </w:tc>
-        <w:tc>
-          <w:tcPr>
-            <w:tcW w:type="dxa" w:w="1440"/>
-          </w:tcPr>
-          <w:p>
-            <w:pPr>
-              <w:spacing w:line="240" w:lineRule="auto"/>
-            </w:pPr>
-            <w:r>
-              <w:rPr>
-                <w:b w:val="0"/>
-                <w:i w:val="0"/>
-              </w:rPr>
-              <w:t>100 %</w:t>
-            </w:r>
-          </w:p>
-        </w:tc>
-        <w:tc>
-          <w:tcPr>
-            <w:tcW w:type="dxa" w:w="1440"/>
-          </w:tcPr>
-          <w:p>
-            <w:pPr>
-              <w:spacing w:line="240" w:lineRule="auto"/>
-            </w:pPr>
-            <w:r>
-              <w:rPr>
-                <w:b w:val="0"/>
-                <w:i w:val="0"/>
-              </w:rPr>
-              <w:t>0.22</w:t>
-            </w:r>
-          </w:p>
-        </w:tc>
-      </w:tr>
-      <w:tr>
-        <w:tc>
-          <w:tcPr>
-            <w:tcW w:type="dxa" w:w="1440"/>
-          </w:tcPr>
-          <w:p>
-            <w:pPr>
-              <w:spacing w:line="240" w:lineRule="auto"/>
-            </w:pPr>
-          </w:p>
-        </w:tc>
-        <w:tc>
-          <w:tcPr>
-            <w:tcW w:type="dxa" w:w="1440"/>
-          </w:tcPr>
-          <w:p>
-            <w:pPr>
-              <w:spacing w:line="240" w:lineRule="auto"/>
-            </w:pPr>
-            <w:r>
-              <w:rPr>
-                <w:b/>
-                <w:i w:val="0"/>
-              </w:rPr>
-              <w:t>SubFam N = 20, -c</w:t>
-            </w:r>
-            <w:r>
-              <w:rPr>
-                <w:b w:val="0"/>
-                <w:i w:val="0"/>
-              </w:rPr>
-              <w:t xml:space="preserve"> (111 distinct rows)</w:t>
-            </w:r>
-          </w:p>
-        </w:tc>
-        <w:tc>
-          <w:tcPr>
-            <w:tcW w:type="dxa" w:w="1440"/>
-          </w:tcPr>
-          <w:p>
-            <w:pPr>
-              <w:spacing w:line="240" w:lineRule="auto"/>
-            </w:pPr>
-            <w:r>
-              <w:rPr>
-                <w:b/>
-                <w:i w:val="0"/>
-              </w:rPr>
-              <w:t>111</w:t>
-            </w:r>
-          </w:p>
-        </w:tc>
-        <w:tc>
-          <w:tcPr>
-            <w:tcW w:type="dxa" w:w="1440"/>
-          </w:tcPr>
-          <w:p>
-            <w:pPr>
-              <w:spacing w:line="240" w:lineRule="auto"/>
-            </w:pPr>
-            <w:r>
-              <w:rPr>
-                <w:b/>
-                <w:i w:val="0"/>
-              </w:rPr>
-              <w:t>0</w:t>
-            </w:r>
-          </w:p>
-        </w:tc>
-        <w:tc>
-          <w:tcPr>
-            <w:tcW w:type="dxa" w:w="1440"/>
-          </w:tcPr>
-          <w:p>
-            <w:pPr>
-              <w:spacing w:line="240" w:lineRule="auto"/>
-            </w:pPr>
-            <w:r>
-              <w:rPr>
-                <w:b/>
-                <w:i w:val="0"/>
-              </w:rPr>
-              <w:t>100 %</w:t>
-            </w:r>
-          </w:p>
-        </w:tc>
-        <w:tc>
-          <w:tcPr>
-            <w:tcW w:type="dxa" w:w="1440"/>
-          </w:tcPr>
-          <w:p>
-            <w:pPr>
-              <w:spacing w:line="240" w:lineRule="auto"/>
-            </w:pPr>
-            <w:r>
-              <w:rPr>
-                <w:b/>
-                <w:i w:val="0"/>
-              </w:rPr>
-              <w:t>0.70</w:t>
-            </w:r>
-          </w:p>
-        </w:tc>
-      </w:tr>
-      <w:tr>
-        <w:tc>
-          <w:tcPr>
-            <w:tcW w:type="dxa" w:w="1440"/>
-          </w:tcPr>
-          <w:p>
-            <w:pPr>
-              <w:spacing w:line="240" w:lineRule="auto"/>
-            </w:pPr>
-          </w:p>
-        </w:tc>
-        <w:tc>
-          <w:tcPr>
-            <w:tcW w:type="dxa" w:w="1440"/>
-          </w:tcPr>
-          <w:p>
-            <w:pPr>
-              <w:spacing w:line="240" w:lineRule="auto"/>
-            </w:pPr>
-            <w:r>
-              <w:rPr>
-                <w:b w:val="0"/>
-                <w:i w:val="0"/>
-              </w:rPr>
-              <w:t>vsearch 0.80 / 0.90 / 0.95</w:t>
-            </w:r>
-          </w:p>
-        </w:tc>
-        <w:tc>
-          <w:tcPr>
-            <w:tcW w:type="dxa" w:w="1440"/>
-          </w:tcPr>
-          <w:p>
-            <w:pPr>
-              <w:spacing w:line="240" w:lineRule="auto"/>
-            </w:pPr>
-            <w:r>
-              <w:rPr>
-                <w:b w:val="0"/>
-                <w:i w:val="0"/>
-              </w:rPr>
-              <w:t>45 / 753 / 1557</w:t>
-            </w:r>
-          </w:p>
-        </w:tc>
-        <w:tc>
-          <w:tcPr>
-            <w:tcW w:type="dxa" w:w="1440"/>
-          </w:tcPr>
-          <w:p>
-            <w:pPr>
-              <w:spacing w:line="240" w:lineRule="auto"/>
-            </w:pPr>
-            <w:r>
-              <w:rPr>
-                <w:b w:val="0"/>
-                <w:i w:val="0"/>
-              </w:rPr>
-              <w:t>31 / 686 / 1475</w:t>
-            </w:r>
-          </w:p>
-        </w:tc>
-        <w:tc>
-          <w:tcPr>
-            <w:tcW w:type="dxa" w:w="1440"/>
-          </w:tcPr>
-          <w:p>
-            <w:pPr>
-              <w:spacing w:line="240" w:lineRule="auto"/>
-            </w:pPr>
-            <w:r>
-              <w:rPr>
-                <w:b w:val="0"/>
-                <w:i w:val="0"/>
-              </w:rPr>
-              <w:t>96 / 60 / 22 %</w:t>
-            </w:r>
-          </w:p>
-        </w:tc>
-        <w:tc>
-          <w:tcPr>
-            <w:tcW w:type="dxa" w:w="1440"/>
-          </w:tcPr>
-          <w:p>
-            <w:pPr>
-              <w:spacing w:line="240" w:lineRule="auto"/>
-            </w:pPr>
-            <w:r>
-              <w:rPr>
-                <w:b w:val="0"/>
-                <w:i w:val="0"/>
-              </w:rPr>
-              <w:t>0.36 / 0.48 / 0.83</w:t>
-            </w:r>
-          </w:p>
-        </w:tc>
-      </w:tr>
-      <w:tr>
-        <w:tc>
-          <w:tcPr>
-            <w:tcW w:type="dxa" w:w="1440"/>
-          </w:tcPr>
-          <w:p>
-            <w:pPr>
-              <w:spacing w:line="240" w:lineRule="auto"/>
-            </w:pPr>
-          </w:p>
-        </w:tc>
-        <w:tc>
-          <w:tcPr>
-            <w:tcW w:type="dxa" w:w="1440"/>
-          </w:tcPr>
-          <w:p>
-            <w:pPr>
-              <w:spacing w:line="240" w:lineRule="auto"/>
-            </w:pPr>
-            <w:r>
-              <w:rPr>
-                <w:b w:val="0"/>
-                <w:i w:val="0"/>
-              </w:rPr>
-              <w:t>MeShClust2 0.80 / 0.90 / 0.95</w:t>
-            </w:r>
-          </w:p>
-        </w:tc>
-        <w:tc>
-          <w:tcPr>
-            <w:tcW w:type="dxa" w:w="1440"/>
-          </w:tcPr>
-          <w:p>
-            <w:pPr>
-              <w:spacing w:line="240" w:lineRule="auto"/>
-            </w:pPr>
-            <w:r>
-              <w:rPr>
-                <w:b w:val="0"/>
-                <w:i w:val="0"/>
-              </w:rPr>
-              <w:t>317 / 709 / 1992</w:t>
-            </w:r>
-          </w:p>
-        </w:tc>
-        <w:tc>
-          <w:tcPr>
-            <w:tcW w:type="dxa" w:w="1440"/>
-          </w:tcPr>
-          <w:p>
-            <w:pPr>
-              <w:spacing w:line="240" w:lineRule="auto"/>
-            </w:pPr>
-            <w:r>
-              <w:rPr>
-                <w:b w:val="0"/>
-                <w:i w:val="0"/>
-              </w:rPr>
-              <w:t>246 / 639 / 1957</w:t>
-            </w:r>
-          </w:p>
-        </w:tc>
-        <w:tc>
-          <w:tcPr>
-            <w:tcW w:type="dxa" w:w="1440"/>
-          </w:tcPr>
-          <w:p>
-            <w:pPr>
-              <w:spacing w:line="240" w:lineRule="auto"/>
-            </w:pPr>
-            <w:r>
-              <w:rPr>
-                <w:b w:val="0"/>
-                <w:i w:val="0"/>
-              </w:rPr>
-              <w:t>81 / 66 / 7 %</w:t>
-            </w:r>
-          </w:p>
-        </w:tc>
-        <w:tc>
-          <w:tcPr>
-            <w:tcW w:type="dxa" w:w="1440"/>
-          </w:tcPr>
-          <w:p>
-            <w:pPr>
-              <w:spacing w:line="240" w:lineRule="auto"/>
-            </w:pPr>
-            <w:r>
-              <w:rPr>
-                <w:b w:val="0"/>
-                <w:i w:val="0"/>
-              </w:rPr>
-              <w:t>0.27 / 0.34 / 0.65</w:t>
-            </w:r>
-          </w:p>
-        </w:tc>
-      </w:tr>
-      <w:tr>
-        <w:tc>
-          <w:tcPr>
-            <w:tcW w:type="dxa" w:w="1440"/>
-          </w:tcPr>
-          <w:p>
-            <w:pPr>
-              <w:spacing w:line="240" w:lineRule="auto"/>
-            </w:pPr>
-            <w:r>
-              <w:rPr>
-                <w:b w:val="0"/>
-                <w:i w:val="0"/>
-              </w:rPr>
-              <w:t>Alu loci, 316 copies</w:t>
-            </w:r>
-          </w:p>
-        </w:tc>
-        <w:tc>
-          <w:tcPr>
-            <w:tcW w:type="dxa" w:w="1440"/>
-          </w:tcPr>
-          <w:p>
-            <w:pPr>
-              <w:spacing w:line="240" w:lineRule="auto"/>
-            </w:pPr>
-            <w:r>
-              <w:rPr>
-                <w:b w:val="0"/>
-                <w:i w:val="0"/>
-              </w:rPr>
-              <w:t>one consensus</w:t>
-            </w:r>
-          </w:p>
-        </w:tc>
-        <w:tc>
-          <w:tcPr>
-            <w:tcW w:type="dxa" w:w="1440"/>
-          </w:tcPr>
-          <w:p>
-            <w:pPr>
-              <w:spacing w:line="240" w:lineRule="auto"/>
-            </w:pPr>
-            <w:r>
-              <w:rPr>
-                <w:b w:val="0"/>
-                <w:i w:val="0"/>
-              </w:rPr>
-              <w:t>1</w:t>
-            </w:r>
-          </w:p>
-        </w:tc>
-        <w:tc>
-          <w:tcPr>
-            <w:tcW w:type="dxa" w:w="1440"/>
-          </w:tcPr>
-          <w:p>
-            <w:pPr>
-              <w:spacing w:line="240" w:lineRule="auto"/>
-            </w:pPr>
-            <w:r>
-              <w:rPr>
-                <w:b w:val="0"/>
-                <w:i w:val="0"/>
-              </w:rPr>
-              <w:t>0</w:t>
-            </w:r>
-          </w:p>
-        </w:tc>
-        <w:tc>
-          <w:tcPr>
-            <w:tcW w:type="dxa" w:w="1440"/>
-          </w:tcPr>
-          <w:p>
-            <w:pPr>
-              <w:spacing w:line="240" w:lineRule="auto"/>
-            </w:pPr>
-            <w:r>
-              <w:rPr>
-                <w:b w:val="0"/>
-                <w:i w:val="0"/>
-              </w:rPr>
-              <w:t>100 %</w:t>
-            </w:r>
-          </w:p>
-        </w:tc>
-        <w:tc>
-          <w:tcPr>
-            <w:tcW w:type="dxa" w:w="1440"/>
-          </w:tcPr>
-          <w:p>
-            <w:pPr>
-              <w:spacing w:line="240" w:lineRule="auto"/>
-            </w:pPr>
-            <w:r>
-              <w:rPr>
-                <w:b w:val="0"/>
-                <w:i w:val="0"/>
-              </w:rPr>
-              <w:t>0.52</w:t>
-            </w:r>
-          </w:p>
-        </w:tc>
-      </w:tr>
-      <w:tr>
-        <w:tc>
-          <w:tcPr>
-            <w:tcW w:type="dxa" w:w="1440"/>
-          </w:tcPr>
-          <w:p>
-            <w:pPr>
-              <w:spacing w:line="240" w:lineRule="auto"/>
-            </w:pPr>
-          </w:p>
-        </w:tc>
-        <w:tc>
-          <w:tcPr>
-            <w:tcW w:type="dxa" w:w="1440"/>
-          </w:tcPr>
-          <w:p>
-            <w:pPr>
-              <w:spacing w:line="240" w:lineRule="auto"/>
-            </w:pPr>
-            <w:r>
-              <w:rPr>
-                <w:b/>
-                <w:i w:val="0"/>
-              </w:rPr>
-              <w:t>SubFam N = 20</w:t>
-            </w:r>
-            <w:r>
-              <w:rPr>
-                <w:b w:val="0"/>
-                <w:i w:val="0"/>
-              </w:rPr>
-              <w:t xml:space="preserve"> (7 distinct of 16 rows)</w:t>
-            </w:r>
-          </w:p>
-        </w:tc>
-        <w:tc>
-          <w:tcPr>
-            <w:tcW w:type="dxa" w:w="1440"/>
-          </w:tcPr>
-          <w:p>
-            <w:pPr>
-              <w:spacing w:line="240" w:lineRule="auto"/>
-            </w:pPr>
-            <w:r>
-              <w:rPr>
-                <w:b/>
-                <w:i w:val="0"/>
-              </w:rPr>
-              <w:t>16</w:t>
-            </w:r>
-          </w:p>
-        </w:tc>
-        <w:tc>
-          <w:tcPr>
-            <w:tcW w:type="dxa" w:w="1440"/>
-          </w:tcPr>
-          <w:p>
-            <w:pPr>
-              <w:spacing w:line="240" w:lineRule="auto"/>
-            </w:pPr>
-            <w:r>
-              <w:rPr>
-                <w:b/>
-                <w:i w:val="0"/>
-              </w:rPr>
-              <w:t>0</w:t>
-            </w:r>
-          </w:p>
-        </w:tc>
-        <w:tc>
-          <w:tcPr>
-            <w:tcW w:type="dxa" w:w="1440"/>
-          </w:tcPr>
-          <w:p>
-            <w:pPr>
-              <w:spacing w:line="240" w:lineRule="auto"/>
-            </w:pPr>
-            <w:r>
-              <w:rPr>
-                <w:b/>
-                <w:i w:val="0"/>
-              </w:rPr>
-              <w:t>100 %</w:t>
-            </w:r>
-          </w:p>
-        </w:tc>
-        <w:tc>
-          <w:tcPr>
-            <w:tcW w:type="dxa" w:w="1440"/>
-          </w:tcPr>
-          <w:p>
-            <w:pPr>
-              <w:spacing w:line="240" w:lineRule="auto"/>
-            </w:pPr>
-            <w:r>
-              <w:rPr>
-                <w:b/>
-                <w:i w:val="0"/>
-              </w:rPr>
-              <w:t>0.92</w:t>
-            </w:r>
-          </w:p>
-        </w:tc>
-      </w:tr>
-      <w:tr>
-        <w:tc>
-          <w:tcPr>
-            <w:tcW w:type="dxa" w:w="1440"/>
-          </w:tcPr>
-          <w:p>
-            <w:pPr>
-              <w:spacing w:line="240" w:lineRule="auto"/>
-            </w:pPr>
-          </w:p>
-        </w:tc>
-        <w:tc>
-          <w:tcPr>
-            <w:tcW w:type="dxa" w:w="1440"/>
-          </w:tcPr>
-          <w:p>
-            <w:pPr>
-              <w:spacing w:line="240" w:lineRule="auto"/>
-            </w:pPr>
-            <w:r>
-              <w:rPr>
-                <w:b w:val="0"/>
-                <w:i w:val="0"/>
-              </w:rPr>
-              <w:t>vsearch 0.95 / 0.98 / 0.99</w:t>
-            </w:r>
-          </w:p>
-        </w:tc>
-        <w:tc>
-          <w:tcPr>
-            <w:tcW w:type="dxa" w:w="1440"/>
-          </w:tcPr>
-          <w:p>
-            <w:pPr>
-              <w:spacing w:line="240" w:lineRule="auto"/>
-            </w:pPr>
-            <w:r>
-              <w:rPr>
-                <w:b w:val="0"/>
-                <w:i w:val="0"/>
-              </w:rPr>
-              <w:t>18 / 70 / 140</w:t>
-            </w:r>
-          </w:p>
-        </w:tc>
-        <w:tc>
-          <w:tcPr>
-            <w:tcW w:type="dxa" w:w="1440"/>
-          </w:tcPr>
-          <w:p>
-            <w:pPr>
-              <w:spacing w:line="240" w:lineRule="auto"/>
-            </w:pPr>
-            <w:r>
-              <w:rPr>
-                <w:b w:val="0"/>
-                <w:i w:val="0"/>
-              </w:rPr>
-              <w:t>8 / 38 / 101</w:t>
-            </w:r>
-          </w:p>
-        </w:tc>
-        <w:tc>
-          <w:tcPr>
-            <w:tcW w:type="dxa" w:w="1440"/>
-          </w:tcPr>
-          <w:p>
-            <w:pPr>
-              <w:spacing w:line="240" w:lineRule="auto"/>
-            </w:pPr>
-            <w:r>
-              <w:rPr>
-                <w:b w:val="0"/>
-                <w:i w:val="0"/>
-              </w:rPr>
-              <w:t>89 / 65 / 35 %</w:t>
-            </w:r>
-          </w:p>
-        </w:tc>
-        <w:tc>
-          <w:tcPr>
-            <w:tcW w:type="dxa" w:w="1440"/>
-          </w:tcPr>
-          <w:p>
-            <w:pPr>
-              <w:spacing w:line="240" w:lineRule="auto"/>
-            </w:pPr>
-            <w:r>
-              <w:rPr>
-                <w:b w:val="0"/>
-                <w:i w:val="0"/>
-              </w:rPr>
-              <w:t>0.94 / 0.97 / 0.98</w:t>
-            </w:r>
-          </w:p>
-        </w:tc>
-      </w:tr>
-      <w:tr>
-        <w:tc>
-          <w:tcPr>
-            <w:tcW w:type="dxa" w:w="1440"/>
-          </w:tcPr>
-          <w:p>
-            <w:pPr>
-              <w:spacing w:line="240" w:lineRule="auto"/>
-            </w:pPr>
-          </w:p>
-        </w:tc>
-        <w:tc>
-          <w:tcPr>
-            <w:tcW w:type="dxa" w:w="1440"/>
-          </w:tcPr>
-          <w:p>
-            <w:pPr>
-              <w:spacing w:line="240" w:lineRule="auto"/>
-            </w:pPr>
-            <w:r>
-              <w:rPr>
-                <w:b w:val="0"/>
-                <w:i w:val="0"/>
-              </w:rPr>
-              <w:t>MeShClust2 0.90 / 0.95 / 0.98</w:t>
-            </w:r>
-          </w:p>
-        </w:tc>
-        <w:tc>
-          <w:tcPr>
-            <w:tcW w:type="dxa" w:w="1440"/>
-          </w:tcPr>
-          <w:p>
-            <w:pPr>
-              <w:spacing w:line="240" w:lineRule="auto"/>
-            </w:pPr>
-            <w:r>
-              <w:rPr>
-                <w:b w:val="0"/>
-                <w:i w:val="0"/>
-              </w:rPr>
-              <w:t>1 / 11 / 40</w:t>
-            </w:r>
-          </w:p>
-        </w:tc>
-        <w:tc>
-          <w:tcPr>
-            <w:tcW w:type="dxa" w:w="1440"/>
-          </w:tcPr>
-          <w:p>
-            <w:pPr>
-              <w:spacing w:line="240" w:lineRule="auto"/>
-            </w:pPr>
-            <w:r>
-              <w:rPr>
-                <w:b w:val="0"/>
-                <w:i w:val="0"/>
-              </w:rPr>
-              <w:t>0 / 4 / 24</w:t>
-            </w:r>
-          </w:p>
-        </w:tc>
-        <w:tc>
-          <w:tcPr>
-            <w:tcW w:type="dxa" w:w="1440"/>
-          </w:tcPr>
-          <w:p>
-            <w:pPr>
-              <w:spacing w:line="240" w:lineRule="auto"/>
-            </w:pPr>
-            <w:r>
-              <w:rPr>
-                <w:b w:val="0"/>
-                <w:i w:val="0"/>
-              </w:rPr>
-              <w:t>100 / 95 / 78 %</w:t>
-            </w:r>
-          </w:p>
-        </w:tc>
-        <w:tc>
-          <w:tcPr>
-            <w:tcW w:type="dxa" w:w="1440"/>
-          </w:tcPr>
-          <w:p>
-            <w:pPr>
-              <w:spacing w:line="240" w:lineRule="auto"/>
-            </w:pPr>
-            <w:r>
-              <w:rPr>
-                <w:b w:val="0"/>
-                <w:i w:val="0"/>
-              </w:rPr>
-              <w:t>0.52 / 0.77 / 0.86</w:t>
-            </w:r>
-          </w:p>
-        </w:tc>
-      </w:tr>
-    </w:tbl>
-    <w:p>
-      <w:r>
-        <w:rPr>
-          <w:b w:val="0"/>
-          <w:i/>
-        </w:rPr>
-        <w:t>Legend.</w:t>
-      </w:r>
-      <w:r>
-        <w:rPr>
-          <w:b w:val="0"/>
-          <w:i w:val="0"/>
-        </w:rPr>
-        <w:t xml:space="preserve"> Numbers after a method name are its identity thresholds, and the values in the other columns follow them in the same order. Groups, number of clusters or chunks; singletons, groups of one copy; copies in groups ≥ 10, share of the copies in groups of at least 10 copies; purity, fraction of those copies that carry the majority label of their group. SubFam rows are in bold.</w:t>
-      </w:r>
-    </w:p>
-    <w:p>
-      <w:r>
-        <w:rPr>
-          <w:b w:val="0"/>
-          <w:i w:val="0"/>
-        </w:rPr>
-        <w:t xml:space="preserve">With either tool, every cutoff on the old families gives one of two outcomes: a low cutoff merges across classes (L1 at 0.80: three groups hold 96 % of the copies at purity 0.36), a high cutoff fragments the set (B2 at 0.80: 1,906 of 3,000 copies are singletons). On the young Alu loci a working cutoff exists, and vsearch at 0.95 matches SubFam in purity (0.94 against 0.92) over 89 % of the copies; there SubFam adds completeness and the order. Caveats: purity favours small groups, hence the coverage column; the labels are annotations rather than truth; </w:t>
+        <w:t xml:space="preserve"> Rows, number of rows in the output; columns, alignment columns; lowest member identity, the identity of a chunk's least similar member to the most frequent bases of the chunk's core columns, averaged over the chunks (the </w:t>
       </w:r>
       <w:r>
         <w:rPr>
@@ -2947,51 +1561,14 @@
           <w:b w:val="0"/>
           <w:i w:val="0"/>
         </w:rPr>
-        <w:t>cluster_fast</w:t>
+        <w:t>id_min</w:t>
       </w:r>
       <w:r>
         <w:rPr>
           <w:b w:val="0"/>
           <w:i w:val="0"/>
         </w:rPr>
-        <w:t xml:space="preserve"> is greedy; each family is one chromosome. COSEG, run once on the Konkel loci, separated AluYb8 from the rest and left AluYa5 with AluY; at matched granularity it scored above SubFam's fixed chunks on V-measure, the chunks being over-split by design.</w:t>
-      </w:r>
-    </w:p>
-    <w:p>
-      <w:pPr>
-        <w:keepNext/>
-      </w:pPr>
-      <w:r>
-        <w:rPr>
-          <w:b/>
-          <w:i/>
-          <w:sz w:val="24"/>
-        </w:rPr>
-        <w:t>Simulation (Additional file 8)</w:t>
-      </w:r>
-    </w:p>
-    <w:p>
-      <w:r>
-        <w:rPr>
-          <w:b w:val="0"/>
-          <w:i w:val="0"/>
-        </w:rPr>
-        <w:t xml:space="preserve">Simulation supplies what real data withhold: a known truth across family ages. With eight subfamilies at 3, 8 and 15 % divergence (eight replicates each), SubFam </w:t>
-      </w:r>
-      <w:r>
-        <w:rPr>
-          <w:rFonts w:ascii="Courier New" w:hAnsi="Courier New"/>
-          <w:b w:val="0"/>
-          <w:i w:val="0"/>
-        </w:rPr>
-        <w:t>-n 20</w:t>
-      </w:r>
-      <w:r>
-        <w:rPr>
-          <w:b w:val="0"/>
-          <w:i w:val="0"/>
-        </w:rPr>
-        <w:t xml:space="preserve"> recovered all eight source consensuses in every run with 100 rows for 2,000 copies, whereas the VSEARCH identity that recovers the sources moved with age (0.90–0.95 for the young family, 0.70 for the old one), and even the best identity chosen per replicate with knowledge of the truth recovered 5.25 of 8 in the old family. In a harder simulation (CpG decay, source elements, mixed ages, truncated copies) SubFam recovered 6.3–7.8 of 8 at 100 rows with identity measured over non-CpG columns; over all columns, CpG decay keeps nearly every consensus of every method below 99 % identity to the master. In the simple simulation 10 of the 40 rows at N = 50 are distinct, an abundant subfamily filling several chunks with one consensus. Rows represent their copies closely in young and middle families and less closely in old ones (a copy's own row was its best-matching row for 98.1, 87.3 and 57.5 % of copies). The simulations are star-like and of our own design and serve as a supplement.</w:t>
+        <w:t xml:space="preserve"> column of SubFam's chunk statistics; no labels used); –, not applicable.</w:t>
       </w:r>
     </w:p>
     <w:p>
@@ -3013,7 +1590,7 @@
           <w:b w:val="0"/>
           <w:i w:val="0"/>
         </w:rPr>
-        <w:t>A readable, ordered alignment that stands for the collection, every row traceable to its copies, built without a cutoff and without a reference. The ablation locates the contribution in the combination of the steps rather than in any one of them, and in the fixed chunk, which trades redundancy (several rows for an abundant group) for freedom from a cutoff.</w:t>
+        <w:t>A readable, ordered alignment that stands for the collection, every row traceable to its copies, built without an identity cutoff and without a reference, in minutes for tens of thousands of copies. The published consensuses of the SINE examples appear among its rows, the lineages of a family appear as blocks, and old, highly diverged copies are shown as the mixture they are.</w:t>
       </w:r>
     </w:p>
     <w:p>
@@ -3065,21 +1642,21 @@
           <w:b w:val="0"/>
           <w:i w:val="0"/>
         </w:rPr>
-        <w:t xml:space="preserve">). Each of these is a method with its own test; this paper describes the preparation of their input. In our own analyses of SINE families the chunk consensuses served as the material from which subfamilies were delimited and their consensuses chosen </w:t>
+        <w:t xml:space="preserve">). Each of these is a method with its own test; SubFam prepares their input. In the author's analyses of SINE families the chunk consensuses served as the material from which subfamilies were delimited and their consensuses chosen </w:t>
       </w:r>
       <w:r>
         <w:rPr>
           <w:b w:val="0"/>
           <w:highlight w:val="yellow"/>
         </w:rPr>
-        <w:t>[AUTHOR: cite only the two or three papers whose Methods name SubFam; candidates: Vassetzky et al. 2021 (already cited for B2), Kosushkin et al. 2022 Can, Ustyantsev et al. 2024 Ere, Borodulina et al. 2025, Ustyantsev et al. 2026]</w:t>
+        <w:t>[AUTHOR: cite only the two or three papers whose Methods name SubFam; candidates: Vassetzky et al. 2021 (already cited as [16]</w:t>
       </w:r>
       <w:r>
         <w:rPr>
           <w:b w:val="0"/>
           <w:i w:val="0"/>
         </w:rPr>
-        <w:t>.</w:t>
+        <w:t>), Kosushkin et al. 2022 Can, Ustyantsev et al. 2024 Ere, Borodulina et al. 2025, Ustyantsev et al. 2026].</w:t>
       </w:r>
     </w:p>
     <w:p>
@@ -3092,7 +1669,7 @@
           <w:i/>
           <w:sz w:val="24"/>
         </w:rPr>
-        <w:t>Cascaded use</w:t>
+        <w:t>Use in rounds</w:t>
       </w:r>
     </w:p>
     <w:p>
@@ -3101,7 +1678,7 @@
           <w:b w:val="0"/>
           <w:i w:val="0"/>
         </w:rPr>
-        <w:t>When the copies come from subfamilies of different age and size, one N serves them unequally: a young, abundant subfamily fills many near-identical rows while an old or rare one is diluted across mixed chunks. SubFam can then be run in cascade with sequential depletion: the rows of a first run that the researcher recognises as one group are taken out together with their copies (</w:t>
+        <w:t>When the copies come from subfamilies of different age and size, one N serves them unequally: a young, abundant subfamily fills many near-identical rows while an old or rare one is diluted across mixed chunks. SubFam can then be run in rounds: the rows of a first run that the researcher recognises as one group are taken out together with their copies (</w:t>
       </w:r>
       <w:r>
         <w:rPr>
@@ -3116,7 +1693,7 @@
           <w:b w:val="0"/>
           <w:i w:val="0"/>
         </w:rPr>
-        <w:t xml:space="preserve"> gives the copies of chosen chunks; the remainder is the next input), and SubFam is run again on what is left with settings adjusted to it, a smaller N for the rare groups, </w:t>
+        <w:t xml:space="preserve"> writes the copies of chosen chunks; the remainder, built with any FASTA tool, is the next input), and SubFam is run again on what is left with settings adjusted to it, a smaller N for the rare groups, </w:t>
       </w:r>
       <w:r>
         <w:rPr>
@@ -3131,7 +1708,7 @@
           <w:b w:val="0"/>
           <w:i w:val="0"/>
         </w:rPr>
-        <w:t xml:space="preserve"> or a shared region for truncated ones, a different k for old ones. Each round keeps every copy accounted for, and the rows of all rounds can be aligned together at the end. This is a use of the tool, with the grouping decision made by the researcher between rounds.</w:t>
+        <w:t xml:space="preserve"> or a shared region for truncated ones. The rows of all rounds can be aligned together at the end. The grouping decision between rounds is the researcher's.</w:t>
       </w:r>
     </w:p>
     <w:p>
@@ -3153,7 +1730,7 @@
           <w:b w:val="0"/>
           <w:i w:val="0"/>
         </w:rPr>
-        <w:t>Identity clustering returns one representative per cluster and leaves the clusters unordered; COSEG and Price et al. define subfamilies on full-length copies aligned to one reference; TEtrimmer curates a library one family at a time from a genome; PASTA [20] and MAGUS [24] decompose a guide tree in order to align everything, where SubFam collapses the subsets and aligns the consensuses. Each answers a different question; SubFam serves as a step of input preparation for them, reducing a collection of copies to an ordered set of consensuses they can take.</w:t>
+        <w:t>Identity clustering returns one representative per cluster and leaves the clusters unordered; COSEG and Price et al. define subfamilies on copies that span a common window of one reference alignment (full-length copies in Price et al.); TEtrimmer curates a library one family at a time from a genome; PASTA [20] and MAGUS [23] decompose a guide tree in order to align everything, where SubFam collapses the subsets and aligns their consensuses. Each answers a different question. SubFam does not classify copies and is not meant to replace these tools; its ordered consensuses are a compact input for them and for the researcher.</w:t>
       </w:r>
     </w:p>
     <w:p>
@@ -3175,7 +1752,7 @@
           <w:b w:val="0"/>
           <w:i w:val="0"/>
         </w:rPr>
-        <w:t xml:space="preserve">A chunk has a fixed size: an abundant group fills several rows with near-identical consensuses, a chunk can straddle two groups, and N has to be chosen for the rarest group of interest. Rows represent old families less closely than young ones. The whole-copy k-mer distance responds to copy length, so mixed-length input (5′-truncated LINEs) sorts partly by length; the remedy is to run on the shared region or on the long copies. The k-mer ordering needs about 4·n² bytes of memory (3.6 GB at 30,000 copies); </w:t>
+        <w:t xml:space="preserve">A chunk has a fixed size: an abundant group fills several rows with near-identical consensuses, a chunk can straddle two groups, and N has to be chosen for the rarest group of interest. Rows of old, highly diverged copies are mixtures. The whole-copy k-mer distance responds to copy length, so mixed-length input (5′-truncated LINEs) sorts partly by length; the remedy is to run on the shared region or on the long copies. The k-mer ordering needs a matrix of 4·n² bytes (3.6 GB at 30,000 copies); </w:t>
       </w:r>
       <w:r>
         <w:rPr>
@@ -3190,7 +1767,7 @@
           <w:b w:val="0"/>
           <w:i w:val="0"/>
         </w:rPr>
-        <w:t xml:space="preserve"> lifts that limit at a cost in chunk purity (0.472 against 0.400 on real Alu). The labels used to score the examples are annotations or published consensuses, and each real example is one chromosome of one genome.</w:t>
+        <w:t xml:space="preserve"> needs far less memory at the cost of less similar chunk members. The annotation labels in the examples serve only to name and group the rows for the reader, and each real example comes from one genome.</w:t>
       </w:r>
     </w:p>
     <w:p>
@@ -3212,7 +1789,7 @@
           <w:b w:val="0"/>
           <w:i w:val="0"/>
         </w:rPr>
-        <w:t>SubFam turns a collection of related copies that is too large to read into a compact, ordered alignment of chunk consensuses, with every row traceable to its copies, built without an identity cutoff and without a reference. On real SINE and LINE copies the rows carry the known consensuses of the family and show its lineages as blocks; removing any step of the method loses the result, and identity clustering of the same copies either fragments old families or merges young groups. The output is the input that curation, subfamily definition and phylogenetic analysis need and cannot take from the raw copies; those steps, and the definition of subfamilies, remain the researcher's.</w:t>
+        <w:t>SubFam turns a collection of related copies that is too large to read into a compact, ordered alignment of chunk consensuses, with every row traceable to its copies, built without an identity cutoff and without a reference. On real SINE copies the published consensuses of each family appear among its rows and the lineages of a family appear as blocks; truncated LINE copies give rows that reach as far as their copies do. The output is a compact input for curation, subfamily definition and phylogenetic analysis, which are hard to apply to thousands of raw copies; those steps remain the researcher's.</w:t>
       </w:r>
     </w:p>
     <w:p>
@@ -3287,7 +1864,7 @@
           <w:b w:val="0"/>
           <w:i w:val="0"/>
         </w:rPr>
-        <w:t>; source code of SubFam 1.5.1 in Additional file 9</w:t>
+        <w:t>; source code of SubFam 1.5.1 in Additional file 7</w:t>
       </w:r>
     </w:p>
     <w:p>
@@ -3303,7 +1880,7 @@
           <w:b w:val="0"/>
           <w:i w:val="0"/>
         </w:rPr>
-        <w:t xml:space="preserve"> Linux, macOS (any Unix with bash)</w:t>
+        <w:t xml:space="preserve"> Linux (tested); other Unix systems with bash should work, but the free-memory check reads Linux's /proc/meminfo</w:t>
       </w:r>
     </w:p>
     <w:p>
@@ -3335,7 +1912,7 @@
           <w:b w:val="0"/>
           <w:i w:val="0"/>
         </w:rPr>
-        <w:t xml:space="preserve"> MAFFT ≥ 7.5; gawk or mawk; for the k-mer ordering a C compiler, or else Python ≥ 3.6 with numpy ≥ 1.20 (</w:t>
+        <w:t xml:space="preserve"> MAFFT ≥ 7 (7.505 tested); gawk or mawk; for the k-mer ordering a C compiler, or else Python ≥ 3.6 with numpy ≥ 1.20 (</w:t>
       </w:r>
       <w:r>
         <w:rPr>
@@ -3434,7 +2011,7 @@
           <w:b w:val="0"/>
           <w:i w:val="0"/>
         </w:rPr>
-        <w:t>CV: coefficient of variation; L1: LINE-1; LINE: long interspersed element; MSF: multiple sequence format; SINE: short interspersed element; UPGMA: unweighted pair group method with arithmetic mean</w:t>
+        <w:t>CV: coefficient of variation; L1: LINE-1; LINE: long interspersed element; MSF: multiple sequence format; SINE: short interspersed element; UCSC: University of California, Santa Cruz; UPGMA: unweighted pair group method with arithmetic mean</w:t>
       </w:r>
     </w:p>
     <w:p>
@@ -3509,7 +2086,7 @@
           <w:b w:val="0"/>
           <w:i w:val="0"/>
         </w:rPr>
-        <w:t xml:space="preserve">, and the example alignments are included within the article's additional files. Reproducibility: every example and benchmark is reproduced by </w:t>
+        <w:t xml:space="preserve">, and the example alignments are included within the article's additional files. Reproducibility: the examples are reproduced by </w:t>
       </w:r>
       <w:r>
         <w:rPr>
@@ -3547,36 +2124,6 @@
           <w:b w:val="0"/>
           <w:i w:val="0"/>
         </w:rPr>
-        <w:t>benchmark/baseline_vsearch/run_sweeps.sh</w:t>
-      </w:r>
-      <w:r>
-        <w:rPr>
-          <w:b w:val="0"/>
-          <w:i w:val="0"/>
-        </w:rPr>
-        <w:t xml:space="preserve">, </w:t>
-      </w:r>
-      <w:r>
-        <w:rPr>
-          <w:rFonts w:ascii="Courier New" w:hAnsi="Courier New"/>
-          <w:b w:val="0"/>
-          <w:i w:val="0"/>
-        </w:rPr>
-        <w:t>benchmark/baseline_meshclust/run_meshclust.sh</w:t>
-      </w:r>
-      <w:r>
-        <w:rPr>
-          <w:b w:val="0"/>
-          <w:i w:val="0"/>
-        </w:rPr>
-        <w:t xml:space="preserve">, </w:t>
-      </w:r>
-      <w:r>
-        <w:rPr>
-          <w:rFonts w:ascii="Courier New" w:hAnsi="Courier New"/>
-          <w:b w:val="0"/>
-          <w:i w:val="0"/>
-        </w:rPr>
         <w:t>benchmark/ablation/run_ablation.sh</w:t>
       </w:r>
       <w:r>
@@ -3592,6 +2139,21 @@
           <w:b w:val="0"/>
           <w:i w:val="0"/>
         </w:rPr>
+        <w:t>run_scale.sh</w:t>
+      </w:r>
+      <w:r>
+        <w:rPr>
+          <w:b w:val="0"/>
+          <w:i w:val="0"/>
+        </w:rPr>
+        <w:t xml:space="preserve">, </w:t>
+      </w:r>
+      <w:r>
+        <w:rPr>
+          <w:rFonts w:ascii="Courier New" w:hAnsi="Courier New"/>
+          <w:b w:val="0"/>
+          <w:i w:val="0"/>
+        </w:rPr>
         <w:t>benchmark/sine_b2/stress_chr123/pipeline.sh</w:t>
       </w:r>
       <w:r>
@@ -3599,7 +2161,52 @@
           <w:b w:val="0"/>
           <w:i w:val="0"/>
         </w:rPr>
-        <w:t xml:space="preserve"> from named public inputs, seeds and tool versions (MAFFT 7.505, vsearch 2.27.0, MeShClust2 d7fdb42; SubFam 1.3.0–1.5.1; on the regression input the consensuses, alignment, chunk table and chunk files are byte-identical in 1.4.2–1.5.0, and 1.5.1 changes only the input checks and messages). Genome data: UCSC mm39 and hg38 (RepeatMasker tables and chromosome sequences) [14]; Dfam release 4.0 consensuses [12]; Price et al. [6] consensuses from that paper's supplement; Konkel et al. [19] loci from GenBank KT305395–KT305737.</w:t>
+        <w:t xml:space="preserve"> and </w:t>
+      </w:r>
+      <w:r>
+        <w:rPr>
+          <w:rFonts w:ascii="Courier New" w:hAnsi="Courier New"/>
+          <w:b w:val="0"/>
+          <w:i w:val="0"/>
+        </w:rPr>
+        <w:t>seeds.sh</w:t>
+      </w:r>
+      <w:r>
+        <w:rPr>
+          <w:b w:val="0"/>
+          <w:i w:val="0"/>
+        </w:rPr>
+        <w:t xml:space="preserve">, </w:t>
+      </w:r>
+      <w:r>
+        <w:rPr>
+          <w:rFonts w:ascii="Courier New" w:hAnsi="Courier New"/>
+          <w:b w:val="0"/>
+          <w:i w:val="0"/>
+        </w:rPr>
+        <w:t>benchmark/alu_hg38/run_chr1_30k.sh</w:t>
+      </w:r>
+      <w:r>
+        <w:rPr>
+          <w:b w:val="0"/>
+          <w:i w:val="0"/>
+        </w:rPr>
+        <w:t xml:space="preserve"> and the scripts in </w:t>
+      </w:r>
+      <w:r>
+        <w:rPr>
+          <w:rFonts w:ascii="Courier New" w:hAnsi="Courier New"/>
+          <w:b w:val="0"/>
+          <w:i w:val="0"/>
+        </w:rPr>
+        <w:t>benchmark/alu_konkel/</w:t>
+      </w:r>
+      <w:r>
+        <w:rPr>
+          <w:b w:val="0"/>
+          <w:i w:val="0"/>
+        </w:rPr>
+        <w:t>, from named public inputs, seeds and tool versions (MAFFT 7.505; SubFam 1.3.0–1.5.1; on the regression input the consensuses, alignment, chunk table and chunk files are byte-identical in 1.4.2–1.5.0, and 1.5.1 changes only the input checks and messages). Genome data: UCSC mm39 and hg38 (RepeatMasker tables and chromosome sequences) [14]; Dfam release 4.0 consensuses [12]; Price et al. [6] consensuses from that paper's supplement; Konkel et al. [19] loci from GenBank KT305395–KT305737.</w:t>
       </w:r>
     </w:p>
     <w:p>
@@ -3622,7 +2229,7 @@
           <w:b w:val="0"/>
           <w:highlight w:val="yellow"/>
         </w:rPr>
-        <w:t>[AUTHOR: "The author declares no competing interests." — note that the author co-authored the B2 classification of Vassetzky et al. 2021 used in the supplement.]</w:t>
+        <w:t>[AUTHOR: "The author declares no competing interests." — note that the author co-authored the B2 classification of Vassetzky et al. 2021 used to colour Figure 2.]</w:t>
       </w:r>
     </w:p>
     <w:p>
@@ -3911,16 +2518,7 @@
           <w:b w:val="0"/>
           <w:i w:val="0"/>
         </w:rPr>
-        <w:t>23. James BT, Girgis HZ. MeShClust2: application of alignment-free identity scores in clustering long DNA sequences. bioRxiv. 2018. doi:10.1101/451278. [Preprint]</w:t>
-      </w:r>
-    </w:p>
-    <w:p>
-      <w:r>
-        <w:rPr>
-          <w:b w:val="0"/>
-          <w:i w:val="0"/>
-        </w:rPr>
-        <w:t>24. Smirnov V, Warnow T. MAGUS: Multiple sequence Alignment using Graph clUStering. Bioinformatics. 2021;37(12):1666–72. doi:10.1093/bioinformatics/btaa992.</w:t>
+        <w:t>23. Smirnov V, Warnow T. MAGUS: Multiple sequence Alignment using Graph clUStering. Bioinformatics. 2021;37(12):1666–72. doi:10.1093/bioinformatics/btaa992.</w:t>
       </w:r>
     </w:p>
     <w:p>
@@ -3958,7 +2556,7 @@
           <w:b w:val="0"/>
           <w:i w:val="0"/>
         </w:rPr>
-        <w:t>The 60 chunk consensuses (N = 50) of 3,000 B2, B3 and B3A copies of mm39 chr19, grouped by the RepeatMasker class of each chunk's majority, with the consensus of the class's member copies and the Dfam consensus as the head rows of each group (framed). Grey, the majority base of the SubFam rows in the column; red, another base; white, gap. The purity of each row (fraction of its copies in the majority class) is given at the right.</w:t>
+        <w:t>The 60 chunk consensuses (N = 50) of 3,000 B2, B3 and B3A copies of mm39 chr19, grouped for the reader by the most common RepeatMasker class of each chunk's copies, with the consensus of the class's copies and the Dfam consensus as the head rows of each group (framed). Grey, the majority base of the SubFam rows in the column; red, another base; white, gap. The share of each row's copies in its class is given at the right.</w:t>
       </w:r>
     </w:p>
     <w:p>
@@ -3998,7 +2596,7 @@
           <w:b w:val="0"/>
           <w:i w:val="0"/>
         </w:rPr>
-        <w:t>), with the majority label and purity of each chunk at the right. Copies and consensuses are one MAFFT alignment, of which the 220 of 1,105 columns present in at least 25 % of the copies are shown. Light grey, the majority base of the column among the copies; red, another base; white, gap. The strip at the left gives the label of each copy (a, b) or the majority label of each chunk (c).</w:t>
+        <w:t>), with the most common label of each chunk and its share at the right. Copies and consensuses are one MAFFT alignment, of which the columns present in at least 25 % of the copies are shown. Light grey, the majority base of the column among the copies; red, another base; white, gap. The strip at the left gives the label of each copy (a, b) or the most common label of each chunk (c).</w:t>
       </w:r>
     </w:p>
     <w:p>
@@ -4027,7 +2625,7 @@
           <w:b w:val="0"/>
           <w:i w:val="0"/>
         </w:rPr>
-        <w:t xml:space="preserve"> (ZIP of FASTA files). Example alignments. The SubFam alignments of the examples (B2 3,000 and 30,000 copies, L1PA2–L1PA8, Alu loci) with class and published consensuses, and the identity of every row to the head of its group.</w:t>
+        <w:t xml:space="preserve"> (ZIP of FASTA files). Example alignments. The SubFam alignments of the examples (B2 3,000 and 30,000 copies, L1PA2–L1PA8, Alu loci), with class and published consensuses as heads where available, and the identity of every row to the head of its group.</w:t>
       </w:r>
     </w:p>
     <w:p>
@@ -4037,22 +2635,6 @@
           <w:i w:val="0"/>
         </w:rPr>
         <w:t>Additional file 2</w:t>
-      </w:r>
-      <w:r>
-        <w:rPr>
-          <w:b w:val="0"/>
-          <w:i w:val="0"/>
-        </w:rPr>
-        <w:t xml:space="preserve"> (PDF). Two classifications of the B2 family compared. The SubFam rows of the B2 example set against the Repbase subfamily names and against the indel-based classification of Vassetzky et al. [16].</w:t>
-      </w:r>
-    </w:p>
-    <w:p>
-      <w:r>
-        <w:rPr>
-          <w:b/>
-          <w:i w:val="0"/>
-        </w:rPr>
-        <w:t>Additional file 3</w:t>
       </w:r>
       <w:r>
         <w:rPr>
@@ -4083,7 +2665,7 @@
           <w:b/>
           <w:i w:val="0"/>
         </w:rPr>
-        <w:t>Additional file 4</w:t>
+        <w:t>Additional file 3</w:t>
       </w:r>
       <w:r>
         <w:rPr>
@@ -4099,7 +2681,7 @@
           <w:b/>
           <w:i w:val="0"/>
         </w:rPr>
-        <w:t>Additional file 5</w:t>
+        <w:t>Additional file 4</w:t>
       </w:r>
       <w:r>
         <w:rPr>
@@ -4130,14 +2712,14 @@
           <w:b/>
           <w:i w:val="0"/>
         </w:rPr>
-        <w:t>Additional file 6</w:t>
+        <w:t>Additional file 5</w:t>
       </w:r>
       <w:r>
         <w:rPr>
           <w:b w:val="0"/>
           <w:i w:val="0"/>
         </w:rPr>
-        <w:t xml:space="preserve"> (CSV). Stress case. 30,000 B2 and 30,000 Alu copies: time, memory, chunk purity and recovery of published consensuses, with and without </w:t>
+        <w:t xml:space="preserve"> (CSV). 30,000 copies. 30,000 B2 and 30,000 Alu copies: time, memory, label-free chunk statistics and the published consensuses found among the rows, with and without </w:t>
       </w:r>
       <w:r>
         <w:rPr>
@@ -4161,14 +2743,14 @@
           <w:b/>
           <w:i w:val="0"/>
         </w:rPr>
-        <w:t>Additional file 7</w:t>
+        <w:t>Additional file 6</w:t>
       </w:r>
       <w:r>
         <w:rPr>
           <w:b w:val="0"/>
           <w:i w:val="0"/>
         </w:rPr>
-        <w:t xml:space="preserve"> (PDF). The 600 rows of the 30,000-copy B2 run. Rows in SubFam order; the strip gives the RepeatMasker class of each chunk's majority.</w:t>
+        <w:t xml:space="preserve"> (PDF). The 600 rows of the 30,000-copy B2 run. Rows in chunk order; the strip gives the most common RepeatMasker class of each chunk's copies.</w:t>
       </w:r>
     </w:p>
     <w:p>
@@ -4177,53 +2759,7 @@
           <w:b/>
           <w:i w:val="0"/>
         </w:rPr>
-        <w:t>Additional file 8</w:t>
-      </w:r>
-      <w:r>
-        <w:rPr>
-          <w:b w:val="0"/>
-          <w:i w:val="0"/>
-        </w:rPr>
-        <w:t xml:space="preserve"> (PDF). Simulation and sensitivity. (a) Simulated families of eight subfamilies at 3, 8 and 15 % divergence (2,000 copies, eight replicates each): subfamily sources recovered (of 8; a source counts when a row whose copies are mostly that subfamily matches it at ≥ 99 % identity) by VSEARCH at each identity threshold (mean, range shaded) and by SubFam </w:t>
-      </w:r>
-      <w:r>
-        <w:rPr>
-          <w:rFonts w:ascii="Courier New" w:hAnsi="Courier New"/>
-          <w:b w:val="0"/>
-          <w:i w:val="0"/>
-        </w:rPr>
-        <w:t>-n 20</w:t>
-      </w:r>
-      <w:r>
-        <w:rPr>
-          <w:b w:val="0"/>
-          <w:i w:val="0"/>
-        </w:rPr>
-        <w:t xml:space="preserve"> and </w:t>
-      </w:r>
-      <w:r>
-        <w:rPr>
-          <w:rFonts w:ascii="Courier New" w:hAnsi="Courier New"/>
-          <w:b w:val="0"/>
-          <w:i w:val="0"/>
-        </w:rPr>
-        <w:t>-n 50</w:t>
-      </w:r>
-      <w:r>
-        <w:rPr>
-          <w:b w:val="0"/>
-          <w:i w:val="0"/>
-        </w:rPr>
-        <w:t xml:space="preserve"> (dashed lines, mean). (b) The number of rows each method returns (median, log scale). (c) Chunk purity against the RepeatMasker class on the 3,000 real B2 copies over N (k = 6) and over k (N = 50); red bars, four random samples of the copies at N = 50.</w:t>
-      </w:r>
-    </w:p>
-    <w:p>
-      <w:r>
-        <w:rPr>
-          <w:b/>
-          <w:i w:val="0"/>
-        </w:rPr>
-        <w:t>Additional file 9</w:t>
+        <w:t>Additional file 7</w:t>
       </w:r>
       <w:r>
         <w:rPr>

</xml_diff>

<commit_message>
v9: prior use of SubFam cited (5 papers whose Methods name it: refs 16, 23-26; MAGUS now 27); Figure 2 redrawn without chunk shares, column count logged; legends updated
Co-Authored-By: Claude Opus 5.5 <noreply@anthropic.com>
</commit_message>
<xml_diff>
--- a/docs/submission/SubFam_BMC_Bioinformatics_manuscript.docx
+++ b/docs/submission/SubFam_BMC_Bioinformatics_manuscript.docx
@@ -1642,21 +1642,22 @@
           <w:b w:val="0"/>
           <w:i w:val="0"/>
         </w:rPr>
-        <w:t xml:space="preserve">). Each of these is a method with its own test; SubFam prepares their input. In the author's analyses of SINE families the chunk consensuses served as the material from which subfamilies were delimited and their consensuses chosen </w:t>
+        <w:t xml:space="preserve">). Each of these is a method with its own test; SubFam prepares their input. Earlier versions of SubFam, which ordered the copies with MAFFT's guide tree (now </w:t>
       </w:r>
       <w:r>
         <w:rPr>
+          <w:rFonts w:ascii="Courier New" w:hAnsi="Courier New"/>
           <w:b w:val="0"/>
-          <w:highlight w:val="yellow"/>
+          <w:i w:val="0"/>
         </w:rPr>
-        <w:t>[AUTHOR: cite only the two or three papers whose Methods name SubFam; candidates: Vassetzky et al. 2021 (already cited as [16]</w:t>
+        <w:t>-m</w:t>
       </w:r>
       <w:r>
         <w:rPr>
           <w:b w:val="0"/>
           <w:i w:val="0"/>
         </w:rPr>
-        <w:t>), Kosushkin et al. 2022 Can, Ustyantsev et al. 2024 Ere, Borodulina et al. 2025, Ustyantsev et al. 2026].</w:t>
+        <w:t>) and used chunks of 50–100 copies, have served to delimit subfamilies in studies of SINE families of mammals and reptiles [16, 23–26].</w:t>
       </w:r>
     </w:p>
     <w:p>
@@ -1730,7 +1731,7 @@
           <w:b w:val="0"/>
           <w:i w:val="0"/>
         </w:rPr>
-        <w:t>Identity clustering returns one representative per cluster and leaves the clusters unordered; COSEG and Price et al. define subfamilies on copies that span a common window of one reference alignment (full-length copies in Price et al.); TEtrimmer curates a library one family at a time from a genome; PASTA [20] and MAGUS [23] decompose a guide tree in order to align everything, where SubFam collapses the subsets and aligns their consensuses. Each answers a different question. SubFam does not classify copies and is not meant to replace these tools; its ordered consensuses are a compact input for them and for the researcher.</w:t>
+        <w:t>Identity clustering returns one representative per cluster and leaves the clusters unordered; COSEG and Price et al. define subfamilies on copies that span a common window of one reference alignment (full-length copies in Price et al.); TEtrimmer curates a library one family at a time from a genome; PASTA [20] and MAGUS [27] decompose a guide tree in order to align everything, where SubFam collapses the subsets and aligns their consensuses. Each answers a different question. SubFam does not classify copies and is not meant to replace these tools; its ordered consensuses are a compact input for them and for the researcher.</w:t>
       </w:r>
     </w:p>
     <w:p>
@@ -2518,7 +2519,43 @@
           <w:b w:val="0"/>
           <w:i w:val="0"/>
         </w:rPr>
-        <w:t>23. Smirnov V, Warnow T. MAGUS: Multiple sequence Alignment using Graph clUStering. Bioinformatics. 2021;37(12):1666–72. doi:10.1093/bioinformatics/btaa992.</w:t>
+        <w:t>23. Kosushkin SA, Ustyantsev IG, Borodulina OR, Vassetzky NS, Kramerov DA. Tail wags dog's SINE: retropositional mechanisms of Can SINE depend on its A-tail structure. Biology (Basel). 2022;11(10):1403. doi:10.3390/biology11101403.</w:t>
+      </w:r>
+    </w:p>
+    <w:p>
+      <w:r>
+        <w:rPr>
+          <w:b w:val="0"/>
+          <w:i w:val="0"/>
+        </w:rPr>
+        <w:t>24. Vassetzky NS, Kosushkin SA, Ryskov AP. SINE-derived satellites in scaled reptiles. Mob DNA. 2023;14(1):21. doi:10.1186/s13100-023-00309-2.</w:t>
+      </w:r>
+    </w:p>
+    <w:p>
+      <w:r>
+        <w:rPr>
+          <w:b w:val="0"/>
+          <w:i w:val="0"/>
+        </w:rPr>
+        <w:t>25. Ustyantsev IG, Kosushkin SA, Borodulina OR, Vassetzky NS, Kramerov DA. Ere, a family of short interspersed elements in the genomes of odd-toed ungulates (Perissodactyla). Animals (Basel). 2024;14(13):1982. doi:10.3390/ani14131982.</w:t>
+      </w:r>
+    </w:p>
+    <w:p>
+      <w:r>
+        <w:rPr>
+          <w:b w:val="0"/>
+          <w:i w:val="0"/>
+        </w:rPr>
+        <w:t>26. Ustyantsev IG, Kosushkin SA, Kramerov DA, Stasenko DV, Borodulina OR. Family C of short interspersed elements in the genomes of lagomorphs: structure, evolution, transcription and transcript polyadenylation. Animals (Basel). 2026;16(5):765. doi:10.3390/ani16050765.</w:t>
+      </w:r>
+    </w:p>
+    <w:p>
+      <w:r>
+        <w:rPr>
+          <w:b w:val="0"/>
+          <w:i w:val="0"/>
+        </w:rPr>
+        <w:t>27. Smirnov V, Warnow T. MAGUS: Multiple sequence Alignment using Graph clUStering. Bioinformatics. 2021;37(12):1666–72. doi:10.1093/bioinformatics/btaa992.</w:t>
       </w:r>
     </w:p>
     <w:p>
@@ -2556,7 +2593,7 @@
           <w:b w:val="0"/>
           <w:i w:val="0"/>
         </w:rPr>
-        <w:t>The 60 chunk consensuses (N = 50) of 3,000 B2, B3 and B3A copies of mm39 chr19, grouped for the reader by the most common RepeatMasker class of each chunk's copies, with the consensus of the class's copies and the Dfam consensus as the head rows of each group (framed). Grey, the majority base of the SubFam rows in the column; red, another base; white, gap. The share of each row's copies in its class is given at the right.</w:t>
+        <w:t>The 60 chunk consensuses (N = 50) of 3,000 B2, B3 and B3A copies of mm39 chr19, grouped for the reader by the most common RepeatMasker class of each chunk's copies, with the consensus of the class's copies and the Dfam consensus as the head rows of each group (framed). Grey, the majority base of the SubFam rows in the column; red, another base; white, gap.</w:t>
       </w:r>
     </w:p>
     <w:p>
@@ -2596,7 +2633,7 @@
           <w:b w:val="0"/>
           <w:i w:val="0"/>
         </w:rPr>
-        <w:t>), with the most common label of each chunk and its share at the right. Copies and consensuses are one MAFFT alignment, of which the columns present in at least 25 % of the copies are shown. Light grey, the majority base of the column among the copies; red, another base; white, gap. The strip at the left gives the label of each copy (a, b) or the most common label of each chunk (c).</w:t>
+        <w:t>), with the most common label of each chunk at the right. Copies and consensuses are one MAFFT alignment, of which the 220 of 1,105 columns present in at least 25 % of the copies are shown. Light grey, the majority base of the column among the copies; red, another base; white, gap. The strip at the left gives the label of each copy (a, b) or the most common label of each chunk (c).</w:t>
       </w:r>
     </w:p>
     <w:p>

</xml_diff>

<commit_message>
v9: input preparation result (flanks and input order) in Results, abstract and Additional file 8
Co-Authored-By: Claude Opus 5.5 <noreply@anthropic.com>
</commit_message>
<xml_diff>
--- a/docs/submission/SubFam_BMC_Bioinformatics_manuscript.docx
+++ b/docs/submission/SubFam_BMC_Bioinformatics_manuscript.docx
@@ -122,7 +122,7 @@
           <w:b w:val="0"/>
           <w:i w:val="0"/>
         </w:rPr>
-        <w:t xml:space="preserve"> SubFam is a command-line utility that produces this view. It orders the copies along a k-mer guide tree, cuts the order into chunks of N neighbouring copies, aligns each chunk, calls a plurality consensus for each chunk and aligns the consensuses. The output is an alignment of chunk consensuses ordered by similarity, with a table of the copies behind every row. It needs neither a reference nor an identity cutoff, and its main parameter is N, the number of copies per row. A family of up to millions of copies can be run on a random sample: at the default N, about 30,000 copies give some 600 rows, which a reader can still take in at once. On mouse B2 and human Alu SINEs the published consensuses of the family appear among the rows and on B2 the lineages of the family form blocks of rows; on 5′-truncated human LINE-1 copies the rows extend as far as their copies do. Without the ordering, chunks mix dissimilar copies. Every row traces back to its member copies, which SubFam can write out for further work. The consensus writer reproduces EMBOSS cons byte for byte, and the output does not depend on the number of threads.</w:t>
+        <w:t xml:space="preserve"> SubFam is a command-line utility that produces this view. It orders the copies along a k-mer guide tree, cuts the order into chunks of N neighbouring copies, aligns each chunk, calls a plurality consensus for each chunk and aligns the consensuses. The output is an alignment of chunk consensuses ordered by similarity, with a table of the copies behind every row. It needs neither a reference nor an identity cutoff, and its main parameter is N, the number of copies per row. A family of up to millions of copies can be run on a random sample: at the default N, about 30,000 copies give some 600 rows, which a reader can still take in at once. On mouse B2 and human Alu SINEs the published consensuses of the family appear among the rows and on B2 the lineages of the family form blocks of rows; on 5′-truncated human LINE-1 copies the rows extend as far as their copies do. The rows stand when the copies carry short flanks or come in another order. Without the ordering, chunks mix dissimilar copies. Every row traces back to its member copies, which SubFam can write out for further work. The consensus writer reproduces EMBOSS cons byte for byte, and the output does not depend on the number of threads.</w:t>
       </w:r>
     </w:p>
     <w:p>
@@ -515,7 +515,7 @@
           <w:b w:val="0"/>
           <w:i w:val="0"/>
         </w:rPr>
-        <w:t xml:space="preserve">: 3,600 consensus runs and 80 MSF files, no difference). The distance matrix agrees with a brute-force computation, and the C and Python orderings give byte-identical orders on 292 synthetic cases. Output is byte-identical across runs and thread counts; 26 robustness cases (awkward or malformed inputs, determinism) either keep every input record or stop with a message, and </w:t>
+        <w:t xml:space="preserve">: 3,600 consensus runs and 80 MSF files, no difference). The distance matrix agrees with a brute-force computation, and the C and Python orderings give byte-identical orders on 292 synthetic cases. For the same input file, output is byte-identical across runs and thread counts; a different input order gives a different, equivalent set of rows (Results, Input preparation); 26 robustness cases (awkward or malformed inputs, determinism) either keep every input record or stop with a message, and </w:t>
       </w:r>
       <w:r>
         <w:rPr>
@@ -882,6 +882,28 @@
           <w:i w:val="0"/>
         </w:rPr>
         <w:t>). Among them, 25 of the 26 Dfam human Alu families with 50 or more expected copies in the sample are present at ≥ 0.95 identity (median best identity 0.994), and all 74 Price et al. [6] subfamilies with 50 or more expected copies; of the rarer Price subfamilies, 88 of 90 with 10–50 expected copies and 45 of 49 with fewer are present. Presence falls with the expected copy number, as a group needs about N copies in the sample.</w:t>
+      </w:r>
+    </w:p>
+    <w:p>
+      <w:pPr>
+        <w:keepNext/>
+      </w:pPr>
+      <w:r>
+        <w:rPr>
+          <w:b/>
+          <w:i/>
+          <w:sz w:val="24"/>
+        </w:rPr>
+        <w:t>Input preparation (Additional file 8)</w:t>
+      </w:r>
+    </w:p>
+    <w:p>
+      <w:r>
+        <w:rPr>
+          <w:b w:val="0"/>
+          <w:i w:val="0"/>
+        </w:rPr>
+        <w:t>Copies reach SubFam in different states: cut exactly to the element, or with some of their own flanking sequence. The 3,000 B2 copies of Example 1 were cut again with 25, 100 and 500 bp of their genomic flank on each side (the element part identical in every copy) and compared with the element-only run, against the variation that a different input order alone produces. With 25 or 100 bp flanks, 36 and 37 of the 60 element-only rows recur at ≥ 0.95 identity among the new rows, as with two shuffled input orders (47 and 36), and the published consensuses of the family (Dfam and Vassetzky et al. [16]) are found among the rows at the same identities as without flanks (for example B2c 0.994 without flanks, 0.979 and 0.969 with them). Which copies share a chunk changes more than the rows do: the flanks add unique k-mers, the order shifts, and the windows cut elsewhere but yield the same consensuses. With 500 bp flanks, five times the element on each side, the flanks dominate the k-mer distance: 23 of the 60 rows recur, and the rows of the old subfamilies move away from their published consensuses (B2c 0.882). Long flanks should therefore be trimmed before the run.</w:t>
       </w:r>
     </w:p>
     <w:p>
@@ -2192,7 +2214,37 @@
           <w:b w:val="0"/>
           <w:i w:val="0"/>
         </w:rPr>
-        <w:t xml:space="preserve"> and the scripts in </w:t>
+        <w:t xml:space="preserve">, </w:t>
+      </w:r>
+      <w:r>
+        <w:rPr>
+          <w:rFonts w:ascii="Courier New" w:hAnsi="Courier New"/>
+          <w:b w:val="0"/>
+          <w:i w:val="0"/>
+        </w:rPr>
+        <w:t>benchmark/flanks/flanks.sh</w:t>
+      </w:r>
+      <w:r>
+        <w:rPr>
+          <w:b w:val="0"/>
+          <w:i w:val="0"/>
+        </w:rPr>
+        <w:t xml:space="preserve"> and </w:t>
+      </w:r>
+      <w:r>
+        <w:rPr>
+          <w:rFonts w:ascii="Courier New" w:hAnsi="Courier New"/>
+          <w:b w:val="0"/>
+          <w:i w:val="0"/>
+        </w:rPr>
+        <w:t>flanks2.sh</w:t>
+      </w:r>
+      <w:r>
+        <w:rPr>
+          <w:b w:val="0"/>
+          <w:i w:val="0"/>
+        </w:rPr>
+        <w:t xml:space="preserve">, and the scripts in </w:t>
       </w:r>
       <w:r>
         <w:rPr>
@@ -2818,6 +2870,22 @@
           <w:i w:val="0"/>
         </w:rPr>
         <w:t>.</w:t>
+      </w:r>
+    </w:p>
+    <w:p>
+      <w:r>
+        <w:rPr>
+          <w:b/>
+          <w:i w:val="0"/>
+        </w:rPr>
+        <w:t>Additional file 8</w:t>
+      </w:r>
+      <w:r>
+        <w:rPr>
+          <w:b w:val="0"/>
+          <w:i w:val="0"/>
+        </w:rPr>
+        <w:t xml:space="preserve"> (CSV). Input preparation. The 3,000 B2 copies of Example 1 without flanks, in two shuffled input orders, and with 25, 100 and 500 bp of their own flank on each side: copy pairs kept in the same chunk, element-only rows recurring at ≥ 0.95 identity, and the best identity of each Dfam and Vassetzky et al. [16] consensus among the rows.</w:t>
       </w:r>
     </w:p>
     <w:sectPr>

</xml_diff>

<commit_message>
v9: Additional files renumbered by first citation (7 input preparation, 8 source code)
Co-Authored-By: Claude Opus 5.5 <noreply@anthropic.com>
</commit_message>
<xml_diff>
--- a/docs/submission/SubFam_BMC_Bioinformatics_manuscript.docx
+++ b/docs/submission/SubFam_BMC_Bioinformatics_manuscript.docx
@@ -894,7 +894,7 @@
           <w:i/>
           <w:sz w:val="24"/>
         </w:rPr>
-        <w:t>Input preparation (Additional file 8)</w:t>
+        <w:t>Input preparation (Additional file 7)</w:t>
       </w:r>
     </w:p>
     <w:p>
@@ -1887,7 +1887,7 @@
           <w:b w:val="0"/>
           <w:i w:val="0"/>
         </w:rPr>
-        <w:t>; source code of SubFam 1.5.1 in Additional file 7</w:t>
+        <w:t>; source code of SubFam 1.5.1 in Additional file 8</w:t>
       </w:r>
     </w:p>
     <w:p>
@@ -2855,6 +2855,22 @@
           <w:b w:val="0"/>
           <w:i w:val="0"/>
         </w:rPr>
+        <w:t xml:space="preserve"> (CSV). Input preparation. The 3,000 B2 copies of Example 1 without flanks, in two shuffled input orders, and with 25, 100 and 500 bp of their own flank on each side: copy pairs kept in the same chunk, element-only rows recurring at ≥ 0.95 identity, and the best identity of each Dfam and Vassetzky et al. [16] consensus among the rows.</w:t>
+      </w:r>
+    </w:p>
+    <w:p>
+      <w:r>
+        <w:rPr>
+          <w:b/>
+          <w:i w:val="0"/>
+        </w:rPr>
+        <w:t>Additional file 8</w:t>
+      </w:r>
+      <w:r>
+        <w:rPr>
+          <w:b w:val="0"/>
+          <w:i w:val="0"/>
+        </w:rPr>
         <w:t xml:space="preserve"> (ZIP). Source code of SubFam 1.5.1, as archived </w:t>
       </w:r>
       <w:r>
@@ -2870,22 +2886,6 @@
           <w:i w:val="0"/>
         </w:rPr>
         <w:t>.</w:t>
-      </w:r>
-    </w:p>
-    <w:p>
-      <w:r>
-        <w:rPr>
-          <w:b/>
-          <w:i w:val="0"/>
-        </w:rPr>
-        <w:t>Additional file 8</w:t>
-      </w:r>
-      <w:r>
-        <w:rPr>
-          <w:b w:val="0"/>
-          <w:i w:val="0"/>
-        </w:rPr>
-        <w:t xml:space="preserve"> (CSV). Input preparation. The 3,000 B2 copies of Example 1 without flanks, in two shuffled input orders, and with 25, 100 and 500 bp of their own flank on each side: copy pairs kept in the same chunk, element-only rows recurring at ≥ 0.95 identity, and the best identity of each Dfam and Vassetzky et al. [16] consensus among the rows.</w:t>
       </w:r>
     </w:p>
     <w:sectPr>

</xml_diff>

<commit_message>
v9: a row condenses its copies (private mutations drop out, shared bases remain); copies 0.817 vs rows 0.936 to nearest V2021 consensus
Co-Authored-By: Claude Opus 5.5 <noreply@anthropic.com>
</commit_message>
<xml_diff>
--- a/docs/submission/SubFam_BMC_Bioinformatics_manuscript.docx
+++ b/docs/submission/SubFam_BMC_Bioinformatics_manuscript.docx
@@ -8,7 +8,7 @@
           <w:b/>
           <w:sz w:val="32"/>
         </w:rPr>
-        <w:t>SubFam: a compact, ordered alignment of consensus sequences in place of thousands of repeat copies</w:t>
+        <w:t>SubFam: a compact, ordered alignment of consensus sequences that condenses thousands of repeat copies</w:t>
       </w:r>
     </w:p>
     <w:p>
@@ -106,7 +106,7 @@
           <w:b w:val="0"/>
           <w:i w:val="0"/>
         </w:rPr>
-        <w:t xml:space="preserve"> A transposable-element family, a satellite array or a multigene family can hold thousands to millions of related copies at every degree of divergence. Such a collection is too large to read in an alignment viewer and too large for many of the tools that follow, such as aligners, tree builders and library curation. Researchers who study repeat families need a compact view of the copies that keeps their variation and leads back to every copy.</w:t>
+        <w:t xml:space="preserve"> A transposable-element family, a satellite array or a multigene family can hold thousands to millions of related copies at every degree of divergence. Such a collection is too large to read in an alignment viewer and for many downstream tools. Researchers need a compact view of the copies that keeps the variation shared by groups of copies and leads back to every copy.</w:t>
       </w:r>
     </w:p>
     <w:p>
@@ -122,7 +122,7 @@
           <w:b w:val="0"/>
           <w:i w:val="0"/>
         </w:rPr>
-        <w:t xml:space="preserve"> SubFam is a command-line utility that produces this view. It orders the copies along a k-mer guide tree, cuts the order into chunks of N neighbouring copies, aligns each chunk, calls a plurality consensus for each chunk and aligns the consensuses. The output is an alignment of chunk consensuses ordered by similarity, with a table of the copies behind every row. It needs neither a reference nor an identity cutoff, and its main parameter is N, the number of copies per row. A family of up to millions of copies can be run on a random sample: at the default N, about 30,000 copies give some 600 rows, which a reader can still take in at once. On mouse B2 and human Alu SINEs the published consensuses of the family appear among the rows and on B2 the lineages of the family form blocks of rows; on 5′-truncated human LINE-1 copies the rows extend as far as their copies do. The rows stand when the copies carry short flanks or come in another order. Without the ordering, chunks mix dissimilar copies. Every row traces back to its member copies, which SubFam can write out for further work. The consensus writer reproduces EMBOSS cons byte for byte, and the output does not depend on the number of threads.</w:t>
+        <w:t xml:space="preserve"> SubFam is a command-line utility that produces this view. It orders the copies along a k-mer guide tree, cuts the order into chunks of N neighbouring copies and aligns the plurality consensuses of the chunks, with a table of the copies behind every row. Every copy contributes to one row, and a row summarises its copies rather than sampling them: the mutations that each copy acquired on its own drop out of the consensus, while the bases that neighbouring copies share remain. On mouse B2 SINEs single copies have a median identity of 0.82 to the nearest published subfamily consensus, the rows 0.94, and groups that are lost in the noise of single copies stand out as blocks of rows. SubFam needs neither a reference nor an identity cutoff; its main parameter is N. A family of up to millions of copies can be run on a random sample: about 30,000 copies give some 600 rows, still a readable alignment. On B2 and human Alu SINEs the published consensuses appear among the rows; on 5′-truncated human LINE-1 copies the rows extend as far as their copies do. The rows stand when the copies carry short flanks or come in another order, and without the ordering chunks mix dissimilar copies. The consensus writer reproduces EMBOSS cons byte for byte, and the output does not depend on the number of threads.</w:t>
       </w:r>
     </w:p>
     <w:p>
@@ -138,7 +138,7 @@
           <w:b w:val="0"/>
           <w:i w:val="0"/>
         </w:rPr>
-        <w:t xml:space="preserve"> SubFam turns a pile of raw copies into an ordered alignment that a person can read and a downstream tool can take. It prepares the input for subfamily analysis and leaves the definition of subfamilies to the researcher.</w:t>
+        <w:t xml:space="preserve"> SubFam turns a pile of raw copies into an ordered alignment that a person can read and a downstream tool can take, with the features shared by groups of copies brought out from the noise of single copies. It prepares the input for subfamily analysis and leaves the definition of subfamilies to the researcher.</w:t>
       </w:r>
     </w:p>
     <w:p>
@@ -185,7 +185,7 @@
           <w:b w:val="0"/>
           <w:i w:val="0"/>
         </w:rPr>
-        <w:t>Between the raw copies and these analyses lies a practical step: making the heap of copies visible and small enough to work with. SubFam does that step and nothing else. Its two objectives are (1) a visual presentation of many similar sequences, at various degrees of variation within and between groups, as an ordered series of consensuses, and (2) an alignment proxy: a compact, ordered alignment of chunk consensuses that stands for thousands of copies in tools that cannot take them all. A row is the consensus of a chunk of neighbouring copies; whether a row, or a block of rows, is a subfamily is a judgement for the researcher or for a dedicated method.</w:t>
+        <w:t>Between the raw copies and these analyses lies a practical step: making the heap of copies readable, that is, small enough to work with and with the variation that groups of copies share set apart from the variation of single copies. SubFam does that step and nothing else. Its two objectives are (1) a visual presentation of many similar sequences, at various degrees of variation within and between groups, as an ordered series of consensuses, and (2) an alignment proxy: a compact, ordered alignment of chunk consensuses that stands for thousands of copies in tools that cannot take them all. A row is not a selected copy but the consensus of a chunk of neighbouring copies, to which every copy of the chunk contributes. Each copy carries, besides the bases of its group, mutations of its own, scattered over its length and rarely shared; in the consensus of similar copies these drop out and the shared bases remain. A row therefore shows the features of its copies' group more clearly than any one copy does, and a group whose copies look like noise one by one appears in the rows as a block. Whether a row, or a block of rows, is a subfamily is a judgement for the researcher or for a dedicated method.</w:t>
       </w:r>
     </w:p>
     <w:p>
@@ -286,7 +286,7 @@
           <w:b w:val="0"/>
           <w:i w:val="0"/>
         </w:rPr>
-        <w:t xml:space="preserve"> the threshold is p × the number of sequences that span the column (at least 3), so that the consensus of a chunk of truncated copies extends as far as its copies do; the lower-case rule still counts all sequences of the chunk, so the parts that only a few copies reach are written in lower case. (4) </w:t>
+        <w:t xml:space="preserve"> the threshold is p × the number of sequences that span the column (at least 3), so that the consensus of a chunk of truncated copies extends as far as its copies do; the lower-case rule still counts all sequences of the chunk, so the parts that only a few copies reach are written in lower case. The ordering makes this step useful: because the copies of a chunk are similar, a base they share passes the threshold, while a substitution or indel present in one or a few of them does not, so the consensus keeps what the chunk has in common and drops what is private to single copies. (4) </w:t>
       </w:r>
       <w:r>
         <w:rPr>
@@ -407,7 +407,7 @@
           <w:b w:val="0"/>
           <w:i w:val="0"/>
         </w:rPr>
-        <w:t xml:space="preserve"> N is the resolution in copies: a group needs roughly N copies to obtain a row of its own, and an abundant group fills several rows. At the default N = 50 and p = 0.36 a consensus base needs at least 18 agreeing copies; N = 20 (8 copies) is the setting for small or rare groups. p shapes the consensus and does not change which copies share a chunk; k sets the word length of the ordering.</w:t>
+        <w:t xml:space="preserve"> N is the resolution in copies: a group needs roughly N copies to obtain a row of its own, and an abundant group fills several rows. A larger N averages over more copies and so removes more of the noise of single copies, at the price of coarser rows. At the default N = 50 and p = 0.36 a consensus base needs at least 18 agreeing copies; N = 20 (8 copies) is the setting for small or rare groups. p shapes the consensus and does not change which copies share a chunk; k sets the word length of the ordering.</w:t>
       </w:r>
     </w:p>
     <w:p>
@@ -664,7 +664,7 @@
           <w:b w:val="0"/>
           <w:i w:val="0"/>
         </w:rPr>
-        <w:t>, giving 60 rows in 19 s; the alignment of all 3,000 copies has 2,781 columns, the alignment of the 60 rows 223. Grouped by RepeatMasker class, with the class consensus and the Dfam consensus as heads (Figure 1), the rows have a median identity of 0.959 to the head of their own class (minimum 0.836). The order separates the two lineages of the family into blocks of rows: B3 and B3A in chunks 1–21 and 46–60, B2 in chunks 22–45. Inside the B2 block the three Repbase [15] names B2_Mm1a, B2_Mm1t and B2_Mm2 interleave; the alignment shows the copies as they are and leaves the naming of their groups to the researcher.</w:t>
+        <w:t>, giving 60 rows in 19 s; the alignment of all 3,000 copies has 2,781 columns, the alignment of the 60 rows 223. Grouped by RepeatMasker class, with the class consensus and the Dfam consensus as heads (Figure 1), the rows have a median identity of 0.959 to the head of their own class (minimum 0.836). The rows are closer to the published consensuses of the family than the copies they summarise: to the nearest of the five consensuses of Vassetzky et al. [16], single copies have a median identity of 0.817 (interquartile range 0.763–0.895; the 2,873 copies whose best hit covers at least half their length) and the 60 rows 0.936 (0.913–0.958); to the nearest Dfam consensus, 0.799 and 0.915. The difference is the copy-level noise that the consensus removes. The order separates the two lineages of the family into blocks of rows: B3 and B3A in chunks 1–21 and 46–60, B2 in chunks 22–45. Inside the B2 block the three Repbase [15] names B2_Mm1a, B2_Mm1t and B2_Mm2 interleave; the alignment shows the copies as they are and leaves the naming of their groups to the researcher.</w:t>
       </w:r>
     </w:p>
     <w:p>
@@ -695,7 +695,7 @@
           <w:b w:val="0"/>
           <w:i w:val="0"/>
         </w:rPr>
-        <w:t>). In input order the copies are speckle; in SubFam's order the groups appear as blocks with their shared indels, and the 20 consensuses carry the same structure in 20 rows.</w:t>
+        <w:t>). In input order the copies are speckle; in SubFam's order the groups appear as blocks with their shared indels, but each copy still carries scattered differences of its own. In the 20 consensuses these private differences are gone, and what remains are the bases and indels that set the groups apart: the same structure, in 20 rows and more clearly than in the 390 copies.</w:t>
       </w:r>
     </w:p>
     <w:p>
@@ -1612,7 +1612,7 @@
           <w:b w:val="0"/>
           <w:i w:val="0"/>
         </w:rPr>
-        <w:t>A readable, ordered alignment that stands for the collection, every row traceable to its copies, built without an identity cutoff and without a reference, in minutes for tens of thousands of copies. The published consensuses of the SINE examples appear among its rows, the lineages of a family appear as blocks, and old, highly diverged copies are shown as the mixture they are.</w:t>
+        <w:t>A readable, ordered alignment that stands for the collection, every row traceable to its copies, built without an identity cutoff and without a reference, in minutes for tens of thousands of copies. Nothing is left out: every copy contributes to one row, and each row condenses its copies into the bases they share, so that variants shared by a group are visible in the rows while the noise of single copies is not. The published consensuses of the SINE examples appear among its rows, the lineages of a family appear as blocks, and old, highly diverged copies are shown as the mixture they are.</w:t>
       </w:r>
     </w:p>
     <w:p>
@@ -1775,7 +1775,22 @@
           <w:b w:val="0"/>
           <w:i w:val="0"/>
         </w:rPr>
-        <w:t xml:space="preserve">A chunk has a fixed size: an abundant group fills several rows with near-identical consensuses, a chunk can straddle two groups, and N has to be chosen for the rarest group of interest. Rows of old, highly diverged copies are mixtures. The whole-copy k-mer distance responds to copy length, so mixed-length input (5′-truncated LINEs) sorts partly by length; the remedy is to run on the shared region or on the long copies. The k-mer ordering needs a matrix of 4·n² bytes (3.6 GB at 30,000 copies); </w:t>
+        <w:t>A row shows what its copies share; the variation inside a chunk, including a variant carried by too few of its copies to pass the threshold, is not in the row and is read from the member copies (</w:t>
+      </w:r>
+      <w:r>
+        <w:rPr>
+          <w:rFonts w:ascii="Courier New" w:hAnsi="Courier New"/>
+          <w:b w:val="0"/>
+          <w:i w:val="0"/>
+        </w:rPr>
+        <w:t>-e</w:t>
+      </w:r>
+      <w:r>
+        <w:rPr>
+          <w:b w:val="0"/>
+          <w:i w:val="0"/>
+        </w:rPr>
+        <w:t xml:space="preserve">). A chunk has a fixed size: an abundant group fills several rows with near-identical consensuses, a chunk can straddle two groups, and N has to be chosen for the rarest group of interest. Rows of old, highly diverged copies are mixtures. The whole-copy k-mer distance responds to copy length, so mixed-length input (5′-truncated LINEs) sorts partly by length; the remedy is to run on the shared region or on the long copies. The k-mer ordering needs a matrix of 4·n² bytes (3.6 GB at 30,000 copies); </w:t>
       </w:r>
       <w:r>
         <w:rPr>
@@ -1812,7 +1827,7 @@
           <w:b w:val="0"/>
           <w:i w:val="0"/>
         </w:rPr>
-        <w:t>SubFam turns a collection of related copies that is too large to read into a compact, ordered alignment of chunk consensuses, with every row traceable to its copies, built without an identity cutoff and without a reference. On real SINE copies the published consensuses of each family appear among its rows and the lineages of a family appear as blocks; truncated LINE copies give rows that reach as far as their copies do. The output is a compact input for curation, subfamily definition and phylogenetic analysis, which are hard to apply to thousands of raw copies; those steps remain the researcher's.</w:t>
+        <w:t>SubFam turns a collection of related copies that is too large to read into a compact, ordered alignment of chunk consensuses, with every row traceable to its copies, built without an identity cutoff and without a reference. Each row condenses neighbouring copies into the bases they share, so the noise of single copies falls away and the features of groups of copies become visible. On real SINE copies the published consensuses of each family appear among its rows and the lineages of a family appear as blocks; truncated LINE copies give rows that reach as far as their copies do. The output is a compact input for curation, subfamily definition and phylogenetic analysis, which are hard to apply to thousands of raw copies; those steps remain the researcher's.</w:t>
       </w:r>
     </w:p>
     <w:p>
@@ -2229,7 +2244,7 @@
           <w:b w:val="0"/>
           <w:i w:val="0"/>
         </w:rPr>
-        <w:t xml:space="preserve"> and </w:t>
+        <w:t xml:space="preserve">, </w:t>
       </w:r>
       <w:r>
         <w:rPr>
@@ -2238,6 +2253,21 @@
           <w:i w:val="0"/>
         </w:rPr>
         <w:t>flanks2.sh</w:t>
+      </w:r>
+      <w:r>
+        <w:rPr>
+          <w:b w:val="0"/>
+          <w:i w:val="0"/>
+        </w:rPr>
+        <w:t xml:space="preserve"> and </w:t>
+      </w:r>
+      <w:r>
+        <w:rPr>
+          <w:rFonts w:ascii="Courier New" w:hAnsi="Courier New"/>
+          <w:b w:val="0"/>
+          <w:i w:val="0"/>
+        </w:rPr>
+        <w:t>copies_vs_rows.sh</w:t>
       </w:r>
       <w:r>
         <w:rPr>
@@ -2685,7 +2715,7 @@
           <w:b w:val="0"/>
           <w:i w:val="0"/>
         </w:rPr>
-        <w:t>), with the most common label of each chunk at the right. Copies and consensuses are one MAFFT alignment, of which the 220 of 1,105 columns present in at least 25 % of the copies are shown. Light grey, the majority base of the column among the copies; red, another base; white, gap. The strip at the left gives the label of each copy (a, b) or the most common label of each chunk (c).</w:t>
+        <w:t>), with the most common label of each chunk at the right; the differences private to single copies in (b) are absent from the consensuses, and the differences between groups remain. Copies and consensuses are one MAFFT alignment, of which the 220 of 1,105 columns present in at least 25 % of the copies are shown. Light grey, the majority base of the column among the copies; red, another base; white, gap. The strip at the left gives the label of each copy (a, b) or the most common label of each chunk (c).</w:t>
       </w:r>
     </w:p>
     <w:p>

</xml_diff>

<commit_message>
v9: Limitations/Outputs name the chunk statistics that describe the variation behind each row
Co-Authored-By: Claude Opus 5.5 <noreply@anthropic.com>
</commit_message>
<xml_diff>
--- a/docs/submission/SubFam_BMC_Bioinformatics_manuscript.docx
+++ b/docs/submission/SubFam_BMC_Bioinformatics_manuscript.docx
@@ -331,7 +331,7 @@
           <w:b w:val="0"/>
           <w:i w:val="0"/>
         </w:rPr>
-        <w:t xml:space="preserve"> The consensuses, their alignment (FASTA and multiple sequence format, MSF), a table of copy, chunk and strand, and a table of chunk statistics that uses no labels: size, consensus length, share of lower-case bases and, over the core columns where at least half of the chunk has a base, the agreement of the members with each column's most frequent base, their median and lowest identity to those bases, and the share of gappy columns. Two options lead back to the copies: </w:t>
+        <w:t xml:space="preserve"> The consensuses, their alignment (FASTA and multiple sequence format, MSF), a table of copy, chunk and strand, and a table of chunk statistics that describes, without labels, how tight the chunk behind each row is: size, consensus length, share of lower-case bases and, over the core columns where at least half of the chunk has a base, the agreement of the members with each column's most frequent base, their median and lowest identity to those bases, and the share of gappy columns. Two options lead back to the copies: </w:t>
       </w:r>
       <w:r>
         <w:rPr>
@@ -1775,7 +1775,7 @@
           <w:b w:val="0"/>
           <w:i w:val="0"/>
         </w:rPr>
-        <w:t>A row shows what its copies share; the variation inside a chunk, including a variant carried by too few of its copies to pass the threshold, is not in the row and is read from the member copies (</w:t>
+        <w:t>A row shows what its copies share, not the variation among them. How much variation lies behind each row is reported for every chunk without labels: the lower-case bases of the row mark columns that half of the chunk or fewer support, and the chunk statistics give the agreement of the members with each column's most frequent base, their median and lowest identity to those bases, and the share of gappy columns, so that a row built from a loose chunk (a mixture, an old diverged group or outlier copies) is flagged as such. A variant carried by too few copies to pass the threshold is read from the member copies (</w:t>
       </w:r>
       <w:r>
         <w:rPr>

</xml_diff>

<commit_message>
v9: outside review applied: Price/COSEG/TEtrimmer/MeShClust described accurately, row = dominant sequence not ancestor, identity method, k-mers across N, -F caveat, Alu 316 of 343, scope limits
Co-Authored-By: Claude Sonnet 5.5 <noreply@anthropic.com>
</commit_message>
<xml_diff>
--- a/docs/submission/SubFam_BMC_Bioinformatics_manuscript.docx
+++ b/docs/submission/SubFam_BMC_Bioinformatics_manuscript.docx
@@ -122,7 +122,7 @@
           <w:b w:val="0"/>
           <w:i w:val="0"/>
         </w:rPr>
-        <w:t xml:space="preserve"> SubFam is a command-line utility that produces this view. It orders the copies along a k-mer guide tree, cuts the order into chunks of N neighbouring copies and aligns the plurality consensuses of the chunks, with a table of the copies behind every row. Every copy contributes to one row, and a row summarises its copies rather than sampling them: the mutations that each copy acquired on its own drop out of the consensus, while the bases that neighbouring copies share remain. On mouse B2 SINEs single copies have a median identity of 0.82 to the nearest published subfamily consensus, the rows 0.94, and groups that are lost in the noise of single copies stand out as blocks of rows. SubFam needs neither a reference nor an identity cutoff; its main parameter is N. A family of up to millions of copies can be run on a random sample: about 30,000 copies give some 600 rows, still a readable alignment. On B2 and human Alu SINEs the published consensuses appear among the rows; on 5′-truncated human LINE-1 copies the rows extend as far as their copies do. The rows stand when the copies carry short flanks or come in another order, and without the ordering chunks mix dissimilar copies. The consensus writer reproduces EMBOSS cons byte for byte, and the output does not depend on the number of threads.</w:t>
+        <w:t xml:space="preserve"> SubFam is a command-line utility that produces this view. It orders the copies along a k-mer guide tree, cuts the order into chunks of N neighbouring copies and aligns the plurality consensuses of the chunks, with a table of the copies behind every row. Every copy contributes to one row, and a row summarises its copies rather than sampling them: the mutations that each copy acquired on its own drop out of the consensus, while the bases that neighbouring copies share remain. On mouse B2 SINEs single copies have a median identity of 0.82 to the nearest published subfamily consensus, the rows 0.94, and groups whose diagnostic variation is hard to recognise among single copies can be seen as blocks of rows. SubFam needs neither a reference nor an identity cutoff; its main parameter is N. A family of up to millions of copies can be run on a random sample: about 30,000 copies give some 600 rows, still a readable alignment. On B2 and human Alu SINEs the published consensuses appear among the rows; on 5′-truncated human LINE-1 copies the rows extend as far as their copies do. The rows stand when the copies carry short flanks or come in another order, and without the ordering chunks mix dissimilar copies. The consensus writer reproduces EMBOSS cons byte for byte, and the output does not depend on the number of threads.</w:t>
       </w:r>
     </w:p>
     <w:p>
@@ -138,7 +138,7 @@
           <w:b w:val="0"/>
           <w:i w:val="0"/>
         </w:rPr>
-        <w:t xml:space="preserve"> SubFam turns a pile of raw copies into an ordered alignment that a person can read and a downstream tool can take, with the features shared by groups of copies brought out from the noise of single copies. It prepares the input for subfamily analysis and leaves the definition of subfamilies to the researcher.</w:t>
+        <w:t xml:space="preserve"> SubFam turns a collection of genomic copies into an ordered alignment that a person can read and a downstream tool can take, with the features shared by groups of copies brought out from the noise of single copies. It prepares the input for subfamily analysis and leaves the definition of subfamilies to the researcher.</w:t>
       </w:r>
     </w:p>
     <w:p>
@@ -176,7 +176,7 @@
           <w:b w:val="0"/>
           <w:i w:val="0"/>
         </w:rPr>
-        <w:t>Interspersed repeats (short and long interspersed elements, SINEs and LINEs), satellite arrays and multigene families contain thousands to millions of related copies, and the copies of one family span every degree of divergence, from near-identical recent insertions to relics at 30 % distance from their consensus. An alignment of all copies cannot be read, and many tools cannot take it. Existing tools answer neighbouring questions: identity clustering (CD-HIT [1], VSEARCH [2], MMseqs2 [3, 4], MeShClust [5]) groups copies above an identity cutoff, which is tuned to one level of divergence; statistical subfamily methods, from the genome-wide Alu analysis of Price et al. [6] to COSEG [7], define subfamilies on copies aligned to one reference over a shared window; library-curation tools such as TEtrimmer [8] refine one family consensus at a time from a genome.</w:t>
+        <w:t>Interspersed repeats (short and long interspersed elements, SINEs and LINEs), satellite arrays and multigene families contain thousands to millions of related copies, and the copies of one family span every degree of divergence, from near-identical recent insertions to relics at 30 % distance from their consensus. An alignment of all copies cannot be read, and many tools cannot take it. Existing tools answer neighbouring questions: identity clustering (CD-HIT [1], VSEARCH [2], MMseqs2 [3, 4]) groups copies above an identity cutoff, which is tuned to one level of divergence, and MeShClust [5] predicts identities alignment-free and groups by mean shift; statistical subfamily methods, from the genome-wide Alu analysis of Price et al. [6], which recursively divided about 480,000 aligned full-length Alu copies by tests for over-represented co-occurring mutations, to COSEG [7], which finds groups of copies sharing co-segregating mutations in an alignment, aim to define the biological subfamilies; library-curation tools such as TEtrimmer [8] automate the curation of consensus libraries (searching the genome for copies, aligning, clustering and refining each consensus).</w:t>
       </w:r>
     </w:p>
     <w:p>
@@ -185,7 +185,7 @@
           <w:b w:val="0"/>
           <w:i w:val="0"/>
         </w:rPr>
-        <w:t>Between the raw copies and these analyses lies a practical step: making the heap of copies readable, that is, small enough to work with and with the variation that groups of copies share set apart from the variation of single copies. SubFam does that step and nothing else. Its two objectives are (1) a visual presentation of many similar sequences, at various degrees of variation within and between groups, as an ordered series of consensuses, and (2) an alignment proxy: a compact, ordered alignment of chunk consensuses that stands for thousands of copies in tools that cannot take them all. A row is not a selected copy but the consensus of a chunk of neighbouring copies, to which every copy of the chunk contributes. Each copy carries, besides the bases of its group, mutations of its own, scattered over its length and rarely shared; in the consensus of similar copies these drop out and the shared bases remain. A row therefore shows the features of its copies' group more clearly than any one copy does, and a group whose copies look like noise one by one appears in the rows as a block. Whether a row, or a block of rows, is a subfamily is a judgement for the researcher or for a dedicated method.</w:t>
+        <w:t>Between the raw copies and these analyses lies a practical step: making the heap of copies readable, that is, small enough to work with and with the variation that groups of copies share set apart from the variation of single copies. SubFam does that step and nothing else. Its two objectives are (1) a visual presentation of many similar sequences, at various degrees of variation within and between groups, as an ordered series of consensuses, and (2) an alignment proxy: a compact, ordered alignment of chunk consensuses that stands for thousands of copies in tools that cannot take them all. A row is not a selected copy but the consensus of a chunk of neighbouring copies, to which every copy of the chunk contributes. It is a position-wise summary of the dominant sequence of its chunk, not a reconstruction of the ancestor of a subfamily; if a chunk mixes two groups, the row can be a mosaic of them. Each copy carries, besides the bases of its group, mutations of its own, scattered over its length and rarely shared; in the consensus of similar copies these drop out and the shared bases remain. A row therefore shows the features of its copies' group more clearly than any one copy does, and a group whose variation is hard to recognise among single copies can be seen in the rows as a block. Whether a row, or a block of rows, is a subfamily is a judgement for the researcher or for a dedicated method.</w:t>
       </w:r>
     </w:p>
     <w:p>
@@ -243,7 +243,7 @@
           <w:b w:val="0"/>
           <w:i w:val="0"/>
         </w:rPr>
-        <w:t xml:space="preserve">, compiled on each run; an embedded Python version with byte-identical output is the fallback where no compiler exists). At each merge the two subtrees are turned so that their closest ends meet (of the four pairs of end sequences, the pair at the smallest distance is placed side by side); the leaf order of this tree is a sequence in which neighbours are similar across subtree boundaries, which is what makes fixed windows along it meaningful. This step aligns nothing. (2) </w:t>
+        <w:t xml:space="preserve">, compiled on each run; an embedded Python version with byte-identical output is the fallback where no compiler exists). At each merge the two subtrees are turned so that their closest ends meet (of the four pairs of end sequences, the pair at the smallest distance is placed side by side); the leaf order of this tree is a sequence in which neighbours are similar across subtree boundaries, which is what makes fixed windows along it meaningful. This step aligns nothing, and the tree is a device for a linear order, not a phylogeny; the closest-ends rule is greedy and does not minimise the total distance along the order. Letters other than A, C, G, T and U are skipped when k-mers are counted, so k-mers can span an N or another ambiguity code; the B2 examples exclude copies with N. (2) </w:t>
       </w:r>
       <w:r>
         <w:rPr>
@@ -271,7 +271,7 @@
           <w:b w:val="0"/>
           <w:i w:val="0"/>
         </w:rPr>
-        <w:t xml:space="preserve"> Each chunk is aligned with MAFFT [9], chunks in parallel, and a plurality consensus is called for each aligned chunk with the scoring of EMBOSS cons [10] (EDNAFULL): the top-scoring residue of a column is written when the sequences whose residue scores positively against it (ambiguity codes included, gaps never) number at least p × n (default p = 0.36); a base supported by half of the sequences or fewer is written in lower case, and the case is kept through the final alignment. With </w:t>
+        <w:t xml:space="preserve"> Each chunk is aligned with MAFFT [9], chunks in parallel, and a plurality consensus is called for each aligned chunk with the scoring of EMBOSS cons [10] (EDNAFULL): the top-scoring residue of a column is written when the sequences whose residue scores positively against it (ambiguity codes included, gaps never) number at least p × n (default p = 0.36); a base supported by half of the sequences or fewer is written in lower case (it passed the threshold but is weakly supported, not uncalled), and the case is kept through the final alignment. Columns where no residue reaches the threshold give no consensus base and are dropped, as in EMBOSS cons. With </w:t>
       </w:r>
       <w:r>
         <w:rPr>
@@ -515,7 +515,7 @@
           <w:b w:val="0"/>
           <w:i w:val="0"/>
         </w:rPr>
-        <w:t xml:space="preserve">: 3,600 consensus runs and 80 MSF files, no difference). The distance matrix agrees with a brute-force computation, and the C and Python orderings give byte-identical orders on 292 synthetic cases. For the same input file, output is byte-identical across runs and thread counts; a different input order gives a different, equivalent set of rows (Results, Input preparation); 26 robustness cases (awkward or malformed inputs, determinism) either keep every input record or stop with a message, and </w:t>
+        <w:t>: 3,600 consensus runs and 80 MSF files, no difference). The distance matrix agrees with a brute-force computation, and the C and Python orderings give byte-identical orders on 292 synthetic cases. For the same input file, output is byte-identical across runs and thread counts in the default mode (</w:t>
       </w:r>
       <w:r>
         <w:rPr>
@@ -523,30 +523,14 @@
           <w:b w:val="0"/>
           <w:i w:val="0"/>
         </w:rPr>
-        <w:t>tests/check_inputs.sh</w:t>
+        <w:t>-F</w:t>
       </w:r>
       <w:r>
         <w:rPr>
           <w:b w:val="0"/>
           <w:i w:val="0"/>
         </w:rPr>
-        <w:t xml:space="preserve"> confirms that malformed input (duplicate or reserved ids, empty records, protein) is refused.</w:t>
-      </w:r>
-    </w:p>
-    <w:p>
-      <w:r>
-        <w:rPr>
-          <w:b/>
-          <w:i w:val="0"/>
-        </w:rPr>
-        <w:t>Presentation of the examples.</w:t>
-      </w:r>
-      <w:r>
-        <w:rPr>
-          <w:b w:val="0"/>
-          <w:i w:val="0"/>
-        </w:rPr>
-        <w:t xml:space="preserve"> SubFam uses no labels. To make the example alignments (Additional file 1) readable, the SubFam rows are named </w:t>
+        <w:t xml:space="preserve">, which refines the final alignment on all threads, gives up this guarantee); a different input order gives a different, equivalent set of rows (Results, Input preparation); 26 robustness cases (awkward or malformed inputs, determinism) either keep every input record or stop with a message, and </w:t>
       </w:r>
       <w:r>
         <w:rPr>
@@ -554,14 +538,30 @@
           <w:b w:val="0"/>
           <w:i w:val="0"/>
         </w:rPr>
-        <w:t>&lt;chunk&gt;|&lt;class&gt;|p&lt;share&gt;</w:t>
+        <w:t>tests/check_inputs.sh</w:t>
       </w:r>
       <w:r>
         <w:rPr>
           <w:b w:val="0"/>
           <w:i w:val="0"/>
         </w:rPr>
-        <w:t xml:space="preserve"> after the most common annotation class of the chunk's copies and its share among them, and are grouped by that class. Each group is headed by the consensus of all copies of the class (</w:t>
+        <w:t xml:space="preserve"> confirms that malformed input (duplicate or reserved ids, empty records, protein) is refused.</w:t>
+      </w:r>
+    </w:p>
+    <w:p>
+      <w:r>
+        <w:rPr>
+          <w:b/>
+          <w:i w:val="0"/>
+        </w:rPr>
+        <w:t>Presentation of the examples.</w:t>
+      </w:r>
+      <w:r>
+        <w:rPr>
+          <w:b w:val="0"/>
+          <w:i w:val="0"/>
+        </w:rPr>
+        <w:t xml:space="preserve"> SubFam uses no labels. To make the example alignments (Additional file 1) readable, the SubFam rows are named </w:t>
       </w:r>
       <w:r>
         <w:rPr>
@@ -569,14 +569,14 @@
           <w:b w:val="0"/>
           <w:i w:val="0"/>
         </w:rPr>
-        <w:t>CLASSCONS_&lt;class&gt;</w:t>
+        <w:t>&lt;chunk&gt;|&lt;class&gt;|p&lt;share&gt;</w:t>
       </w:r>
       <w:r>
         <w:rPr>
           <w:b w:val="0"/>
           <w:i w:val="0"/>
         </w:rPr>
-        <w:t xml:space="preserve">) and by the published consensus (Dfam [12], Price et al. [6]) where one exists. The identity of every row to the head of its group is in </w:t>
+        <w:t xml:space="preserve"> after the most common annotation class of the chunk's copies and its share among them, and are grouped by that class. Each group is headed by the consensus of all copies of the class (</w:t>
       </w:r>
       <w:r>
         <w:rPr>
@@ -584,14 +584,29 @@
           <w:b w:val="0"/>
           <w:i w:val="0"/>
         </w:rPr>
-        <w:t>&lt;file&gt;.rows.tsv</w:t>
+        <w:t>CLASSCONS_&lt;class&gt;</w:t>
       </w:r>
       <w:r>
         <w:rPr>
           <w:b w:val="0"/>
           <w:i w:val="0"/>
         </w:rPr>
-        <w:t>. The 30,000-copy B2 alignment holds the SubFam rows only, and the L1 class consensuses are built from at most 60 random members of each class.</w:t>
+        <w:t xml:space="preserve">) and by the published consensus (Dfam [12], Price et al. [6]) where one exists. The identity of every row to the head of its group is in </w:t>
+      </w:r>
+      <w:r>
+        <w:rPr>
+          <w:rFonts w:ascii="Courier New" w:hAnsi="Courier New"/>
+          <w:b w:val="0"/>
+          <w:i w:val="0"/>
+        </w:rPr>
+        <w:t>&lt;file&gt;.rows.tsv</w:t>
+      </w:r>
+      <w:r>
+        <w:rPr>
+          <w:b w:val="0"/>
+          <w:i w:val="0"/>
+        </w:rPr>
+        <w:t>. Identities in the text are the best local alignment (match 2, mismatch −3, gap open −5, extension −2) of a copy or row against a reference, counted as matches over the longer of the two aligned spans, and a hit is accepted when it covers at least half of the query. The class consensuses are built from the same copies that are assigned to the class, so identity to them describes the collection; the Dfam and Vassetzky et al. consensuses are independent references. That a consensus is closer to a reference than its member copies are is expected of any consensus; it shows that the copy-level noise is removed, not that the chunks are the right groups. The 30,000-copy B2 alignment holds the SubFam rows only, and the L1 class consensuses are built from at most 60 random members of each class.</w:t>
       </w:r>
     </w:p>
     <w:p>
@@ -680,7 +695,7 @@
           <w:b w:val="0"/>
           <w:i w:val="0"/>
         </w:rPr>
-        <w:t xml:space="preserve"> To make the method visible, 390 of the copies (a stratified random sample over four groups of the family as classified by Vassetzky et al. [16], seed 1, shuffled) were aligned together with the 20 chunk consensuses SubFam built from them (</w:t>
+        <w:t xml:space="preserve"> To make the method visible, not to estimate how it performs on a natural sample, 390 of the copies (a deliberately stratified random sample over four groups of the family as classified by Vassetzky et al. [16], seed 1, shuffled) were aligned together with the 20 chunk consensuses SubFam built from them (</w:t>
       </w:r>
       <w:r>
         <w:rPr>
@@ -799,7 +814,7 @@
           <w:b w:val="0"/>
           <w:i w:val="0"/>
         </w:rPr>
-        <w:t xml:space="preserve">316 Sanger-sequenced polymorphic Alu loci (Konkel et al. [19]), cut to the Alu body and run with </w:t>
+        <w:t xml:space="preserve">316 of the 343 Sanger-sequenced polymorphic Alu records of Konkel et al. [19] (322 unique loci; the 316 are the full-length bodies, 250–330 bp and at least 90 % of the AluY consensus), cut to the Alu body and run with </w:t>
       </w:r>
       <w:r>
         <w:rPr>
@@ -903,7 +918,7 @@
           <w:b w:val="0"/>
           <w:i w:val="0"/>
         </w:rPr>
-        <w:t>Copies reach SubFam in different states: cut exactly to the element, or with some of their own flanking sequence. The 3,000 B2 copies of Example 1 were cut again with 25, 100 and 500 bp of their genomic flank on each side (the element part identical in every copy) and compared with the element-only run, against the variation that a different input order alone produces. With 25 or 100 bp flanks, 36 and 37 of the 60 element-only rows recur at ≥ 0.95 identity among the new rows, as with two shuffled input orders (47 and 36), and the published consensuses of the family (Dfam and Vassetzky et al. [16]) are found among the rows at the same identities as without flanks (for example B2c 0.994 without flanks, 0.979 and 0.969 with them). Which copies share a chunk changes more than the rows do: the flanks add unique k-mers, the order shifts, and the windows cut elsewhere but yield the same consensuses. With 500 bp flanks, five times the element on each side, the flanks dominate the k-mer distance: 23 of the 60 rows recur, and the rows of the old subfamilies move away from their published consensuses (B2c 0.882). Long flanks should therefore be trimmed before the run.</w:t>
+        <w:t>Copies reach SubFam in different states: cut exactly to the element, or with some of their own flanking sequence. The 3,000 B2 copies of Example 1 were cut again with 25, 100 and 500 bp of their genomic flank on each side (the element part identical in every copy) and compared with the element-only run, against the variation that a different input order alone produces. With 25 or 100 bp flanks, 36 and 37 of the 60 element-only rows recur at ≥ 0.95 identity among the new rows, as with two shuffled input orders (47 and 36), and the published consensuses of the family (Dfam and Vassetzky et al. [16]) are found among the rows at the same identities as without flanks (for example B2c 0.994 without flanks, 0.979 and 0.969 with them). Modest flanks are tolerated, but which copies share a chunk changes more than the rows do: the flanks add unique k-mers, the order shifts, and the windows cut elsewhere but yield the same consensuses. With 500 bp flanks, five times the element on each side, the flanks dominate the k-mer distance: 23 of the 60 rows recur, and the rows of the old subfamilies move away from their published consensuses (B2c 0.882). Long flanks should therefore be trimmed before the run.</w:t>
       </w:r>
     </w:p>
     <w:p>
@@ -1066,7 +1081,7 @@
                 <w:b/>
                 <w:i w:val="0"/>
               </w:rPr>
-              <w:t>lowest member identity</w:t>
+              <w:t>mean lowest member identity</w:t>
             </w:r>
           </w:p>
         </w:tc>
@@ -1575,7 +1590,7 @@
           <w:b w:val="0"/>
           <w:i w:val="0"/>
         </w:rPr>
-        <w:t xml:space="preserve"> Rows, number of rows in the output; columns, alignment columns; lowest member identity, the identity of a chunk's least similar member to the most frequent bases of the chunk's core columns, averaged over the chunks (the </w:t>
+        <w:t xml:space="preserve"> Rows, number of rows in the output; columns, alignment columns; mean lowest member identity, the identity of a chunk's least similar member to the most frequent bases of the chunk's core columns, averaged over the chunks (the </w:t>
       </w:r>
       <w:r>
         <w:rPr>
@@ -1753,7 +1768,7 @@
           <w:b w:val="0"/>
           <w:i w:val="0"/>
         </w:rPr>
-        <w:t>Identity clustering returns one representative per cluster and leaves the clusters unordered; COSEG and Price et al. define subfamilies on copies that span a common window of one reference alignment (full-length copies in Price et al.); TEtrimmer curates a library one family at a time from a genome; PASTA [20] and MAGUS [27] decompose a guide tree in order to align everything, where SubFam collapses the subsets and aligns their consensuses. Each answers a different question. SubFam does not classify copies and is not meant to replace these tools; its ordered consensuses are a compact input for them and for the researcher.</w:t>
+        <w:t>Identity clustering returns one representative per cluster and leaves the clusters unordered; COSEG and Price et al. define subfamilies by statistical tests on aligned copies (full-length copies in Price et al.); TEtrimmer automates the curation of a consensus library from a genome; PASTA [20] and MAGUS [27] decompose a guide tree in order to align everything, where SubFam collapses the subsets and aligns their consensuses. Each answers a different question. SubFam does not classify copies and is not meant to replace these tools; its ordered consensuses are a compact input for them and for the researcher.</w:t>
       </w:r>
     </w:p>
     <w:p>
@@ -1805,7 +1820,7 @@
           <w:b w:val="0"/>
           <w:i w:val="0"/>
         </w:rPr>
-        <w:t xml:space="preserve"> needs far less memory at the cost of less similar chunk members. The annotation labels in the examples serve only to name and group the rows for the reader, and each real example comes from one genome.</w:t>
+        <w:t xml:space="preserve"> needs far less memory at the cost of less similar chunk members. The annotation labels in the examples serve only to name and group the rows for the reader, and each real example comes from one genome. Only transposable-element copies were tested; satellite monomers and multigene families are within the intended use but not evaluated here. A chunk of fixed size has no guarantee of matching a biological group, and the number of copies a group needs for a row of its own (about N) is a nominal figure, not a detection limit. A tree built from the rows is an exploration of the rows; it does not replace an analysis of the copies.</w:t>
       </w:r>
     </w:p>
     <w:p>

</xml_diff>

<commit_message>
v9: abstract and N wording made consistent with the row definition (no categorical 'drop out', no detection guarantee for N, default-mode determinism)
Co-Authored-By: Claude Sonnet 5.5 <noreply@anthropic.com>
</commit_message>
<xml_diff>
--- a/docs/submission/SubFam_BMC_Bioinformatics_manuscript.docx
+++ b/docs/submission/SubFam_BMC_Bioinformatics_manuscript.docx
@@ -122,7 +122,7 @@
           <w:b w:val="0"/>
           <w:i w:val="0"/>
         </w:rPr>
-        <w:t xml:space="preserve"> SubFam is a command-line utility that produces this view. It orders the copies along a k-mer guide tree, cuts the order into chunks of N neighbouring copies and aligns the plurality consensuses of the chunks, with a table of the copies behind every row. Every copy contributes to one row, and a row summarises its copies rather than sampling them: the mutations that each copy acquired on its own drop out of the consensus, while the bases that neighbouring copies share remain. On mouse B2 SINEs single copies have a median identity of 0.82 to the nearest published subfamily consensus, the rows 0.94, and groups whose diagnostic variation is hard to recognise among single copies can be seen as blocks of rows. SubFam needs neither a reference nor an identity cutoff; its main parameter is N. A family of up to millions of copies can be run on a random sample: about 30,000 copies give some 600 rows, still a readable alignment. On B2 and human Alu SINEs the published consensuses appear among the rows; on 5′-truncated human LINE-1 copies the rows extend as far as their copies do. The rows stand when the copies carry short flanks or come in another order, and without the ordering chunks mix dissimilar copies. The consensus writer reproduces EMBOSS cons byte for byte, and the output does not depend on the number of threads.</w:t>
+        <w:t xml:space="preserve"> SubFam is a command-line utility that produces this view. It orders the copies along a k-mer guide tree, cuts the order into chunks of N neighbouring copies and aligns the plurality consensuses of the chunks, with a table of the copies behind every row. Every copy contributes to one row, and a row summarises its copies rather than sampling them: the consensus suppresses low-frequency, copy-specific variation and keeps the sufficiently supported sequence states of neighbouring copies. On mouse B2 SINEs single copies have a median identity of 0.82 to the nearest published subfamily consensus, the rows 0.94, and groups whose diagnostic variation is hard to recognise among single copies can be seen as blocks of rows. SubFam needs neither a reference nor an identity cutoff; its main parameter is N. A family of up to millions of copies can be run on a random sample: about 30,000 copies give some 600 rows, still a readable alignment. On B2 and human Alu SINEs the published consensuses appear among the rows; on 5′-truncated human LINE-1 copies the rows extend as far as their copies do. The main consensus patterns remain recognisable with modest flanking sequence and shuffled input orders, although chunk membership changes, and without the ordering chunks mix dissimilar copies. The consensus writer reproduces EMBOSS cons byte for byte, and the default output is byte-identical across thread counts.</w:t>
       </w:r>
     </w:p>
     <w:p>
@@ -185,7 +185,7 @@
           <w:b w:val="0"/>
           <w:i w:val="0"/>
         </w:rPr>
-        <w:t>Between the raw copies and these analyses lies a practical step: making the heap of copies readable, that is, small enough to work with and with the variation that groups of copies share set apart from the variation of single copies. SubFam does that step and nothing else. Its two objectives are (1) a visual presentation of many similar sequences, at various degrees of variation within and between groups, as an ordered series of consensuses, and (2) an alignment proxy: a compact, ordered alignment of chunk consensuses that stands for thousands of copies in tools that cannot take them all. A row is not a selected copy but the consensus of a chunk of neighbouring copies, to which every copy of the chunk contributes. It is a position-wise summary of the dominant sequence of its chunk, not a reconstruction of the ancestor of a subfamily; if a chunk mixes two groups, the row can be a mosaic of them. Each copy carries, besides the bases of its group, mutations of its own, scattered over its length and rarely shared; in the consensus of similar copies these drop out and the shared bases remain. A row therefore shows the features of its copies' group more clearly than any one copy does, and a group whose variation is hard to recognise among single copies can be seen in the rows as a block. Whether a row, or a block of rows, is a subfamily is a judgement for the researcher or for a dedicated method.</w:t>
+        <w:t>Between the raw copies and these analyses lies a practical step: making the heap of copies readable, that is, small enough to work with and with the variation that groups of copies share set apart from the variation of single copies. SubFam does that step and nothing else. Its two objectives are (1) a visual presentation of many similar sequences, at various degrees of variation within and between groups, as an ordered series of consensuses, and (2) an alignment proxy: a compact, ordered alignment of chunk consensuses that stands for thousands of copies in tools that cannot take them all. A row is not a selected copy but the consensus of a chunk of neighbouring copies, to which every copy of the chunk contributes. It is a position-wise summary of the dominant sequence of its chunk, not a reconstruction of the ancestor of a subfamily; if a chunk mixes two groups, the row can be a mosaic of them. Each copy carries, besides the bases of its group, mutations of its own, scattered over its length and rarely shared; in the consensus of similar copies the sufficiently supported bases are kept and low-frequency variants are suppressed. A row therefore shows the features of its copies' group more clearly than any one copy does, and a group whose variation is hard to recognise among single copies can be seen in the rows as a block. Whether a row, or a block of rows, is a subfamily is a judgement for the researcher or for a dedicated method.</w:t>
       </w:r>
     </w:p>
     <w:p>
@@ -286,7 +286,7 @@
           <w:b w:val="0"/>
           <w:i w:val="0"/>
         </w:rPr>
-        <w:t xml:space="preserve"> the threshold is p × the number of sequences that span the column (at least 3), so that the consensus of a chunk of truncated copies extends as far as its copies do; the lower-case rule still counts all sequences of the chunk, so the parts that only a few copies reach are written in lower case. The ordering makes this step useful: because the copies of a chunk are similar, a base they share passes the threshold, while a substitution or indel present in one or a few of them does not, so the consensus keeps what the chunk has in common and drops what is private to single copies. (4) </w:t>
+        <w:t xml:space="preserve"> the threshold is p × the number of sequences that span the column (at least 3), so that the consensus of a chunk of truncated copies extends as far as its copies do; the lower-case rule still counts all sequences of the chunk, so the parts that only a few copies reach are written in lower case. The ordering makes this step useful: because the copies of a chunk are similar, a base they share passes the threshold, while a substitution or indel present in one or a few of them does not, so the consensus keeps the well-supported sequence of the chunk and suppresses variation carried by single copies. (4) </w:t>
       </w:r>
       <w:r>
         <w:rPr>
@@ -407,7 +407,7 @@
           <w:b w:val="0"/>
           <w:i w:val="0"/>
         </w:rPr>
-        <w:t xml:space="preserve"> N is the resolution in copies: a group needs roughly N copies to obtain a row of its own, and an abundant group fills several rows. A larger N averages over more copies and so removes more of the noise of single copies, at the price of coarser rows. At the default N = 50 and p = 0.36 a consensus base needs at least 18 agreeing copies; N = 20 (8 copies) is the setting for small or rare groups. p shapes the consensus and does not change which copies share a chunk; k sets the word length of the ordering.</w:t>
+        <w:t xml:space="preserve"> N is the resolution in copies: N sets the approximate number of input copies behind each row; a group of roughly N copies may fill one or more chunks or share a chunk with neighbouring groups, depending on its place in the ordering, and an abundant group fills several rows. A larger N averages over more copies and so removes more of the noise of single copies, at the price of coarser rows. At the default N = 50 and p = 0.36 a consensus base needs at least 18 agreeing copies; N = 20 (8 copies) is the setting for small or rare groups. p shapes the consensus and does not change which copies share a chunk; k sets the word length of the ordering.</w:t>
       </w:r>
     </w:p>
     <w:p>
@@ -438,7 +438,7 @@
           <w:b w:val="0"/>
           <w:i w:val="0"/>
         </w:rPr>
-        <w:t>), and its size, not that of the whole family, sets time and memory. A group needs about N copies in the sample to obtain a row of its own.</w:t>
+        <w:t>), and its size, not that of the whole family, sets time and memory. A group of fewer than about N copies in the sample is unlikely to be represented by a row of its own.</w:t>
       </w:r>
     </w:p>
     <w:p>
@@ -710,7 +710,7 @@
           <w:b w:val="0"/>
           <w:i w:val="0"/>
         </w:rPr>
-        <w:t>). In input order the copies are speckle; in SubFam's order the groups appear as blocks with their shared indels, but each copy still carries scattered differences of its own. In the 20 consensuses these private differences are gone, and what remains are the bases and indels that set the groups apart: the same structure, in 20 rows and more clearly than in the 390 copies.</w:t>
+        <w:t>). In input order the copies are speckle; in SubFam's order the groups appear as blocks with their shared indels, but each copy still carries scattered differences of its own. In the 20 consensuses these low-frequency differences are largely suppressed, and the bases and indels that set the groups apart remain: the same structure, in 20 rows and more clearly than in the 390 copies.</w:t>
       </w:r>
     </w:p>
     <w:p>
@@ -896,7 +896,7 @@
           <w:b w:val="0"/>
           <w:i w:val="0"/>
         </w:rPr>
-        <w:t>). Among them, 25 of the 26 Dfam human Alu families with 50 or more expected copies in the sample are present at ≥ 0.95 identity (median best identity 0.994), and all 74 Price et al. [6] subfamilies with 50 or more expected copies; of the rarer Price subfamilies, 88 of 90 with 10–50 expected copies and 45 of 49 with fewer are present. Presence falls with the expected copy number, as a group needs about N copies in the sample.</w:t>
+        <w:t>). Among them, 25 of the 26 Dfam human Alu families with 50 or more expected copies in the sample are present at ≥ 0.95 identity (median best identity 0.994), and all 74 Price et al. [6] subfamilies with 50 or more expected copies; of the rarer Price subfamilies, 88 of 90 with 10–50 expected copies and 45 of 49 with fewer are present. Presence falls with the expected copy number, as a group of fewer than about N copies is unlikely to obtain a row of its own.</w:t>
       </w:r>
     </w:p>
     <w:p>
@@ -1627,7 +1627,7 @@
           <w:b w:val="0"/>
           <w:i w:val="0"/>
         </w:rPr>
-        <w:t>A readable, ordered alignment that stands for the collection, every row traceable to its copies, built without an identity cutoff and without a reference, in minutes for tens of thousands of copies. Nothing is left out: every copy contributes to one row, and each row condenses its copies into the bases they share, so that variants shared by a group are visible in the rows while the noise of single copies is not. The published consensuses of the SINE examples appear among its rows, the lineages of a family appear as blocks, and old, highly diverged copies are shown as the mixture they are.</w:t>
+        <w:t>A readable, ordered alignment that stands for the collection, every row traceable to its copies, built without an identity cutoff and without a reference, in minutes for tens of thousands of copies. No input copy is omitted: every copy is assigned to a chunk and contributes to its consensus, and each row condenses its copies into their dominant sequence, so that variants well supported in a group are visible in the rows while low-frequency variation of single copies is suppressed. The published consensuses of the SINE examples appear among its rows, the lineages of a family appear as blocks, and old, highly diverged copies are shown as the mixture they are.</w:t>
       </w:r>
     </w:p>
     <w:p>
@@ -1842,7 +1842,7 @@
           <w:b w:val="0"/>
           <w:i w:val="0"/>
         </w:rPr>
-        <w:t>SubFam turns a collection of related copies that is too large to read into a compact, ordered alignment of chunk consensuses, with every row traceable to its copies, built without an identity cutoff and without a reference. Each row condenses neighbouring copies into the bases they share, so the noise of single copies falls away and the features of groups of copies become visible. On real SINE copies the published consensuses of each family appear among its rows and the lineages of a family appear as blocks; truncated LINE copies give rows that reach as far as their copies do. The output is a compact input for curation, subfamily definition and phylogenetic analysis, which are hard to apply to thousands of raw copies; those steps remain the researcher's.</w:t>
+        <w:t>SubFam turns a collection of related copies that is too large to read into a compact, ordered alignment of chunk consensuses, with every row traceable to its copies, built without an identity cutoff and without a reference. Each row condenses neighbouring copies into their dominant sequence, so the low-frequency variation of single copies is suppressed and the features of groups of copies become easier to see. On real SINE copies the published consensuses of each family appear among its rows and the lineages of a family appear as blocks; truncated LINE copies give rows that reach as far as their copies do. The output is a compact input for curation, subfamily definition and phylogenetic analysis, which are hard to apply to thousands of raw copies; those steps remain the researcher's.</w:t>
       </w:r>
     </w:p>
     <w:p>
@@ -2730,7 +2730,7 @@
           <w:b w:val="0"/>
           <w:i w:val="0"/>
         </w:rPr>
-        <w:t>), with the most common label of each chunk at the right; the differences private to single copies in (b) are absent from the consensuses, and the differences between groups remain. Copies and consensuses are one MAFFT alignment, of which the 220 of 1,105 columns present in at least 25 % of the copies are shown. Light grey, the majority base of the column among the copies; red, another base; white, gap. The strip at the left gives the label of each copy (a, b) or the most common label of each chunk (c).</w:t>
+        <w:t>), with the most common label of each chunk at the right; the low-frequency differences of single copies in (b) are largely absent from the consensuses, and the differences between groups remain. Copies and consensuses are one MAFFT alignment, of which the 220 of 1,105 columns present in at least 25 % of the copies are shown. Light grey, the majority base of the column among the copies; red, another base; white, gap. The strip at the left gives the label of each copy (a, b) or the most common label of each chunk (c).</w:t>
       </w:r>
     </w:p>
     <w:p>

</xml_diff>

<commit_message>
v9: ten input permutations and N-run test (Monsoon); k-mer restart at N not needed; Additional file 7 extended
Co-Authored-By: Claude Sonnet 5.5 <noreply@anthropic.com>
</commit_message>
<xml_diff>
--- a/docs/submission/SubFam_BMC_Bioinformatics_manuscript.docx
+++ b/docs/submission/SubFam_BMC_Bioinformatics_manuscript.docx
@@ -243,7 +243,7 @@
           <w:b w:val="0"/>
           <w:i w:val="0"/>
         </w:rPr>
-        <w:t xml:space="preserve">, compiled on each run; an embedded Python version with byte-identical output is the fallback where no compiler exists). At each merge the two subtrees are turned so that their closest ends meet (of the four pairs of end sequences, the pair at the smallest distance is placed side by side); the leaf order of this tree is a sequence in which neighbours are similar across subtree boundaries, which is what makes fixed windows along it meaningful. This step aligns nothing, and the tree is a device for a linear order, not a phylogeny; the closest-ends rule is greedy and does not minimise the total distance along the order. Letters other than A, C, G, T and U are skipped when k-mers are counted, so k-mers can span an N or another ambiguity code; the B2 examples exclude copies with N. (2) </w:t>
+        <w:t xml:space="preserve">, compiled on each run; an embedded Python version with byte-identical output is the fallback where no compiler exists). At each merge the two subtrees are turned so that their closest ends meet (of the four pairs of end sequences, the pair at the smallest distance is placed side by side); the leaf order of this tree is a sequence in which neighbours are similar across subtree boundaries, which is what makes fixed windows along it meaningful. This step aligns nothing, and the tree is a device for a linear order, not a phylogeny; the closest-ends rule is greedy and does not minimise the total distance along the order. Letters other than A, C, G, T and U are skipped when k-mers are counted, so k-mers can span an N or another ambiguity code; the B2 examples exclude copies with N. Restarting the k-mer window at an N changed nothing measurable: with an N run of 1–10 bases in 1,000 of the 3,000 B2 copies, the same 37 of the 60 rows recurred with and without the restart (Additional file 7). (2) </w:t>
       </w:r>
       <w:r>
         <w:rPr>
@@ -918,7 +918,7 @@
           <w:b w:val="0"/>
           <w:i w:val="0"/>
         </w:rPr>
-        <w:t>Copies reach SubFam in different states: cut exactly to the element, or with some of their own flanking sequence. The 3,000 B2 copies of Example 1 were cut again with 25, 100 and 500 bp of their genomic flank on each side (the element part identical in every copy) and compared with the element-only run, against the variation that a different input order alone produces. With 25 or 100 bp flanks, 36 and 37 of the 60 element-only rows recur at ≥ 0.95 identity among the new rows, as with two shuffled input orders (47 and 36), and the published consensuses of the family (Dfam and Vassetzky et al. [16]) are found among the rows at the same identities as without flanks (for example B2c 0.994 without flanks, 0.979 and 0.969 with them). Modest flanks are tolerated, but which copies share a chunk changes more than the rows do: the flanks add unique k-mers, the order shifts, and the windows cut elsewhere but yield the same consensuses. With 500 bp flanks, five times the element on each side, the flanks dominate the k-mer distance: 23 of the 60 rows recur, and the rows of the old subfamilies move away from their published consensuses (B2c 0.882). Long flanks should therefore be trimmed before the run.</w:t>
+        <w:t>Copies reach SubFam in different states: cut exactly to the element, or with some of their own flanking sequence. The 3,000 B2 copies of Example 1 were cut again with 25, 100 and 500 bp of their genomic flank on each side (the element part identical in every copy) and compared with the element-only run, against the variation that a different input order alone produces. With 25 or 100 bp flanks, 36 and 37 of the 60 element-only rows recur at ≥ 0.95 identity among the new rows, as with twelve shuffled input orders (36–47 of 60; for ten of them the median best identity of an original row was 0.96 and about 0.39 of the copy pairs stayed together), and the published consensuses of the family (Dfam and Vassetzky et al. [16]) are found among the rows at the same identities as without flanks (for example B2c 0.994 without flanks, 0.979 and 0.969 with them). Modest flanks are tolerated, but which copies share a chunk changes more than the rows do: the flanks add unique k-mers, the order shifts, and the windows cut elsewhere but yield the same consensuses. With 500 bp flanks, five times the element on each side, the flanks dominate the k-mer distance: 23 of the 60 rows recur, and the rows of the old subfamilies move away from their published consensuses (B2c 0.882). Long flanks should therefore be trimmed before the run.</w:t>
       </w:r>
     </w:p>
     <w:p>
@@ -2274,7 +2274,7 @@
           <w:b w:val="0"/>
           <w:i w:val="0"/>
         </w:rPr>
-        <w:t xml:space="preserve"> and </w:t>
+        <w:t xml:space="preserve">, </w:t>
       </w:r>
       <w:r>
         <w:rPr>
@@ -2283,6 +2283,21 @@
           <w:i w:val="0"/>
         </w:rPr>
         <w:t>copies_vs_rows.sh</w:t>
+      </w:r>
+      <w:r>
+        <w:rPr>
+          <w:b w:val="0"/>
+          <w:i w:val="0"/>
+        </w:rPr>
+        <w:t xml:space="preserve"> and </w:t>
+      </w:r>
+      <w:r>
+        <w:rPr>
+          <w:rFonts w:ascii="Courier New" w:hAnsi="Courier New"/>
+          <w:b w:val="0"/>
+          <w:i w:val="0"/>
+        </w:rPr>
+        <w:t>permutations_and_N.sh</w:t>
       </w:r>
       <w:r>
         <w:rPr>
@@ -2900,7 +2915,7 @@
           <w:b w:val="0"/>
           <w:i w:val="0"/>
         </w:rPr>
-        <w:t xml:space="preserve"> (CSV). Input preparation. The 3,000 B2 copies of Example 1 without flanks, in two shuffled input orders, and with 25, 100 and 500 bp of their own flank on each side: copy pairs kept in the same chunk, element-only rows recurring at ≥ 0.95 identity, and the best identity of each Dfam and Vassetzky et al. [16] consensus among the rows.</w:t>
+        <w:t xml:space="preserve"> (CSV). Input preparation. The 3,000 B2 copies of Example 1 without flanks, in twelve shuffled input orders, with N runs inserted, and with 25, 100 and 500 bp of their own flank on each side: copy pairs kept in the same chunk, element-only rows recurring at ≥ 0.95 identity, and the best identity of each Dfam and Vassetzky et al. [16] consensus among the rows.</w:t>
       </w:r>
     </w:p>
     <w:p>

</xml_diff>

<commit_message>
Order dependence explained: tied distances broken by file position; content-based tie-break makes the order invariant (experimental, not in 1.5.1)
Co-Authored-By: Claude Sonnet 5.5 <noreply@anthropic.com>
</commit_message>
<xml_diff>
--- a/docs/submission/SubFam_BMC_Bioinformatics_manuscript.docx
+++ b/docs/submission/SubFam_BMC_Bioinformatics_manuscript.docx
@@ -918,7 +918,22 @@
           <w:b w:val="0"/>
           <w:i w:val="0"/>
         </w:rPr>
-        <w:t>Copies reach SubFam in different states: cut exactly to the element, or with some of their own flanking sequence. The 3,000 B2 copies of Example 1 were cut again with 25, 100 and 500 bp of their genomic flank on each side (the element part identical in every copy) and compared with the element-only run, against the variation that a different input order alone produces. With 25 or 100 bp flanks, 36 and 37 of the 60 element-only rows recur at ≥ 0.95 identity among the new rows, as with twelve shuffled input orders (36–47 of 60; for ten of them the median best identity of an original row was 0.96 and about 0.39 of the copy pairs stayed together), and the published consensuses of the family (Dfam and Vassetzky et al. [16]) are found among the rows at the same identities as without flanks (for example B2c 0.994 without flanks, 0.979 and 0.969 with them). Modest flanks are tolerated, but which copies share a chunk changes more than the rows do: the flanks add unique k-mers, the order shifts, and the windows cut elsewhere but yield the same consensuses. With 500 bp flanks, five times the element on each side, the flanks dominate the k-mer distance: 23 of the 60 rows recur, and the rows of the old subfamilies move away from their published consensuses (B2c 0.882). Long flanks should therefore be trimmed before the run.</w:t>
+        <w:t xml:space="preserve">Copies reach SubFam in different states: cut exactly to the element, or with some of their own flanking sequence. The 3,000 B2 copies of Example 1 were cut again with 25, 100 and 500 bp of their genomic flank on each side (the element part identical in every copy) and compared with the element-only run, against the variation that a different input order alone produces. With 25 or 100 bp flanks, 36 and 37 of the 60 element-only rows recur at ≥ 0.95 identity among the new rows, as with twelve shuffled input orders (36–47 of 60; for ten of them the median best identity of an original row was 0.96 and about 0.39 of the copy pairs stayed together), and the published consensuses of the family (Dfam and Vassetzky et al. [16]) are found among the rows at the same identities as without flanks (for example B2c 0.994 without flanks, 0.979 and 0.969 with them). Modest flanks are tolerated, but which copies share a chunk changes more than the rows do: the flanks add unique k-mers, the order shifts, and the windows cut elsewhere but yield the same consensuses. With 500 bp flanks, five times the element on each side, the flanks dominate the k-mer distance: 23 of the 60 rows recur, and the rows of the old subfamilies move away from their published consensuses (B2c 0.882). Long flanks should therefore be trimmed before the run. The dependence of chunk membership on input order has a known cause: copies at equal distances are ordered by their position in the file (the smallest distance was tied at 144 of the 2,999 merges of the B2 run, and the ten shuffled trees shared 79–96 % of their clades with the unshuffled tree). In an experimental build that breaks such ties by sequence content, the trees of all ten shuffles were identical to the unshuffled one and SubFam returned the same chunks and rows for three shuffles (copy pairs kept 1.000); that build is not the release described here (SubFam 1.5.1, whose order is that of ViewAlign's kmer-tree.js), and </w:t>
+      </w:r>
+      <w:r>
+        <w:rPr>
+          <w:rFonts w:ascii="Courier New" w:hAnsi="Courier New"/>
+          <w:b w:val="0"/>
+          <w:i w:val="0"/>
+        </w:rPr>
+        <w:t>benchmark/order_invariance/</w:t>
+      </w:r>
+      <w:r>
+        <w:rPr>
+          <w:b w:val="0"/>
+          <w:i w:val="0"/>
+        </w:rPr>
+        <w:t xml:space="preserve"> holds its code.</w:t>
       </w:r>
     </w:p>
     <w:p>

</xml_diff>

<commit_message>
v9: owner's abstract Results ported (sample wording, minority wording); tie-breaking and input-order dependence stated in Algorithm and Limitations
Co-Authored-By: Claude Sonnet 5.5 <noreply@anthropic.com>
</commit_message>
<xml_diff>
--- a/docs/submission/SubFam_BMC_Bioinformatics_manuscript.docx
+++ b/docs/submission/SubFam_BMC_Bioinformatics_manuscript.docx
@@ -122,7 +122,7 @@
           <w:b w:val="0"/>
           <w:i w:val="0"/>
         </w:rPr>
-        <w:t xml:space="preserve"> SubFam is a command-line utility that produces this view. It orders the copies along a k-mer guide tree, cuts the order into chunks of N neighbouring copies and aligns the plurality consensuses of the chunks, with a table of the copies behind every row. Every copy contributes to one row, and a row summarises its copies rather than sampling them: the consensus suppresses low-frequency, copy-specific variation and keeps the sufficiently supported sequence states of neighbouring copies. On mouse B2 SINEs single copies have a median identity of 0.82 to the nearest published subfamily consensus, the rows 0.94, and groups whose diagnostic variation is hard to recognise among single copies can be seen as blocks of rows. SubFam needs neither a reference nor an identity cutoff; its main parameter is N. A family of up to millions of copies can be run on a random sample: about 30,000 copies give some 600 rows, still a readable alignment. On B2 and human Alu SINEs the published consensuses appear among the rows; on 5′-truncated human LINE-1 copies the rows extend as far as their copies do. The main consensus patterns remain recognisable with modest flanking sequence and shuffled input orders, although chunk membership changes, and without the ordering chunks mix dissimilar copies. The consensus writer reproduces EMBOSS cons byte for byte, and the default output is byte-identical across thread counts.</w:t>
+        <w:t xml:space="preserve"> SubFam is a command-line utility that produces this view. It orders the copies along a k-mer guide tree, cuts the order into chunks of N neighbouring copies, calls a plurality consensus for each chunk, and aligns the consensuses. Each row summarises its copies rather than picking a single representative: the consensus suppresses variation carried by only a minority of the chunk's copies and keeps the bases supported by enough neighbouring copies. The result is a manageable alignment that represents the input collection, in which groups of similar copies, when present in the data, become apparent as blocks of adjacent rows. SubFam needs neither a reference nor an identity cutoff; its one substantive parameter is N. When a family is too large to process with SubFam directly, it can be represented by a random sample drawn before the run, so that the abundant groups of the family are represented while the alignment of chunk consensuses stays readable (30,000 copies give about 600 rows at the default N). The main consensus patterns remain recognisable with modest flanking sequence and shuffled input orders, although chunk membership changes, and without the ordering chunks mix dissimilar copies. The consensus writer reproduces EMBOSS cons byte for byte, and the default output is byte-identical across thread counts.</w:t>
       </w:r>
     </w:p>
     <w:p>
@@ -243,7 +243,7 @@
           <w:b w:val="0"/>
           <w:i w:val="0"/>
         </w:rPr>
-        <w:t xml:space="preserve">, compiled on each run; an embedded Python version with byte-identical output is the fallback where no compiler exists). At each merge the two subtrees are turned so that their closest ends meet (of the four pairs of end sequences, the pair at the smallest distance is placed side by side); the leaf order of this tree is a sequence in which neighbours are similar across subtree boundaries, which is what makes fixed windows along it meaningful. This step aligns nothing, and the tree is a device for a linear order, not a phylogeny; the closest-ends rule is greedy and does not minimise the total distance along the order. Letters other than A, C, G, T and U are skipped when k-mers are counted, so k-mers can span an N or another ambiguity code; the B2 examples exclude copies with N. Restarting the k-mer window at an N did not materially change the result: with an N run of 1–10 bases in 1,000 of the 3,000 B2 copies, both versions recovered 37 of the 60 original rows at ≥ 0.95 identity (median best identities 0.956 and 0.962), and the copy pairs kept in the same chunk against the N-free run were 0.166 and 0.170 (Additional file 7). N runs themselves change chunk membership more than a reshuffle does (0.17 against 0.39 of pairs kept), so copies with many ambiguous bases are best removed before the run. (2) </w:t>
+        <w:t xml:space="preserve">, compiled on each run; an embedded Python version with byte-identical output is the fallback where no compiler exists). At each merge the two subtrees are turned so that their closest ends meet (of the four pairs of end sequences, the pair at the smallest distance is placed side by side); the leaf order of this tree is a sequence in which neighbours are similar across subtree boundaries, which is what makes fixed windows along it meaningful. This step aligns nothing, and the tree is a device for a linear order, not a phylogeny; copies or clusters at exactly equal distances are taken in the order of their position in the file, so a different input order gives a different order of the leaves and different chunks (Results, Input preparation); the closest-ends rule is greedy and does not minimise the total distance along the order. Letters other than A, C, G, T and U are skipped when k-mers are counted, so k-mers can span an N or another ambiguity code; the B2 examples exclude copies with N. Restarting the k-mer window at an N did not materially change the result: with an N run of 1–10 bases in 1,000 of the 3,000 B2 copies, both versions recovered 37 of the 60 original rows at ≥ 0.95 identity (median best identities 0.956 and 0.962), and the copy pairs kept in the same chunk against the N-free run were 0.166 and 0.170 (Additional file 7). N runs themselves change chunk membership more than a reshuffle does (0.17 against 0.39 of pairs kept), so copies with many ambiguous bases are best removed before the run. (2) </w:t>
       </w:r>
       <w:r>
         <w:rPr>
@@ -286,7 +286,7 @@
           <w:b w:val="0"/>
           <w:i w:val="0"/>
         </w:rPr>
-        <w:t xml:space="preserve"> the threshold is p × the number of sequences that span the column (at least 3), so that the consensus of a chunk of truncated copies extends as far as its copies do; the lower-case rule still counts all sequences of the chunk, so the parts that only a few copies reach are written in lower case. The ordering makes this step useful: because the copies of a chunk are similar, a base they share passes the threshold, while a substitution or indel present in one or a few of them does not, so the consensus keeps the well-supported sequence of the chunk and suppresses variation carried by single copies. (4) </w:t>
+        <w:t xml:space="preserve"> the threshold is p × the number of sequences that span the column (at least 3), so that the consensus of a chunk of truncated copies extends as far as its copies do; the lower-case rule still counts all sequences of the chunk, so the parts that only a few copies reach are written in lower case. The ordering makes this step useful: because the copies of a chunk are similar, a base they share passes the threshold, while a substitution or indel carried by a minority of them (fewer than a fraction p of the chunk) does not, so the consensus keeps the well-supported sequence of the chunk and suppresses variation carried by single copies. (4) </w:t>
       </w:r>
       <w:r>
         <w:rPr>
@@ -1820,7 +1820,7 @@
           <w:b w:val="0"/>
           <w:i w:val="0"/>
         </w:rPr>
-        <w:t xml:space="preserve">). A chunk has a fixed size: an abundant group fills several rows with near-identical consensuses, a chunk can straddle two groups, and N has to be chosen for the rarest group of interest. Rows of old, highly diverged copies are mixtures. The whole-copy k-mer distance responds to copy length, so mixed-length input (5′-truncated LINEs) sorts partly by length; the remedy is to run on the shared region or on the long copies. The k-mer ordering needs a matrix of 4·n² bytes (3.6 GB at 30,000 copies); </w:t>
+        <w:t xml:space="preserve">). The chunks depend on the order of the input file through the tie-breaking of the ordering, while the main patterns of the rows persist (Results, Input preparation). A chunk has a fixed size: an abundant group fills several rows with near-identical consensuses, a chunk can straddle two groups, and N has to be chosen for the rarest group of interest. Rows of old, highly diverged copies are mixtures. The whole-copy k-mer distance responds to copy length, so mixed-length input (5′-truncated LINEs) sorts partly by length; the remedy is to run on the shared region or on the long copies. The k-mer ordering needs a matrix of 4·n² bytes (3.6 GB at 30,000 copies); </w:t>
       </w:r>
       <w:r>
         <w:rPr>
@@ -2313,6 +2313,21 @@
           <w:i w:val="0"/>
         </w:rPr>
         <w:t>permutations_and_N.sh</w:t>
+      </w:r>
+      <w:r>
+        <w:rPr>
+          <w:b w:val="0"/>
+          <w:i w:val="0"/>
+        </w:rPr>
+        <w:t xml:space="preserve">, </w:t>
+      </w:r>
+      <w:r>
+        <w:rPr>
+          <w:rFonts w:ascii="Courier New" w:hAnsi="Courier New"/>
+          <w:b w:val="0"/>
+          <w:i w:val="0"/>
+        </w:rPr>
+        <w:t>benchmark/order_invariance/</w:t>
       </w:r>
       <w:r>
         <w:rPr>

</xml_diff>

<commit_message>
v9: American spelling throughout
Co-Authored-By: Claude Sonnet 5.5 <noreply@anthropic.com>
</commit_message>
<xml_diff>
--- a/docs/submission/SubFam_BMC_Bioinformatics_manuscript.docx
+++ b/docs/submission/SubFam_BMC_Bioinformatics_manuscript.docx
@@ -122,7 +122,7 @@
           <w:b w:val="0"/>
           <w:i w:val="0"/>
         </w:rPr>
-        <w:t xml:space="preserve"> SubFam is a command-line utility that produces this view. It orders the copies along a k-mer guide tree, cuts the order into chunks of N neighbouring copies, calls a plurality consensus for each chunk, and aligns the consensuses. Each row summarizes its copies rather than picking a single representative: the consensus suppresses variation private to one or a few copies and keeps the bases supported by enough neighbouring copies. The result is a manageable alignment that represents the input collection, in which groups of similar copies, when present in the data, become apparent as blocks of adjacent rows. SubFam needs neither a reference nor an identity cutoff; its one substantive parameter is N. When a family is too large to process with SubFam directly, it can be represented by a random sample drawn before the run, so that the sample captures the family’s main diversity while still yielding a readable alignment of chunk consensuses. The main consensus patterns remain recognizable with modest flanking sequence and shuffled input orders, although chunk membership changes, and without the ordering chunks mix dissimilar copies. The consensus writer reproduces EMBOSS cons byte for byte, and the default output is byte-identical across thread counts.</w:t>
+        <w:t xml:space="preserve"> SubFam is a command-line utility that produces this view. It orders the copies along a k-mer guide tree, cuts the order into chunks of N neighboring copies, calls a plurality consensus for each chunk, and aligns the consensuses. Each row summarizes its copies rather than picking a single representative: the consensus suppresses variation private to one or a few copies and keeps the bases supported by enough neighboring copies. The result is a manageable alignment that represents the input collection, in which groups of similar copies, when present in the data, become apparent as blocks of adjacent rows. SubFam needs neither a reference nor an identity cutoff; its one substantive parameter is N. When a family is too large to process with SubFam directly, it can be represented by a random sample drawn before the run, so that the sample captures the family’s main diversity while still yielding a readable alignment of chunk consensuses. The main consensus patterns remain recognizable with modest flanking sequence and shuffled input orders, although chunk membership changes, and without the ordering chunks mix dissimilar copies. The consensus writer reproduces EMBOSS cons byte for byte, and the default output is byte-identical across thread counts.</w:t>
       </w:r>
     </w:p>
     <w:p>
@@ -154,7 +154,7 @@
           <w:b w:val="0"/>
           <w:i w:val="0"/>
         </w:rPr>
-        <w:t xml:space="preserve"> transposable elements; repeat families; consensus sequences; multiple sequence alignment; visualisation</w:t>
+        <w:t xml:space="preserve"> transposable elements; repeat families; consensus sequences; multiple sequence alignment; visualization</w:t>
       </w:r>
     </w:p>
     <w:p>
@@ -176,7 +176,7 @@
           <w:b w:val="0"/>
           <w:i w:val="0"/>
         </w:rPr>
-        <w:t>Interspersed repeats (short and long interspersed elements, SINEs and LINEs), satellite arrays and multigene families contain thousands to millions of related copies, and the copies of one family span every degree of divergence, from near-identical recent insertions to relics at 30 % distance from their consensus. An alignment of all copies cannot be read, and many tools cannot take it. Existing tools answer neighbouring questions: identity clustering (CD-HIT [1], VSEARCH [2], MMseqs2 [3, 4]) groups copies above an identity cutoff, which is tuned to one level of divergence, and MeShClust [5] predicts identities alignment-free and groups by mean shift; statistical subfamily methods, from the genome-wide Alu analysis of Price et al. [6], which recursively divided about 480,000 aligned full-length Alu copies by tests for over-represented co-occurring mutations, to COSEG [7], which finds groups of copies sharing co-segregating mutations in an alignment, aim to define the biological subfamilies; library-curation tools such as TEtrimmer [8] automate the curation of consensus libraries (searching the genome for copies, aligning, clustering and refining each consensus).</w:t>
+        <w:t>Interspersed repeats (short and long interspersed elements, SINEs and LINEs), satellite arrays and multigene families contain thousands to millions of related copies, and the copies of one family span every degree of divergence, from near-identical recent insertions to relics at 30 % distance from their consensus. An alignment of all copies cannot be read, and many tools cannot take it. Existing tools answer neighboring questions: identity clustering (CD-HIT [1], VSEARCH [2], MMseqs2 [3, 4]) groups copies above an identity cutoff, which is tuned to one level of divergence, and MeShClust [5] predicts identities alignment-free and groups by mean shift; statistical subfamily methods, from the genome-wide Alu analysis of Price et al. [6], which recursively divided about 480,000 aligned full-length Alu copies by tests for over-represented co-occurring mutations, to COSEG [7], which finds groups of copies sharing co-segregating mutations in an alignment, aim to define the biological subfamilies; library-curation tools such as TEtrimmer [8] automate the curation of consensus libraries (searching the genome for copies, aligning, clustering and refining each consensus).</w:t>
       </w:r>
     </w:p>
     <w:p>
@@ -185,7 +185,7 @@
           <w:b w:val="0"/>
           <w:i w:val="0"/>
         </w:rPr>
-        <w:t>Between the raw copies and these analyses lies a practical step: making the heap of copies readable, that is, small enough to work with and with the variation that groups of copies share set apart from the variation of single copies. SubFam does that step and nothing else. Its two objectives are (1) a visual presentation of many similar sequences, at various degrees of variation within and between groups, as an ordered series of consensuses, and (2) an alignment proxy: a compact, ordered alignment of chunk consensuses that stands for thousands of copies in tools that cannot take them all. A row is not a selected copy but the consensus of a chunk of neighbouring copies, to which every copy of the chunk contributes. It is a position-wise summary of the dominant sequence of its chunk, not a reconstruction of the ancestor of a subfamily; if a chunk mixes two groups, the row can be a mosaic of them. Each copy carries, besides the bases of its group, mutations of its own, scattered over its length and rarely shared; in the consensus of similar copies the sufficiently supported bases are kept and low-frequency variants are suppressed. A row therefore shows the features of its copies' group more clearly than any one copy does, and a group whose variation is hard to recognise among single copies can be seen in the rows as a block. Whether a row, or a block of rows, is a subfamily is a judgement for the researcher or for a dedicated method.</w:t>
+        <w:t>Between the raw copies and these analyses lies a practical step: making the heap of copies readable, that is, small enough to work with and with the variation that groups of copies share set apart from the variation of single copies. SubFam does that step and nothing else. Its two objectives are (1) a visual presentation of many similar sequences, at various degrees of variation within and between groups, as an ordered series of consensuses, and (2) an alignment proxy: a compact, ordered alignment of chunk consensuses that stands for thousands of copies in tools that cannot take them all. A row is not a selected copy but the consensus of a chunk of neighboring copies, to which every copy of the chunk contributes. It is a position-wise summary of the dominant sequence of its chunk, not a reconstruction of the ancestor of a subfamily; if a chunk mixes two groups, the row can be a mosaic of them. Each copy carries, besides the bases of its group, mutations of its own, scattered over its length and rarely shared; in the consensus of similar copies the sufficiently supported bases are kept and low-frequency variants are suppressed. A row therefore shows the features of its copies' group more clearly than any one copy does, and a group whose variation is hard to recognize among single copies can be seen in the rows as a block. Whether a row, or a block of rows, is a subfamily is a judgment for the researcher or for a dedicated method.</w:t>
       </w:r>
     </w:p>
     <w:p>
@@ -243,7 +243,7 @@
           <w:b w:val="0"/>
           <w:i w:val="0"/>
         </w:rPr>
-        <w:t xml:space="preserve">, compiled on each run; an embedded Python version with byte-identical output is the fallback where no compiler exists). At each merge the two subtrees are turned so that their closest ends meet (of the four pairs of end sequences, the pair at the smallest distance is placed side by side); the leaf order of this tree is a sequence in which neighbours are similar across subtree boundaries, which is what makes fixed windows along it meaningful. This step aligns nothing, and the tree is a device for a linear order, not a phylogeny; copies or clusters at exactly equal distances are taken in the order of their position in the file, so a different input order gives a different order of the leaves and different chunks (Results, Input preparation); the closest-ends rule is greedy and does not minimise the total distance along the order. Letters other than A, C, G, T and U are skipped when k-mers are counted, so k-mers can span an N or another ambiguity code; the B2 examples exclude copies with N. Restarting the k-mer window at an N did not materially change the result: with an N run of 1–10 bases in 1,000 of the 3,000 B2 copies, both versions recovered 37 of the 60 original rows at ≥ 0.95 identity (median best identities 0.956 and 0.962), and the copy pairs kept in the same chunk against the N-free run were 0.166 and 0.170 (Additional file 7). N runs themselves change chunk membership more than a reshuffle does (0.17 against 0.39 of pairs kept), so copies with many ambiguous bases are best removed before the run. (2) </w:t>
+        <w:t xml:space="preserve">, compiled on each run; an embedded Python version with byte-identical output is the fallback where no compiler exists). At each merge the two subtrees are turned so that their closest ends meet (of the four pairs of end sequences, the pair at the smallest distance is placed side by side); the leaf order of this tree is a sequence in which neighbors are similar across subtree boundaries, which is what makes fixed windows along it meaningful. This step aligns nothing, and the tree is a device for a linear order, not a phylogeny; copies or clusters at exactly equal distances are taken in the order of their position in the file, so a different input order gives a different order of the leaves and different chunks (Results, Input preparation); the closest-ends rule is greedy and does not minimize the total distance along the order. Letters other than A, C, G, T and U are skipped when k-mers are counted, so k-mers can span an N or another ambiguity code; the B2 examples exclude copies with N. Restarting the k-mer window at an N did not materially change the result: with an N run of 1–10 bases in 1,000 of the 3,000 B2 copies, both versions recovered 37 of the 60 original rows at ≥ 0.95 identity (median best identities 0.956 and 0.962), and the copy pairs kept in the same chunk against the N-free run were 0.166 and 0.170 (Additional file 7). N runs themselves change chunk membership more than a reshuffle does (0.17 against 0.39 of pairs kept), so copies with many ambiguous bases are best removed before the run. (2) </w:t>
       </w:r>
       <w:r>
         <w:rPr>
@@ -376,7 +376,7 @@
           <w:b w:val="0"/>
           <w:i w:val="0"/>
         </w:rPr>
-        <w:t xml:space="preserve"> (strand-independent k-mers; each copy is oriented like its neighbour in the order). </w:t>
+        <w:t xml:space="preserve"> (strand-independent k-mers; each copy is oriented like its neighbor in the order). </w:t>
       </w:r>
       <w:r>
         <w:rPr>
@@ -407,7 +407,7 @@
           <w:b w:val="0"/>
           <w:i w:val="0"/>
         </w:rPr>
-        <w:t xml:space="preserve"> N is the resolution in copies: N sets the approximate number of input copies behind each row; a group of roughly N copies may fill one or more chunks or share a chunk with neighbouring groups, depending on its place in the ordering, and an abundant group fills several rows. A larger N averages over more copies and so removes more of the noise of single copies, at the price of coarser rows. At the default N = 50 and p = 0.36 a consensus base needs at least 18 agreeing copies; N = 20 (8 copies) is the setting for small or rare groups. p shapes the consensus and does not change which copies share a chunk; k sets the word length of the ordering.</w:t>
+        <w:t xml:space="preserve"> N is the resolution in copies: N sets the approximate number of input copies behind each row; a group of roughly N copies may fill one or more chunks or share a chunk with neighboring groups, depending on its place in the ordering, and an abundant group fills several rows. A larger N averages over more copies and so removes more of the noise of single copies, at the price of coarser rows. At the default N = 50 and p = 0.36 a consensus base needs at least 18 agreeing copies; N = 20 (8 copies) is the setting for small or rare groups. p shapes the consensus and does not change which copies share a chunk; k sets the word length of the ordering.</w:t>
       </w:r>
     </w:p>
     <w:p>
@@ -679,7 +679,7 @@
           <w:b w:val="0"/>
           <w:i w:val="0"/>
         </w:rPr>
-        <w:t>, giving 60 rows in 19 s; the alignment of all 3,000 copies has 2,781 columns, the alignment of the 60 rows 223. Grouped by RepeatMasker class, with the class consensus and the Dfam consensus as heads (Figure 1), the rows have a median identity of 0.959 to the head of their own class (minimum 0.836). The rows are closer to the published consensuses of the family than the copies they summarise: to the nearest of the five consensuses of Vassetzky et al. [16], single copies have a median identity of 0.817 (interquartile range 0.763–0.895; the 2,873 copies whose best hit covers at least half their length) and the 60 rows 0.936 (0.913–0.958); to the nearest Dfam consensus, 0.799 and 0.915. The difference is the copy-level noise that the consensus removes. The order separates the two lineages of the family into blocks of rows: B3 and B3A in chunks 1–21 and 46–60, B2 in chunks 22–45. Inside the B2 block the three Repbase [15] names B2_Mm1a, B2_Mm1t and B2_Mm2 interleave; the alignment shows the copies as they are and leaves the naming of their groups to the researcher.</w:t>
+        <w:t>, giving 60 rows in 19 s; the alignment of all 3,000 copies has 2,781 columns, the alignment of the 60 rows 223. Grouped by RepeatMasker class, with the class consensus and the Dfam consensus as heads (Figure 1), the rows have a median identity of 0.959 to the head of their own class (minimum 0.836). The rows are closer to the published consensuses of the family than the copies they summarize: to the nearest of the five consensuses of Vassetzky et al. [16], single copies have a median identity of 0.817 (interquartile range 0.763–0.895; the 2,873 copies whose best hit covers at least half their length) and the 60 rows 0.936 (0.913–0.958); to the nearest Dfam consensus, 0.799 and 0.915. The difference is the copy-level noise that the consensus removes. The order separates the two lineages of the family into blocks of rows: B3 and B3A in chunks 1–21 and 46–60, B2 in chunks 22–45. Inside the B2 block the three Repbase [15] names B2_Mm1a, B2_Mm1t and B2_Mm2 interleave; the alignment shows the copies as they are and leaves the naming of their groups to the researcher.</w:t>
       </w:r>
     </w:p>
     <w:p>
@@ -778,7 +778,7 @@
           <w:b w:val="0"/>
           <w:i w:val="0"/>
         </w:rPr>
-        <w:t xml:space="preserve">); they have a median identity of 0.993 to the head of their RepeatMasker class (minimum 0.955). The L1PA classes are consecutive age classes of one lineage [17, 18] whose consensuses differ at 8–31 of about 900 positions, and the chunks hold copies of neighbouring classes together. </w:t>
+        <w:t xml:space="preserve">); they have a median identity of 0.993 to the head of their RepeatMasker class (minimum 0.955). The L1PA classes are consecutive age classes of one lineage [17, 18] whose consensuses differ at 8–31 of about 900 positions, and the chunks hold copies of neighboring classes together. </w:t>
       </w:r>
       <w:r>
         <w:rPr>
@@ -1731,7 +1731,7 @@
           <w:b w:val="0"/>
           <w:i w:val="0"/>
         </w:rPr>
-        <w:t>When the copies come from subfamilies of different age and size, one N serves them unequally: a young, abundant subfamily fills many near-identical rows while an old or rare one is diluted across mixed chunks. SubFam can then be run in rounds: the rows of a first run that the researcher recognises as one group are taken out together with their copies (</w:t>
+        <w:t>When the copies come from subfamilies of different age and size, one N serves them unequally: a young, abundant subfamily fills many near-identical rows while an old or rare one is diluted across mixed chunks. SubFam can then be run in rounds: the rows of a first run that the researcher recognizes as one group are taken out together with their copies (</w:t>
       </w:r>
       <w:r>
         <w:rPr>
@@ -1857,7 +1857,7 @@
           <w:b w:val="0"/>
           <w:i w:val="0"/>
         </w:rPr>
-        <w:t>SubFam turns a collection of related copies that is too large to read into a compact, ordered alignment of chunk consensuses, with every row traceable to its copies, built without an identity cutoff and without a reference. Each row condenses neighbouring copies into their dominant sequence, so the low-frequency variation of single copies is suppressed and the features of groups of copies become easier to see. On real SINE copies the published consensuses of each family appear among its rows and the lineages of a family appear as blocks; truncated LINE copies give rows that reach as far as their copies do. The output is a compact input for curation, subfamily definition and phylogenetic analysis, which are hard to apply to thousands of raw copies; those steps remain the researcher's.</w:t>
+        <w:t>SubFam turns a collection of related copies that is too large to read into a compact, ordered alignment of chunk consensuses, with every row traceable to its copies, built without an identity cutoff and without a reference. Each row condenses neighboring copies into their dominant sequence, so the low-frequency variation of single copies is suppressed and the features of groups of copies become easier to see. On real SINE copies the published consensuses of each family appear among its rows and the lineages of a family appear as blocks; truncated LINE copies give rows that reach as far as their copies do. The output is a compact input for curation, subfamily definition and phylogenetic analysis, which are hard to apply to thousands of raw copies; those steps remain the researcher's.</w:t>
       </w:r>
     </w:p>
     <w:p>
@@ -2372,7 +2372,7 @@
           <w:b w:val="0"/>
           <w:highlight w:val="yellow"/>
         </w:rPr>
-        <w:t>[AUTHOR: "The author declares no competing interests." — note that the author co-authored the B2 classification of Vassetzky et al. 2021 used to colour Figure 2.]</w:t>
+        <w:t>[AUTHOR: "The author declares no competing interests." — note that the author co-authored the B2 classification of Vassetzky et al. 2021 used to color Figure 2.]</w:t>
       </w:r>
     </w:p>
     <w:p>
@@ -2735,7 +2735,7 @@
           <w:b w:val="0"/>
           <w:i w:val="0"/>
         </w:rPr>
-        <w:t>The 60 chunk consensuses (N = 50) of 3,000 B2, B3 and B3A copies of mm39 chr19, grouped for the reader by the most common RepeatMasker class of each chunk's copies, with the consensus of the class's copies and the Dfam consensus as the head rows of each group (framed). Grey, the majority base of the SubFam rows in the column; red, another base; white, gap.</w:t>
+        <w:t>The 60 chunk consensuses (N = 50) of 3,000 B2, B3 and B3A copies of mm39 chr19, grouped for the reader by the most common RepeatMasker class of each chunk's copies, with the consensus of the class's copies and the Dfam consensus as the head rows of each group (framed). Gray, the majority base of the SubFam rows in the column; red, another base; white, gap.</w:t>
       </w:r>
     </w:p>
     <w:p>
@@ -2775,7 +2775,7 @@
           <w:b w:val="0"/>
           <w:i w:val="0"/>
         </w:rPr>
-        <w:t>), with the most common label of each chunk at the right; the low-frequency differences of single copies in (b) are largely absent from the consensuses, and the differences between groups remain. Copies and consensuses are one MAFFT alignment, of which the 220 of 1,105 columns present in at least 25 % of the copies are shown. Light grey, the majority base of the column among the copies; red, another base; white, gap. The strip at the left gives the label of each copy (a, b) or the most common label of each chunk (c).</w:t>
+        <w:t>), with the most common label of each chunk at the right; the low-frequency differences of single copies in (b) are largely absent from the consensuses, and the differences between groups remain. Copies and consensuses are one MAFFT alignment, of which the 220 of 1,105 columns present in at least 25 % of the copies are shown. Light gray, the majority base of the column among the copies; red, another base; white, gap. The strip at the left gives the label of each copy (a, b) or the most common label of each chunk (c).</w:t>
       </w:r>
     </w:p>
     <w:p>

</xml_diff>